<commit_message>
finished analysis section with hw/sw requirements; user requirements more
</commit_message>
<xml_diff>
--- a/analysis/Analysis.docx
+++ b/analysis/Analysis.docx
@@ -33,7 +33,35 @@
         <w:rPr>
           <w:rFonts w:ascii="DM Mono" w:hAnsi="DM Mono"/>
         </w:rPr>
-        <w:t>My current idea for this project is for it to provide a simple, retro-themed fighting game for one player. It will involve using different moves, each controlled by appropriate key bindings, to tackle various opponents with equal power. Opponents would be generated based on the player’s options with extra attributes such as reaction time to make it fair. Further scaling of the project would include a difficulty slider or even different rounds fighting enemies of greater and greater strength or speed. This would challenge the user, making the game fun and engaging to play.</w:t>
+        <w:t xml:space="preserve">My current idea for this project is for it to provide a simple, retro-themed fighting game for one player. It will involve using different moves, each controlled by appropriate key bindings, to tackle various opponents with equal power. Opponents would be generated based on the player’s options with extra attributes such as reaction time to make it fair. Further scaling of the project would include a difficulty slider or even different rounds fighting enemies of </w:t>
+      </w:r>
+      <w:proofErr w:type="gramStart"/>
+      <w:r>
+        <w:rPr>
+          <w:rFonts w:ascii="DM Mono" w:hAnsi="DM Mono"/>
+        </w:rPr>
+        <w:t>greater and greater</w:t>
+      </w:r>
+      <w:proofErr w:type="gramEnd"/>
+      <w:r>
+        <w:rPr>
+          <w:rFonts w:ascii="DM Mono" w:hAnsi="DM Mono"/>
+        </w:rPr>
+        <w:t xml:space="preserve"> strength or speed. This would challenge the user, </w:t>
+      </w:r>
+      <w:proofErr w:type="gramStart"/>
+      <w:r>
+        <w:rPr>
+          <w:rFonts w:ascii="DM Mono" w:hAnsi="DM Mono"/>
+        </w:rPr>
+        <w:t>making</w:t>
+      </w:r>
+      <w:proofErr w:type="gramEnd"/>
+      <w:r>
+        <w:rPr>
+          <w:rFonts w:ascii="DM Mono" w:hAnsi="DM Mono"/>
+        </w:rPr>
+        <w:t xml:space="preserve"> the game fun and engaging to play.</w:t>
       </w:r>
     </w:p>
     <w:p>
@@ -59,7 +87,21 @@
         <w:rPr>
           <w:rFonts w:ascii="DM Mono" w:hAnsi="DM Mono"/>
         </w:rPr>
-        <w:t xml:space="preserve">The embarkment of this project excites me as I can appreciate the dedication and creativity in the games industry. By completing this relatively small project, I would be able to use it for developing my skills. An ideal development engine should be incredibly minimal, thus allowing me to use all of my skills organically, rather than having them built in. Additionally, it ought to be compatible across PC operating systems such as MacOS, Debian and </w:t>
+        <w:t xml:space="preserve">The embarkment of this project excites me as I can appreciate the dedication and creativity in the games industry. By completing this relatively small project, I would be able to use it for developing my skills. An ideal development engine should be incredibly minimal, thus allowing me to use </w:t>
+      </w:r>
+      <w:proofErr w:type="gramStart"/>
+      <w:r>
+        <w:rPr>
+          <w:rFonts w:ascii="DM Mono" w:hAnsi="DM Mono"/>
+        </w:rPr>
+        <w:t>all of</w:t>
+      </w:r>
+      <w:proofErr w:type="gramEnd"/>
+      <w:r>
+        <w:rPr>
+          <w:rFonts w:ascii="DM Mono" w:hAnsi="DM Mono"/>
+        </w:rPr>
+        <w:t xml:space="preserve"> my skills organically, rather than having them built in. Additionally, it ought to be compatible across PC operating systems such as MacOS, Debian and </w:t>
       </w:r>
       <w:proofErr w:type="spellStart"/>
       <w:r>
@@ -86,7 +128,21 @@
         <w:rPr>
           <w:rFonts w:ascii="DM Mono" w:hAnsi="DM Mono"/>
         </w:rPr>
-        <w:t xml:space="preserve">For this project to be successful, it should allow a player to fight against a condition based bot. The player should have to balance various displayed attributes such as stamina and health whilst beating their opponent. Examples of the bot’s conditions may include the proximity of the player, the stamina of the player or the health of the bot. </w:t>
+        <w:t xml:space="preserve">For this project to be successful, it should allow a player to fight against a </w:t>
+      </w:r>
+      <w:proofErr w:type="gramStart"/>
+      <w:r>
+        <w:rPr>
+          <w:rFonts w:ascii="DM Mono" w:hAnsi="DM Mono"/>
+        </w:rPr>
+        <w:t>condition based</w:t>
+      </w:r>
+      <w:proofErr w:type="gramEnd"/>
+      <w:r>
+        <w:rPr>
+          <w:rFonts w:ascii="DM Mono" w:hAnsi="DM Mono"/>
+        </w:rPr>
+        <w:t xml:space="preserve"> bot. The player should have to balance various displayed attributes such as stamina and health whilst beating their opponent. Examples of the bot’s conditions may include the proximity of the player, the stamina of the player or the health of the bot. </w:t>
       </w:r>
     </w:p>
     <w:p/>
@@ -485,7 +541,25 @@
                 <w:sz w:val="18"/>
                 <w:szCs w:val="18"/>
               </w:rPr>
-              <w:t>I like the clear UI displaying the health of each fighter, this makes it easy to quickly gauge the opponent’s strength mid-fight. Consequently, the game is easier to read, meaning that it could be more accessible to an external audience. This opens up streaming as a viable form of marketing.</w:t>
+              <w:t xml:space="preserve">I like the clear UI displaying the health of each fighter, this makes it easy to quickly gauge the opponent’s strength mid-fight. Consequently, the game is easier to read, meaning that it could be more accessible to an external audience. This </w:t>
+            </w:r>
+            <w:proofErr w:type="gramStart"/>
+            <w:r>
+              <w:rPr>
+                <w:rFonts w:ascii="DM Mono" w:eastAsia="Aptos" w:hAnsi="DM Mono"/>
+                <w:sz w:val="18"/>
+                <w:szCs w:val="18"/>
+              </w:rPr>
+              <w:t>opens up</w:t>
+            </w:r>
+            <w:proofErr w:type="gramEnd"/>
+            <w:r>
+              <w:rPr>
+                <w:rFonts w:ascii="DM Mono" w:eastAsia="Aptos" w:hAnsi="DM Mono"/>
+                <w:sz w:val="18"/>
+                <w:szCs w:val="18"/>
+              </w:rPr>
+              <w:t xml:space="preserve"> streaming as a viable form of marketing.</w:t>
             </w:r>
           </w:p>
         </w:tc>
@@ -1332,7 +1406,25 @@
                 <w:sz w:val="18"/>
                 <w:szCs w:val="18"/>
               </w:rPr>
-              <w:t>I am a big fan of the chevron above the player’s head. This would make the game easier to play by reducing the risk of confusion. Resultantly, consumers are able to pick up the game faster and invest more time in it.</w:t>
+              <w:t xml:space="preserve">I am a big fan of the chevron above the player’s head. This would make the game easier to play by reducing the risk of confusion. Resultantly, consumers </w:t>
+            </w:r>
+            <w:proofErr w:type="gramStart"/>
+            <w:r>
+              <w:rPr>
+                <w:rFonts w:ascii="DM Mono" w:eastAsia="Aptos" w:hAnsi="DM Mono"/>
+                <w:sz w:val="18"/>
+                <w:szCs w:val="18"/>
+              </w:rPr>
+              <w:t>are able to</w:t>
+            </w:r>
+            <w:proofErr w:type="gramEnd"/>
+            <w:r>
+              <w:rPr>
+                <w:rFonts w:ascii="DM Mono" w:eastAsia="Aptos" w:hAnsi="DM Mono"/>
+                <w:sz w:val="18"/>
+                <w:szCs w:val="18"/>
+              </w:rPr>
+              <w:t xml:space="preserve"> pick up the game faster and invest more time in it.</w:t>
             </w:r>
           </w:p>
         </w:tc>
@@ -1451,7 +1543,25 @@
                 <w:sz w:val="18"/>
                 <w:szCs w:val="18"/>
               </w:rPr>
-              <w:t xml:space="preserve"> I to implement it, there would not, at current state of planning, be many options of use. Thus I have decided that it is an unnecessary feature which causes conflict with the core mechanics of the game.</w:t>
+              <w:t xml:space="preserve"> I to implement it, there would not, at current state of planning, be many options of use. </w:t>
+            </w:r>
+            <w:proofErr w:type="gramStart"/>
+            <w:r>
+              <w:rPr>
+                <w:rFonts w:ascii="DM Mono" w:eastAsia="Aptos" w:hAnsi="DM Mono"/>
+                <w:sz w:val="18"/>
+                <w:szCs w:val="18"/>
+              </w:rPr>
+              <w:t>Thus</w:t>
+            </w:r>
+            <w:proofErr w:type="gramEnd"/>
+            <w:r>
+              <w:rPr>
+                <w:rFonts w:ascii="DM Mono" w:eastAsia="Aptos" w:hAnsi="DM Mono"/>
+                <w:sz w:val="18"/>
+                <w:szCs w:val="18"/>
+              </w:rPr>
+              <w:t xml:space="preserve"> I have decided that it is an unnecessary feature which causes conflict with the core mechanics of the game.</w:t>
             </w:r>
           </w:p>
         </w:tc>
@@ -1741,7 +1851,43 @@
           <w:sz w:val="20"/>
           <w:szCs w:val="20"/>
         </w:rPr>
-        <w:t>My stake holders would likely be teenagers interested in computer science, between 14 and 19. This is because my research and experience shows that this demographic is the most likely to be engaged with similar media. Furthermore, this group tend to be socially active in both real life and online. This level of communication can be capitalised on for easier marketing. Subsequently, I will survey this demographic in order to determine features and implementations which may be successful and desirable in this game.</w:t>
+        <w:t xml:space="preserve">My stake holders would likely be teenagers interested in computer science, between 14 and 19. This is because my research and experience </w:t>
+      </w:r>
+      <w:proofErr w:type="gramStart"/>
+      <w:r>
+        <w:rPr>
+          <w:rFonts w:ascii="DM Mono" w:hAnsi="DM Mono"/>
+          <w:sz w:val="20"/>
+          <w:szCs w:val="20"/>
+        </w:rPr>
+        <w:t>shows</w:t>
+      </w:r>
+      <w:proofErr w:type="gramEnd"/>
+      <w:r>
+        <w:rPr>
+          <w:rFonts w:ascii="DM Mono" w:hAnsi="DM Mono"/>
+          <w:sz w:val="20"/>
+          <w:szCs w:val="20"/>
+        </w:rPr>
+        <w:t xml:space="preserve"> that this demographic is the most likely to be engaged with similar media. Furthermore, this group tend to be socially active in both real life and online. This level of communication can be capitalised on for easier marketing. Subsequently, I will survey this demographic </w:t>
+      </w:r>
+      <w:proofErr w:type="gramStart"/>
+      <w:r>
+        <w:rPr>
+          <w:rFonts w:ascii="DM Mono" w:hAnsi="DM Mono"/>
+          <w:sz w:val="20"/>
+          <w:szCs w:val="20"/>
+        </w:rPr>
+        <w:t>in order to</w:t>
+      </w:r>
+      <w:proofErr w:type="gramEnd"/>
+      <w:r>
+        <w:rPr>
+          <w:rFonts w:ascii="DM Mono" w:hAnsi="DM Mono"/>
+          <w:sz w:val="20"/>
+          <w:szCs w:val="20"/>
+        </w:rPr>
+        <w:t xml:space="preserve"> determine features and implementations which may be successful and desirable in this game.</w:t>
       </w:r>
     </w:p>
     <w:p>
@@ -1761,7 +1907,25 @@
           <w:sz w:val="20"/>
           <w:szCs w:val="20"/>
         </w:rPr>
-        <w:t>I believe that my player base will be making greatest use of this product in their free time after education hours. As such, I will aim to make each experience succinct in order to support a user’s requirement of homework. Longer games can feel like a greater commitment to play and so are not as popular during this targeted time window.</w:t>
+        <w:t xml:space="preserve">I believe that my player base will be making greatest use of this product in their free time after education hours. As such, I will aim to make each experience succinct </w:t>
+      </w:r>
+      <w:proofErr w:type="gramStart"/>
+      <w:r>
+        <w:rPr>
+          <w:rFonts w:ascii="DM Mono" w:hAnsi="DM Mono"/>
+          <w:sz w:val="20"/>
+          <w:szCs w:val="20"/>
+        </w:rPr>
+        <w:t>in order to</w:t>
+      </w:r>
+      <w:proofErr w:type="gramEnd"/>
+      <w:r>
+        <w:rPr>
+          <w:rFonts w:ascii="DM Mono" w:hAnsi="DM Mono"/>
+          <w:sz w:val="20"/>
+          <w:szCs w:val="20"/>
+        </w:rPr>
+        <w:t xml:space="preserve"> support a user’s requirement of homework. Longer games can feel like a greater commitment to play and so are not as popular during this targeted time window.</w:t>
       </w:r>
     </w:p>
     <w:p>
@@ -1781,7 +1945,25 @@
           <w:sz w:val="20"/>
           <w:szCs w:val="20"/>
         </w:rPr>
-        <w:t xml:space="preserve">I aim to include my stake holders in this process in order to maintain a high fidelity to the desired concept and functionality. </w:t>
+        <w:t xml:space="preserve">I aim to include my stake holders in this process </w:t>
+      </w:r>
+      <w:proofErr w:type="gramStart"/>
+      <w:r>
+        <w:rPr>
+          <w:rFonts w:ascii="DM Mono" w:hAnsi="DM Mono"/>
+          <w:sz w:val="20"/>
+          <w:szCs w:val="20"/>
+        </w:rPr>
+        <w:t>in order to</w:t>
+      </w:r>
+      <w:proofErr w:type="gramEnd"/>
+      <w:r>
+        <w:rPr>
+          <w:rFonts w:ascii="DM Mono" w:hAnsi="DM Mono"/>
+          <w:sz w:val="20"/>
+          <w:szCs w:val="20"/>
+        </w:rPr>
+        <w:t xml:space="preserve"> maintain a high fidelity to the desired concept and functionality. </w:t>
       </w:r>
     </w:p>
     <w:p>
@@ -2252,7 +2434,25 @@
           <w:sz w:val="20"/>
           <w:szCs w:val="20"/>
         </w:rPr>
-        <w:t>This shows a fortunate lack of demand for fighting multiple enemies. I can gauge from this that it is far from an the essential feature, and consequentially I shall not list it as a requirement for this game.</w:t>
+        <w:t xml:space="preserve">This shows a fortunate lack of demand for fighting multiple enemies. I can gauge from this that it is far from </w:t>
+      </w:r>
+      <w:proofErr w:type="gramStart"/>
+      <w:r>
+        <w:rPr>
+          <w:rFonts w:ascii="DM Mono" w:hAnsi="DM Mono"/>
+          <w:sz w:val="20"/>
+          <w:szCs w:val="20"/>
+        </w:rPr>
+        <w:t>an the</w:t>
+      </w:r>
+      <w:proofErr w:type="gramEnd"/>
+      <w:r>
+        <w:rPr>
+          <w:rFonts w:ascii="DM Mono" w:hAnsi="DM Mono"/>
+          <w:sz w:val="20"/>
+          <w:szCs w:val="20"/>
+        </w:rPr>
+        <w:t xml:space="preserve"> essential feature, and consequentially I shall not list it as a requirement for this game.</w:t>
       </w:r>
     </w:p>
     <w:p>
@@ -3068,7 +3268,25 @@
                 <w:sz w:val="16"/>
                 <w:szCs w:val="16"/>
               </w:rPr>
-              <w:t>Varying Attacks With Primary Attack Button</w:t>
+              <w:t xml:space="preserve">Varying Attacks </w:t>
+            </w:r>
+            <w:proofErr w:type="gramStart"/>
+            <w:r>
+              <w:rPr>
+                <w:rFonts w:ascii="DM Mono" w:eastAsia="Aptos" w:hAnsi="DM Mono"/>
+                <w:sz w:val="16"/>
+                <w:szCs w:val="16"/>
+              </w:rPr>
+              <w:t>With</w:t>
+            </w:r>
+            <w:proofErr w:type="gramEnd"/>
+            <w:r>
+              <w:rPr>
+                <w:rFonts w:ascii="DM Mono" w:eastAsia="Aptos" w:hAnsi="DM Mono"/>
+                <w:sz w:val="16"/>
+                <w:szCs w:val="16"/>
+              </w:rPr>
+              <w:t xml:space="preserve"> Primary Attack Button</w:t>
             </w:r>
           </w:p>
         </w:tc>
@@ -3898,7 +4116,25 @@
                 <w:szCs w:val="16"/>
               </w:rPr>
               <w:lastRenderedPageBreak/>
-              <w:t>pleasantly with other possible features. Hence I shall list this as a required feature.</w:t>
+              <w:t xml:space="preserve">pleasantly with other possible features. </w:t>
+            </w:r>
+            <w:proofErr w:type="gramStart"/>
+            <w:r>
+              <w:rPr>
+                <w:rFonts w:ascii="DM Mono" w:eastAsia="Aptos" w:hAnsi="DM Mono"/>
+                <w:sz w:val="16"/>
+                <w:szCs w:val="16"/>
+              </w:rPr>
+              <w:t>Hence</w:t>
+            </w:r>
+            <w:proofErr w:type="gramEnd"/>
+            <w:r>
+              <w:rPr>
+                <w:rFonts w:ascii="DM Mono" w:eastAsia="Aptos" w:hAnsi="DM Mono"/>
+                <w:sz w:val="16"/>
+                <w:szCs w:val="16"/>
+              </w:rPr>
+              <w:t xml:space="preserve"> I shall list this as a required feature.</w:t>
             </w:r>
           </w:p>
         </w:tc>
@@ -4502,7 +4738,25 @@
                 <w:sz w:val="16"/>
                 <w:szCs w:val="16"/>
               </w:rPr>
-              <w:t>An incredibly short range attack with the highest damage.</w:t>
+              <w:t xml:space="preserve">An incredibly </w:t>
+            </w:r>
+            <w:proofErr w:type="gramStart"/>
+            <w:r>
+              <w:rPr>
+                <w:rFonts w:ascii="DM Mono" w:eastAsia="Aptos" w:hAnsi="DM Mono"/>
+                <w:sz w:val="16"/>
+                <w:szCs w:val="16"/>
+              </w:rPr>
+              <w:t>short range</w:t>
+            </w:r>
+            <w:proofErr w:type="gramEnd"/>
+            <w:r>
+              <w:rPr>
+                <w:rFonts w:ascii="DM Mono" w:eastAsia="Aptos" w:hAnsi="DM Mono"/>
+                <w:sz w:val="16"/>
+                <w:szCs w:val="16"/>
+              </w:rPr>
+              <w:t xml:space="preserve"> attack with the highest damage.</w:t>
             </w:r>
           </w:p>
         </w:tc>
@@ -4708,7 +4962,25 @@
                 <w:sz w:val="16"/>
                 <w:szCs w:val="16"/>
               </w:rPr>
-              <w:t xml:space="preserve">In all of the games which I investigated for this project, this item was prevalent. The reason being that it is an essential indicator of the leading fighter and the proximity to a loss. My use of this would see the traditional red block fill, making use of </w:t>
+              <w:t xml:space="preserve">In </w:t>
+            </w:r>
+            <w:proofErr w:type="gramStart"/>
+            <w:r>
+              <w:rPr>
+                <w:rFonts w:ascii="DM Mono" w:eastAsia="Aptos" w:hAnsi="DM Mono"/>
+                <w:sz w:val="16"/>
+                <w:szCs w:val="16"/>
+              </w:rPr>
+              <w:t>all of</w:t>
+            </w:r>
+            <w:proofErr w:type="gramEnd"/>
+            <w:r>
+              <w:rPr>
+                <w:rFonts w:ascii="DM Mono" w:eastAsia="Aptos" w:hAnsi="DM Mono"/>
+                <w:sz w:val="16"/>
+                <w:szCs w:val="16"/>
+              </w:rPr>
+              <w:t xml:space="preserve"> the games which I investigated for this project, this item was prevalent. The reason being that it is an essential indicator of the leading fighter and the proximity to a loss. My use of this would see the traditional red block fill, making use of </w:t>
             </w:r>
             <w:r>
               <w:rPr>
@@ -4862,7 +5134,25 @@
                 <w:sz w:val="16"/>
                 <w:szCs w:val="16"/>
               </w:rPr>
-              <w:t>A simple element similar to the health bar, used to show the current level of stamina possessed by the relevant fighter. Positioned below the health bar.</w:t>
+              <w:t xml:space="preserve">A simple element </w:t>
+            </w:r>
+            <w:proofErr w:type="gramStart"/>
+            <w:r>
+              <w:rPr>
+                <w:rFonts w:ascii="DM Mono" w:eastAsia="Aptos" w:hAnsi="DM Mono"/>
+                <w:sz w:val="16"/>
+                <w:szCs w:val="16"/>
+              </w:rPr>
+              <w:t>similar to</w:t>
+            </w:r>
+            <w:proofErr w:type="gramEnd"/>
+            <w:r>
+              <w:rPr>
+                <w:rFonts w:ascii="DM Mono" w:eastAsia="Aptos" w:hAnsi="DM Mono"/>
+                <w:sz w:val="16"/>
+                <w:szCs w:val="16"/>
+              </w:rPr>
+              <w:t xml:space="preserve"> the health bar, used to show the current level of stamina possessed by the relevant fighter. Positioned below the health bar.</w:t>
             </w:r>
           </w:p>
         </w:tc>
@@ -4885,7 +5175,25 @@
                 <w:sz w:val="16"/>
                 <w:szCs w:val="16"/>
               </w:rPr>
-              <w:t>This element would act incredibly like the above. This would show the stamina attribute of the fighter as an orange block fill. As so, it would decrease after the player or enemy made a move, thus showing both the player’s capability to advance, or the enemies weakness. By including this as a displayed element, it improves the ease of use for the player. This would differ slightly to the health bar in light of the nature of stamina to be recovered, both in similar media and real life. Hence, mine shall use a formula to determine the rate at which the bar should be filled over a given period. The result would be a smoother looking increase in stamina as opposed to a direct spike.</w:t>
+              <w:t xml:space="preserve">This element would act incredibly like the above. This would show the stamina attribute of the fighter as an orange block fill. As so, it would decrease after the player or enemy made a move, thus showing both the player’s capability to advance, or the enemies weakness. By including this as a displayed element, it improves the ease of use for the player. This would differ slightly to the health bar </w:t>
+            </w:r>
+            <w:proofErr w:type="gramStart"/>
+            <w:r>
+              <w:rPr>
+                <w:rFonts w:ascii="DM Mono" w:eastAsia="Aptos" w:hAnsi="DM Mono"/>
+                <w:sz w:val="16"/>
+                <w:szCs w:val="16"/>
+              </w:rPr>
+              <w:t>in light of</w:t>
+            </w:r>
+            <w:proofErr w:type="gramEnd"/>
+            <w:r>
+              <w:rPr>
+                <w:rFonts w:ascii="DM Mono" w:eastAsia="Aptos" w:hAnsi="DM Mono"/>
+                <w:sz w:val="16"/>
+                <w:szCs w:val="16"/>
+              </w:rPr>
+              <w:t xml:space="preserve"> the nature of stamina to be recovered, both in similar media and real life. Hence, mine shall use a formula to determine the rate at which the bar should be filled over a given period. The result would be a smoother looking increase in stamina as opposed to a direct spike.</w:t>
             </w:r>
           </w:p>
         </w:tc>
@@ -5253,7 +5561,43 @@
                 <w:sz w:val="16"/>
                 <w:szCs w:val="16"/>
               </w:rPr>
-              <w:t xml:space="preserve">In all three games which I analysed for my market research, a start button was consistent. This feature is useful because it allows the player to instantiate a new game if and when they desire. Furthermore, this permits a period of which a student playing this game can wait before playing again, for example if they are printing out an essay they might load the game when they plan to start printing, but only actually begin it once the document has started to print. </w:t>
+              <w:t xml:space="preserve">In all three games which I analysed for my market research, a start button was consistent. This feature is useful because it allows the player to instantiate a new game </w:t>
+            </w:r>
+            <w:proofErr w:type="gramStart"/>
+            <w:r>
+              <w:rPr>
+                <w:rFonts w:ascii="DM Mono" w:eastAsia="Aptos" w:hAnsi="DM Mono"/>
+                <w:sz w:val="16"/>
+                <w:szCs w:val="16"/>
+              </w:rPr>
+              <w:t>if and when</w:t>
+            </w:r>
+            <w:proofErr w:type="gramEnd"/>
+            <w:r>
+              <w:rPr>
+                <w:rFonts w:ascii="DM Mono" w:eastAsia="Aptos" w:hAnsi="DM Mono"/>
+                <w:sz w:val="16"/>
+                <w:szCs w:val="16"/>
+              </w:rPr>
+              <w:t xml:space="preserve"> they desire. Furthermore, this permits a period of which a student playing this game can wait before playing again, for example if they are printing out an </w:t>
+            </w:r>
+            <w:proofErr w:type="gramStart"/>
+            <w:r>
+              <w:rPr>
+                <w:rFonts w:ascii="DM Mono" w:eastAsia="Aptos" w:hAnsi="DM Mono"/>
+                <w:sz w:val="16"/>
+                <w:szCs w:val="16"/>
+              </w:rPr>
+              <w:t>essay</w:t>
+            </w:r>
+            <w:proofErr w:type="gramEnd"/>
+            <w:r>
+              <w:rPr>
+                <w:rFonts w:ascii="DM Mono" w:eastAsia="Aptos" w:hAnsi="DM Mono"/>
+                <w:sz w:val="16"/>
+                <w:szCs w:val="16"/>
+              </w:rPr>
+              <w:t xml:space="preserve"> they might load the game when they plan to start printing, but only actually begin it once the document has started to print. </w:t>
             </w:r>
           </w:p>
         </w:tc>
@@ -5512,7 +5856,25 @@
                 <w:sz w:val="16"/>
                 <w:szCs w:val="16"/>
               </w:rPr>
-              <w:t>A menu screen would be crucial for a typical functionality of the game. Due to the fast paced nature of the game, a menu to break it up would feel helpful. It would also be a necessary platform for elements such a play button.</w:t>
+              <w:t xml:space="preserve">A menu screen would be crucial for a typical functionality of the game. Due to the </w:t>
+            </w:r>
+            <w:proofErr w:type="gramStart"/>
+            <w:r>
+              <w:rPr>
+                <w:rFonts w:ascii="DM Mono" w:eastAsia="Aptos" w:hAnsi="DM Mono"/>
+                <w:sz w:val="16"/>
+                <w:szCs w:val="16"/>
+              </w:rPr>
+              <w:t>fast paced</w:t>
+            </w:r>
+            <w:proofErr w:type="gramEnd"/>
+            <w:r>
+              <w:rPr>
+                <w:rFonts w:ascii="DM Mono" w:eastAsia="Aptos" w:hAnsi="DM Mono"/>
+                <w:sz w:val="16"/>
+                <w:szCs w:val="16"/>
+              </w:rPr>
+              <w:t xml:space="preserve"> nature of the game, a menu to break it up would feel helpful. It would also be a necessary platform for elements such a play button.</w:t>
             </w:r>
           </w:p>
         </w:tc>
@@ -6644,7 +7006,25 @@
                 <w:sz w:val="20"/>
                 <w:szCs w:val="20"/>
               </w:rPr>
-              <w:t>This allows the user to  take agency over the starting of the game. The alternative would force the user to focus immediately after launching the game, where the fight would start as soon as it opens. This would be incredibly difficult and hence shall be thwarted.</w:t>
+              <w:t xml:space="preserve">This allows the user </w:t>
+            </w:r>
+            <w:proofErr w:type="gramStart"/>
+            <w:r>
+              <w:rPr>
+                <w:rFonts w:ascii="DM Mono" w:eastAsia="Aptos" w:hAnsi="DM Mono"/>
+                <w:sz w:val="20"/>
+                <w:szCs w:val="20"/>
+              </w:rPr>
+              <w:t>to  take</w:t>
+            </w:r>
+            <w:proofErr w:type="gramEnd"/>
+            <w:r>
+              <w:rPr>
+                <w:rFonts w:ascii="DM Mono" w:eastAsia="Aptos" w:hAnsi="DM Mono"/>
+                <w:sz w:val="20"/>
+                <w:szCs w:val="20"/>
+              </w:rPr>
+              <w:t xml:space="preserve"> agency over the starting of the game. The alternative would force the user to focus immediately after launching the game, where the fight would start as soon as it opens. This would be incredibly difficult and hence shall be thwarted.</w:t>
             </w:r>
           </w:p>
         </w:tc>
@@ -7045,25 +7425,25 @@
                 <w:szCs w:val="20"/>
               </w:rPr>
               <w:lastRenderedPageBreak/>
-              <w:t xml:space="preserve">ideal for this project such as </w:t>
-            </w:r>
-            <w:proofErr w:type="spellStart"/>
-            <w:r>
-              <w:rPr>
-                <w:rFonts w:ascii="DM Mono" w:eastAsia="Aptos" w:hAnsi="DM Mono"/>
-                <w:sz w:val="20"/>
-                <w:szCs w:val="20"/>
-              </w:rPr>
-              <w:t>Greenfoot</w:t>
-            </w:r>
-            <w:proofErr w:type="spellEnd"/>
-            <w:r>
-              <w:rPr>
-                <w:rFonts w:ascii="DM Mono" w:eastAsia="Aptos" w:hAnsi="DM Mono"/>
-                <w:sz w:val="20"/>
-                <w:szCs w:val="20"/>
-              </w:rPr>
-              <w:t xml:space="preserve">, have no built in animation feature. </w:t>
+              <w:t xml:space="preserve">ideal for this project such as Greenfoot, have no </w:t>
+            </w:r>
+            <w:proofErr w:type="gramStart"/>
+            <w:r>
+              <w:rPr>
+                <w:rFonts w:ascii="DM Mono" w:eastAsia="Aptos" w:hAnsi="DM Mono"/>
+                <w:sz w:val="20"/>
+                <w:szCs w:val="20"/>
+              </w:rPr>
+              <w:t>built in</w:t>
+            </w:r>
+            <w:proofErr w:type="gramEnd"/>
+            <w:r>
+              <w:rPr>
+                <w:rFonts w:ascii="DM Mono" w:eastAsia="Aptos" w:hAnsi="DM Mono"/>
+                <w:sz w:val="20"/>
+                <w:szCs w:val="20"/>
+              </w:rPr>
+              <w:t xml:space="preserve"> animation feature. </w:t>
             </w:r>
           </w:p>
         </w:tc>
@@ -7087,7 +7467,25 @@
                 <w:szCs w:val="20"/>
               </w:rPr>
               <w:lastRenderedPageBreak/>
-              <w:t xml:space="preserve">I could possible work around this by changing the character sprites in rapid succession, but this could </w:t>
+              <w:t xml:space="preserve">I could </w:t>
+            </w:r>
+            <w:proofErr w:type="gramStart"/>
+            <w:r>
+              <w:rPr>
+                <w:rFonts w:ascii="DM Mono" w:eastAsia="Aptos" w:hAnsi="DM Mono"/>
+                <w:sz w:val="20"/>
+                <w:szCs w:val="20"/>
+              </w:rPr>
+              <w:t>possible</w:t>
+            </w:r>
+            <w:proofErr w:type="gramEnd"/>
+            <w:r>
+              <w:rPr>
+                <w:rFonts w:ascii="DM Mono" w:eastAsia="Aptos" w:hAnsi="DM Mono"/>
+                <w:sz w:val="20"/>
+                <w:szCs w:val="20"/>
+              </w:rPr>
+              <w:t xml:space="preserve"> work around this by changing the character sprites in rapid succession, but this could </w:t>
             </w:r>
             <w:r>
               <w:rPr>
@@ -7151,7 +7549,25 @@
                 <w:sz w:val="20"/>
                 <w:szCs w:val="20"/>
               </w:rPr>
-              <w:t>This is again down to the issue of animation. In addition, I would like the bar to increment exponentially, yet stop if it depletes further.</w:t>
+              <w:t xml:space="preserve">This is again down to the issue of animation. In addition, I would like the bar to increment </w:t>
+            </w:r>
+            <w:proofErr w:type="gramStart"/>
+            <w:r>
+              <w:rPr>
+                <w:rFonts w:ascii="DM Mono" w:eastAsia="Aptos" w:hAnsi="DM Mono"/>
+                <w:sz w:val="20"/>
+                <w:szCs w:val="20"/>
+              </w:rPr>
+              <w:t>exponentially, yet</w:t>
+            </w:r>
+            <w:proofErr w:type="gramEnd"/>
+            <w:r>
+              <w:rPr>
+                <w:rFonts w:ascii="DM Mono" w:eastAsia="Aptos" w:hAnsi="DM Mono"/>
+                <w:sz w:val="20"/>
+                <w:szCs w:val="20"/>
+              </w:rPr>
+              <w:t xml:space="preserve"> stop if it depletes further.</w:t>
             </w:r>
           </w:p>
         </w:tc>
@@ -7195,7 +7611,25 @@
                 <w:sz w:val="20"/>
                 <w:szCs w:val="20"/>
               </w:rPr>
-              <w:t>`increase=(amount+1)^2`</w:t>
+              <w:t>`increase=(amount+</w:t>
+            </w:r>
+            <w:proofErr w:type="gramStart"/>
+            <w:r>
+              <w:rPr>
+                <w:rFonts w:ascii="DM Mono" w:hAnsi="DM Mono"/>
+                <w:sz w:val="20"/>
+                <w:szCs w:val="20"/>
+              </w:rPr>
+              <w:t>1)^</w:t>
+            </w:r>
+            <w:proofErr w:type="gramEnd"/>
+            <w:r>
+              <w:rPr>
+                <w:rFonts w:ascii="DM Mono" w:hAnsi="DM Mono"/>
+                <w:sz w:val="20"/>
+                <w:szCs w:val="20"/>
+              </w:rPr>
+              <w:t>2`</w:t>
             </w:r>
           </w:p>
           <w:p>
@@ -7241,25 +7675,7 @@
                 <w:sz w:val="20"/>
                 <w:szCs w:val="20"/>
               </w:rPr>
-              <w:t xml:space="preserve">Initiating the game only upon the start button being pressed in older IDEs such as </w:t>
-            </w:r>
-            <w:proofErr w:type="spellStart"/>
-            <w:r>
-              <w:rPr>
-                <w:rFonts w:ascii="DM Mono" w:hAnsi="DM Mono"/>
-                <w:sz w:val="20"/>
-                <w:szCs w:val="20"/>
-              </w:rPr>
-              <w:t>Greenfoot</w:t>
-            </w:r>
-            <w:proofErr w:type="spellEnd"/>
-            <w:r>
-              <w:rPr>
-                <w:rFonts w:ascii="DM Mono" w:hAnsi="DM Mono"/>
-                <w:sz w:val="20"/>
-                <w:szCs w:val="20"/>
-              </w:rPr>
-              <w:t>.</w:t>
+              <w:t>Initiating the game only upon the start button being pressed in older IDEs such as Greenfoot.</w:t>
             </w:r>
           </w:p>
         </w:tc>
@@ -7311,25 +7727,25 @@
                 <w:sz w:val="20"/>
                 <w:szCs w:val="20"/>
               </w:rPr>
-              <w:t xml:space="preserve">I could either have two different scenes or blocks of code, or if I were to use </w:t>
-            </w:r>
-            <w:proofErr w:type="spellStart"/>
-            <w:r>
-              <w:rPr>
-                <w:rFonts w:ascii="DM Mono" w:hAnsi="DM Mono"/>
-                <w:sz w:val="20"/>
-                <w:szCs w:val="20"/>
-              </w:rPr>
-              <w:t>Greenfoot</w:t>
-            </w:r>
-            <w:proofErr w:type="spellEnd"/>
-            <w:r>
-              <w:rPr>
-                <w:rFonts w:ascii="DM Mono" w:hAnsi="DM Mono"/>
-                <w:sz w:val="20"/>
-                <w:szCs w:val="20"/>
-              </w:rPr>
-              <w:t>, have two separate worlds. This would allow a flexibility that I would otherwise not have, at the cost of not having the same background without interfering.</w:t>
+              <w:t xml:space="preserve">I could either have two different scenes or blocks of code, or if I were to use Greenfoot, have two separate worlds. This would allow a flexibility that I </w:t>
+            </w:r>
+            <w:proofErr w:type="gramStart"/>
+            <w:r>
+              <w:rPr>
+                <w:rFonts w:ascii="DM Mono" w:hAnsi="DM Mono"/>
+                <w:sz w:val="20"/>
+                <w:szCs w:val="20"/>
+              </w:rPr>
+              <w:t>would otherwise not have,</w:t>
+            </w:r>
+            <w:proofErr w:type="gramEnd"/>
+            <w:r>
+              <w:rPr>
+                <w:rFonts w:ascii="DM Mono" w:hAnsi="DM Mono"/>
+                <w:sz w:val="20"/>
+                <w:szCs w:val="20"/>
+              </w:rPr>
+              <w:t xml:space="preserve"> at the cost of not having the same background without interfering.</w:t>
             </w:r>
           </w:p>
         </w:tc>
@@ -7377,13 +7793,23 @@
                 <w:szCs w:val="20"/>
               </w:rPr>
             </w:pPr>
-            <w:r>
-              <w:rPr>
-                <w:rFonts w:ascii="DM Mono" w:hAnsi="DM Mono"/>
-                <w:sz w:val="20"/>
-                <w:szCs w:val="20"/>
-              </w:rPr>
-              <w:t>Similar to the above, it could be difficult to pause the game and take necessary inputs to affect the state of the game.</w:t>
+            <w:proofErr w:type="gramStart"/>
+            <w:r>
+              <w:rPr>
+                <w:rFonts w:ascii="DM Mono" w:hAnsi="DM Mono"/>
+                <w:sz w:val="20"/>
+                <w:szCs w:val="20"/>
+              </w:rPr>
+              <w:t>Similar to</w:t>
+            </w:r>
+            <w:proofErr w:type="gramEnd"/>
+            <w:r>
+              <w:rPr>
+                <w:rFonts w:ascii="DM Mono" w:hAnsi="DM Mono"/>
+                <w:sz w:val="20"/>
+                <w:szCs w:val="20"/>
+              </w:rPr>
+              <w:t xml:space="preserve"> the above, it could be difficult to pause the game and take necessary inputs to affect the state of the game.</w:t>
             </w:r>
           </w:p>
         </w:tc>
@@ -7435,9 +7861,101 @@
           <w:sz w:val="32"/>
           <w:szCs w:val="32"/>
         </w:rPr>
-        <w:t>Hardware</w:t>
+        <w:t>Hardware Requirements</w:t>
+      </w:r>
+    </w:p>
+    <w:p>
+      <w:pPr>
+        <w:rPr>
+          <w:rFonts w:ascii="DM Mono" w:hAnsi="DM Mono"/>
+          <w:sz w:val="20"/>
+          <w:szCs w:val="20"/>
+        </w:rPr>
+      </w:pPr>
+      <w:r>
+        <w:rPr>
+          <w:rFonts w:ascii="DM Mono" w:hAnsi="DM Mono"/>
+          <w:sz w:val="20"/>
+          <w:szCs w:val="20"/>
+        </w:rPr>
+        <w:t xml:space="preserve">I will need a computer with a keyboard, capable of running </w:t>
       </w:r>
       <w:r>
+        <w:rPr>
+          <w:rFonts w:ascii="DM Mono" w:hAnsi="DM Mono"/>
+          <w:sz w:val="20"/>
+          <w:szCs w:val="20"/>
+        </w:rPr>
+        <w:t>Greenfoot</w:t>
+      </w:r>
+      <w:r>
+        <w:rPr>
+          <w:rFonts w:ascii="DM Mono" w:hAnsi="DM Mono"/>
+          <w:sz w:val="20"/>
+          <w:szCs w:val="20"/>
+        </w:rPr>
+        <w:t xml:space="preserve"> version 3.9.0. For the distribution targeted at major Linux based operating systems, a specific CPU is not required.</w:t>
+      </w:r>
+      <w:r>
+        <w:rPr>
+          <w:rFonts w:ascii="DM Mono" w:hAnsi="DM Mono"/>
+          <w:sz w:val="20"/>
+          <w:szCs w:val="20"/>
+        </w:rPr>
+        <w:t xml:space="preserve"> </w:t>
+      </w:r>
+      <w:r>
+        <w:rPr>
+          <w:rFonts w:ascii="DM Mono" w:hAnsi="DM Mono"/>
+          <w:sz w:val="20"/>
+          <w:szCs w:val="20"/>
+        </w:rPr>
+        <w:t xml:space="preserve">I can justify this choice by assuming that my target demographic </w:t>
+      </w:r>
+      <w:r>
+        <w:rPr>
+          <w:rFonts w:ascii="DM Mono" w:hAnsi="DM Mono"/>
+          <w:sz w:val="20"/>
+          <w:szCs w:val="20"/>
+        </w:rPr>
+        <w:t>uses</w:t>
+      </w:r>
+      <w:r>
+        <w:rPr>
+          <w:rFonts w:ascii="DM Mono" w:hAnsi="DM Mono"/>
+          <w:sz w:val="20"/>
+          <w:szCs w:val="20"/>
+        </w:rPr>
+        <w:t xml:space="preserve"> an OS such as Ubuntu or Debian. This demographic needs the smallest minimum requirement, being only the necessary hardware to interact with the game. A keyboard is necessary to send inputs to the program.</w:t>
+      </w:r>
+    </w:p>
+    <w:p>
+      <w:pPr>
+        <w:rPr>
+          <w:rFonts w:ascii="DM Mono" w:hAnsi="DM Mono"/>
+          <w:sz w:val="20"/>
+          <w:szCs w:val="20"/>
+        </w:rPr>
+      </w:pPr>
+      <w:r>
+        <w:rPr>
+          <w:rFonts w:ascii="DM Mono" w:hAnsi="DM Mono"/>
+          <w:sz w:val="20"/>
+          <w:szCs w:val="20"/>
+        </w:rPr>
+        <w:t>The screen of this device is not of great importance, due to its pixelated graphics</w:t>
+      </w:r>
+      <w:r>
+        <w:rPr>
+          <w:rFonts w:ascii="DM Mono" w:hAnsi="DM Mono"/>
+          <w:sz w:val="20"/>
+          <w:szCs w:val="20"/>
+        </w:rPr>
+        <w:t xml:space="preserve">. </w:t>
+      </w:r>
+    </w:p>
+    <w:p>
+      <w:pPr>
         <w:rPr>
           <w:rFonts w:ascii="DM Mono Medium" w:hAnsi="DM Mono Medium"/>
           <w:b/>
@@ -7445,8 +7963,7 @@
           <w:sz w:val="32"/>
           <w:szCs w:val="32"/>
         </w:rPr>
-        <w:t xml:space="preserve"> Requirements</w:t>
-      </w:r>
+      </w:pPr>
     </w:p>
     <w:p>
       <w:pPr>
@@ -7460,22 +7977,88 @@
       </w:pPr>
       <w:r>
         <w:rPr>
-          <w:rFonts w:ascii="DM Mono" w:hAnsi="DM Mono"/>
-          <w:sz w:val="20"/>
-          <w:szCs w:val="20"/>
-        </w:rPr>
-        <w:t>…</w:t>
-      </w:r>
-    </w:p>
-    <w:p>
-      <w:pPr>
-        <w:rPr>
           <w:rFonts w:ascii="DM Mono Medium" w:hAnsi="DM Mono Medium"/>
           <w:b/>
           <w:bCs/>
           <w:sz w:val="32"/>
           <w:szCs w:val="32"/>
         </w:rPr>
+        <w:t>Software Requirements</w:t>
+      </w:r>
+    </w:p>
+    <w:p>
+      <w:pPr>
+        <w:rPr>
+          <w:rFonts w:ascii="DM Mono" w:hAnsi="DM Mono"/>
+          <w:sz w:val="20"/>
+          <w:szCs w:val="20"/>
+        </w:rPr>
+      </w:pPr>
+      <w:r>
+        <w:rPr>
+          <w:rFonts w:ascii="DM Mono" w:hAnsi="DM Mono"/>
+          <w:sz w:val="20"/>
+          <w:szCs w:val="20"/>
+        </w:rPr>
+        <w:t xml:space="preserve">The device will need to be running a Debian based system with Oracle JDK pre-installed. As well as this it should have a version of Java capable of interfacing with Greenfoot, my conducted research leads me to believe the </w:t>
+      </w:r>
+      <w:r>
+        <w:rPr>
+          <w:rFonts w:ascii="DM Mono" w:hAnsi="DM Mono"/>
+          <w:sz w:val="20"/>
+          <w:szCs w:val="20"/>
+        </w:rPr>
+        <w:lastRenderedPageBreak/>
+        <w:t xml:space="preserve">recent version would </w:t>
+      </w:r>
+      <w:r>
+        <w:rPr>
+          <w:rFonts w:ascii="DM Mono" w:hAnsi="DM Mono"/>
+          <w:sz w:val="20"/>
+          <w:szCs w:val="20"/>
+        </w:rPr>
+        <w:t>need</w:t>
+      </w:r>
+      <w:r>
+        <w:rPr>
+          <w:rFonts w:ascii="DM Mono" w:hAnsi="DM Mono"/>
+          <w:sz w:val="20"/>
+          <w:szCs w:val="20"/>
+        </w:rPr>
+        <w:t xml:space="preserve"> Java 21.</w:t>
+      </w:r>
+      <w:r>
+        <w:rPr>
+          <w:rFonts w:ascii="DM Mono" w:hAnsi="DM Mono"/>
+          <w:sz w:val="20"/>
+          <w:szCs w:val="20"/>
+        </w:rPr>
+        <w:t xml:space="preserve"> Installing Greenfoot itself is free and works graphically with almost all desktop environments such as KDE Plasma or Gnome. On more advanced environments such as Hyprland, external tools and </w:t>
+      </w:r>
+      <w:r>
+        <w:rPr>
+          <w:rFonts w:ascii="DM Mono" w:hAnsi="DM Mono"/>
+          <w:sz w:val="20"/>
+          <w:szCs w:val="20"/>
+        </w:rPr>
+        <w:t>software</w:t>
+      </w:r>
+      <w:r>
+        <w:rPr>
+          <w:rFonts w:ascii="DM Mono" w:hAnsi="DM Mono"/>
+          <w:sz w:val="20"/>
+          <w:szCs w:val="20"/>
+        </w:rPr>
+        <w:t xml:space="preserve"> may need to be installed for a smoother experience.</w:t>
+      </w:r>
+    </w:p>
+    <w:p>
+      <w:pPr>
+        <w:rPr>
+          <w:rFonts w:ascii="DM Mono" w:hAnsi="DM Mono"/>
+          <w:sz w:val="20"/>
+          <w:szCs w:val="20"/>
+        </w:rPr>
       </w:pPr>
       <w:r>
         <w:rPr>
@@ -7485,9 +8068,97 @@
           <w:sz w:val="32"/>
           <w:szCs w:val="32"/>
         </w:rPr>
-        <w:t>Software</w:t>
+        <w:t>Sources</w:t>
       </w:r>
+    </w:p>
+    <w:p>
+      <w:pPr>
+        <w:rPr>
+          <w:rFonts w:ascii="DM Mono" w:hAnsi="DM Mono"/>
+          <w:sz w:val="20"/>
+          <w:szCs w:val="20"/>
+        </w:rPr>
+      </w:pPr>
+      <w:hyperlink r:id="rId19" w:history="1">
+        <w:r>
+          <w:rPr>
+            <w:rStyle w:val="Hyperlink"/>
+            <w:rFonts w:ascii="DM Mono" w:hAnsi="DM Mono"/>
+            <w:sz w:val="20"/>
+            <w:szCs w:val="20"/>
+          </w:rPr>
+          <w:t>https://www.greenfoot.org/doc/faq#:~:text=The%20Windows%20version%20of%20Greenfoot,on%20a%2032%2Dbit%</w:t>
+        </w:r>
+        <w:r>
+          <w:rPr>
+            <w:rStyle w:val="Hyperlink"/>
+            <w:rFonts w:ascii="DM Mono" w:hAnsi="DM Mono"/>
+            <w:sz w:val="20"/>
+            <w:szCs w:val="20"/>
+          </w:rPr>
+          <w:t>2</w:t>
+        </w:r>
+        <w:r>
+          <w:rPr>
+            <w:rStyle w:val="Hyperlink"/>
+            <w:rFonts w:ascii="DM Mono" w:hAnsi="DM Mono"/>
+            <w:sz w:val="20"/>
+            <w:szCs w:val="20"/>
+          </w:rPr>
+          <w:t>0system</w:t>
+        </w:r>
+      </w:hyperlink>
       <w:r>
+        <w:rPr>
+          <w:rFonts w:ascii="DM Mono" w:hAnsi="DM Mono"/>
+          <w:sz w:val="20"/>
+          <w:szCs w:val="20"/>
+        </w:rPr>
+        <w:t>.</w:t>
+      </w:r>
+    </w:p>
+    <w:p>
+      <w:pPr>
+        <w:rPr>
+          <w:rFonts w:ascii="DM Mono" w:hAnsi="DM Mono"/>
+          <w:sz w:val="20"/>
+          <w:szCs w:val="20"/>
+        </w:rPr>
+      </w:pPr>
+      <w:hyperlink r:id="rId20" w:history="1">
+        <w:r>
+          <w:rPr>
+            <w:rStyle w:val="Hyperlink"/>
+            <w:rFonts w:ascii="DM Mono" w:hAnsi="DM Mono"/>
+            <w:sz w:val="20"/>
+            <w:szCs w:val="20"/>
+          </w:rPr>
+          <w:t>https://www.greenfoot.org/download/installation</w:t>
+        </w:r>
+      </w:hyperlink>
+    </w:p>
+    <w:p>
+      <w:pPr>
+        <w:rPr>
+          <w:rFonts w:ascii="DM Mono" w:hAnsi="DM Mono"/>
+          <w:sz w:val="20"/>
+          <w:szCs w:val="20"/>
+        </w:rPr>
+      </w:pPr>
+      <w:hyperlink r:id="rId21" w:history="1">
+        <w:r>
+          <w:rPr>
+            <w:rStyle w:val="Hyperlink"/>
+            <w:rFonts w:ascii="DM Mono" w:hAnsi="DM Mono"/>
+            <w:sz w:val="20"/>
+            <w:szCs w:val="20"/>
+          </w:rPr>
+          <w:t>https://www.greenfoot.org/version_history</w:t>
+        </w:r>
+      </w:hyperlink>
+    </w:p>
+    <w:p>
+      <w:pPr>
         <w:rPr>
           <w:rFonts w:ascii="DM Mono Medium" w:hAnsi="DM Mono Medium"/>
           <w:b/>
@@ -7495,33 +8166,6 @@
           <w:sz w:val="32"/>
           <w:szCs w:val="32"/>
         </w:rPr>
-        <w:t xml:space="preserve"> Requirements</w:t>
-      </w:r>
-    </w:p>
-    <w:p>
-      <w:pPr>
-        <w:rPr>
-          <w:rFonts w:ascii="DM Mono" w:hAnsi="DM Mono"/>
-          <w:sz w:val="20"/>
-          <w:szCs w:val="20"/>
-        </w:rPr>
-      </w:pPr>
-      <w:r>
-        <w:rPr>
-          <w:rFonts w:ascii="DM Mono" w:hAnsi="DM Mono"/>
-          <w:sz w:val="20"/>
-          <w:szCs w:val="20"/>
-        </w:rPr>
-        <w:t>…</w:t>
-      </w:r>
-    </w:p>
-    <w:p>
-      <w:pPr>
-        <w:rPr>
-          <w:rFonts w:ascii="DM Mono" w:hAnsi="DM Mono"/>
-          <w:sz w:val="20"/>
-          <w:szCs w:val="20"/>
-        </w:rPr>
       </w:pPr>
     </w:p>
     <w:p>
@@ -7534,9 +8178,7 @@
           <w:szCs w:val="32"/>
         </w:rPr>
       </w:pPr>
-    </w:p>
-    <w:p>
-      <w:pPr>
+      <w:r>
         <w:rPr>
           <w:rFonts w:ascii="DM Mono Medium" w:hAnsi="DM Mono Medium"/>
           <w:b/>
@@ -7544,22 +8186,15 @@
           <w:sz w:val="32"/>
           <w:szCs w:val="32"/>
         </w:rPr>
-      </w:pPr>
-      <w:r>
-        <w:rPr>
-          <w:rFonts w:ascii="DM Mono Medium" w:hAnsi="DM Mono Medium"/>
+        <w:t>Computational Methods</w:t>
+      </w:r>
+    </w:p>
+    <w:p>
+      <w:pPr>
+        <w:rPr>
+          <w:rFonts w:ascii="DM Mono" w:hAnsi="DM Mono"/>
           <w:b/>
           <w:bCs/>
-          <w:sz w:val="32"/>
-          <w:szCs w:val="32"/>
-        </w:rPr>
-        <w:t>Computational Methods</w:t>
-      </w:r>
-    </w:p>
-    <w:p>
-      <w:pPr>
-        <w:rPr>
-          <w:rFonts w:ascii="DM Mono" w:hAnsi="DM Mono"/>
           <w:sz w:val="20"/>
           <w:szCs w:val="20"/>
         </w:rPr>
@@ -7567,11 +8202,39 @@
       <w:r>
         <w:rPr>
           <w:rFonts w:ascii="DM Mono" w:hAnsi="DM Mono"/>
+          <w:b/>
+          <w:bCs/>
           <w:sz w:val="20"/>
           <w:szCs w:val="20"/>
         </w:rPr>
         <w:t>What Makes This a Computable Task?</w:t>
       </w:r>
+    </w:p>
+    <w:p>
+      <w:pPr>
+        <w:rPr>
+          <w:rFonts w:ascii="DM Mono" w:hAnsi="DM Mono"/>
+          <w:sz w:val="20"/>
+          <w:szCs w:val="20"/>
+        </w:rPr>
+      </w:pPr>
+      <w:r>
+        <w:rPr>
+          <w:rFonts w:ascii="DM Mono" w:hAnsi="DM Mono"/>
+          <w:sz w:val="20"/>
+          <w:szCs w:val="20"/>
+        </w:rPr>
+        <w:t>This task is computable because it factors in multiple different processes and conditions simultaneously. This would be almost impossible for a human to do. Furthermore, by being run on a computer, the output could be projected to a screen in real time, allowing a better visualisation of the current state of the game.</w:t>
+      </w:r>
+    </w:p>
+    <w:p>
+      <w:pPr>
+        <w:rPr>
+          <w:rFonts w:ascii="DM Mono" w:hAnsi="DM Mono"/>
+          <w:sz w:val="20"/>
+          <w:szCs w:val="20"/>
+        </w:rPr>
+      </w:pPr>
     </w:p>
     <w:tbl>
       <w:tblPr>
@@ -7618,6 +8281,78 @@
           <w:p>
             <w:pPr>
               <w:rPr>
+                <w:rFonts w:ascii="DM Mono" w:hAnsi="DM Mono"/>
+                <w:sz w:val="20"/>
+                <w:szCs w:val="20"/>
+              </w:rPr>
+            </w:pPr>
+            <w:r>
+              <w:rPr>
+                <w:rFonts w:ascii="DM Mono" w:hAnsi="DM Mono"/>
+                <w:sz w:val="20"/>
+                <w:szCs w:val="20"/>
+              </w:rPr>
+              <w:t>This project will use abstraction to account for areas such as character hit box, or the size and range of an attack. This will work by casting</w:t>
+            </w:r>
+            <w:r>
+              <w:rPr>
+                <w:rFonts w:ascii="DM Mono" w:hAnsi="DM Mono"/>
+                <w:sz w:val="20"/>
+                <w:szCs w:val="20"/>
+              </w:rPr>
+              <w:t xml:space="preserve"> boxes to account for necessary collision areas, such as a player’s body or attack. Resultantly, it will be easier to calculate collisions and if the player is hit.</w:t>
+            </w:r>
+            <w:r>
+              <w:rPr>
+                <w:rFonts w:ascii="DM Mono" w:hAnsi="DM Mono"/>
+                <w:sz w:val="20"/>
+                <w:szCs w:val="20"/>
+              </w:rPr>
+              <w:t xml:space="preserve"> </w:t>
+            </w:r>
+            <w:r>
+              <w:rPr>
+                <w:rFonts w:ascii="DM Mono" w:hAnsi="DM Mono"/>
+                <w:sz w:val="20"/>
+                <w:szCs w:val="20"/>
+              </w:rPr>
+              <w:t>I will be using this because Greenfoot does its own image</w:t>
+            </w:r>
+            <w:r>
+              <w:rPr>
+                <w:rFonts w:ascii="DM Mono" w:hAnsi="DM Mono"/>
+                <w:sz w:val="20"/>
+                <w:szCs w:val="20"/>
+              </w:rPr>
+              <w:t xml:space="preserve"> shape and size</w:t>
+            </w:r>
+            <w:r>
+              <w:rPr>
+                <w:rFonts w:ascii="DM Mono" w:hAnsi="DM Mono"/>
+                <w:sz w:val="20"/>
+                <w:szCs w:val="20"/>
+              </w:rPr>
+              <w:t xml:space="preserve"> calculation which would be harder to understand and detect.</w:t>
+            </w:r>
+            <w:r>
+              <w:rPr>
+                <w:rFonts w:ascii="DM Mono" w:hAnsi="DM Mono"/>
+                <w:sz w:val="20"/>
+                <w:szCs w:val="20"/>
+              </w:rPr>
+              <w:t xml:space="preserve"> My method will also make debugging easier.</w:t>
+            </w:r>
+          </w:p>
+        </w:tc>
+      </w:tr>
+      <w:tr>
+        <w:tc>
+          <w:tcPr>
+            <w:tcW w:w="9016" w:type="dxa"/>
+          </w:tcPr>
+          <w:p>
+            <w:pPr>
+              <w:rPr>
                 <w:rFonts w:ascii="DM Mono Medium" w:hAnsi="DM Mono Medium"/>
                 <w:b/>
                 <w:bCs/>
@@ -7627,31 +8362,24 @@
             </w:pPr>
             <w:r>
               <w:rPr>
-                <w:rFonts w:ascii="DM Mono" w:hAnsi="DM Mono"/>
-                <w:sz w:val="20"/>
-                <w:szCs w:val="20"/>
-              </w:rPr>
-              <w:t xml:space="preserve">This project will use abstraction to account for areas such as character hit box, or the size and range of an attack. This will work by casting </w:t>
-            </w:r>
-          </w:p>
-        </w:tc>
-      </w:tr>
-      <w:tr>
-        <w:tc>
-          <w:tcPr>
-            <w:tcW w:w="9016" w:type="dxa"/>
-          </w:tcPr>
-          <w:p>
-            <w:pPr>
-              <w:rPr>
                 <w:rFonts w:ascii="DM Mono Medium" w:hAnsi="DM Mono Medium"/>
                 <w:b/>
                 <w:bCs/>
                 <w:sz w:val="32"/>
                 <w:szCs w:val="32"/>
               </w:rPr>
-            </w:pPr>
-            <w:r>
+              <w:t>Concurrency</w:t>
+            </w:r>
+          </w:p>
+        </w:tc>
+      </w:tr>
+      <w:tr>
+        <w:tc>
+          <w:tcPr>
+            <w:tcW w:w="9016" w:type="dxa"/>
+          </w:tcPr>
+          <w:p>
+            <w:pPr>
               <w:rPr>
                 <w:rFonts w:ascii="DM Mono Medium" w:hAnsi="DM Mono Medium"/>
                 <w:b/>
@@ -7659,8 +8387,30 @@
                 <w:sz w:val="32"/>
                 <w:szCs w:val="32"/>
               </w:rPr>
-              <w:lastRenderedPageBreak/>
-              <w:t>Concurrency</w:t>
+            </w:pPr>
+            <w:r>
+              <w:rPr>
+                <w:rFonts w:ascii="DM Mono" w:hAnsi="DM Mono"/>
+                <w:sz w:val="20"/>
+                <w:szCs w:val="20"/>
+              </w:rPr>
+              <w:t>My game will use concurrency to facilitate both the player and enemy moving at the same time. This is needed so that the player can play the game with a responsive feel to it.</w:t>
+            </w:r>
+            <w:r>
+              <w:rPr>
+                <w:rFonts w:ascii="DM Mono" w:hAnsi="DM Mono"/>
+                <w:sz w:val="20"/>
+                <w:szCs w:val="20"/>
+              </w:rPr>
+              <w:t xml:space="preserve"> Furthermore, there will be calculations such as damage received or player-enemy proximity happening asynchronously.</w:t>
+            </w:r>
+            <w:r>
+              <w:rPr>
+                <w:rFonts w:ascii="DM Mono" w:hAnsi="DM Mono"/>
+                <w:sz w:val="20"/>
+                <w:szCs w:val="20"/>
+              </w:rPr>
+              <w:t xml:space="preserve"> This extends to the use of hitboxes, player inputs, and enemy condition detection and reaction.</w:t>
             </w:r>
           </w:p>
         </w:tc>
@@ -7672,6 +8422,13 @@
           </w:tcPr>
           <w:p>
             <w:pPr>
+              <w:rPr>
+                <w:rFonts w:ascii="DM Mono" w:hAnsi="DM Mono"/>
+                <w:sz w:val="20"/>
+                <w:szCs w:val="20"/>
+              </w:rPr>
+            </w:pPr>
+            <w:r>
               <w:rPr>
                 <w:rFonts w:ascii="DM Mono Medium" w:hAnsi="DM Mono Medium"/>
                 <w:b/>
@@ -7679,14 +8436,48 @@
                 <w:sz w:val="32"/>
                 <w:szCs w:val="32"/>
               </w:rPr>
-            </w:pPr>
-            <w:r>
-              <w:rPr>
-                <w:rFonts w:ascii="DM Mono" w:hAnsi="DM Mono"/>
-                <w:sz w:val="20"/>
-                <w:szCs w:val="20"/>
-              </w:rPr>
-              <w:t>…</w:t>
+              <w:t>Enumeration</w:t>
+            </w:r>
+          </w:p>
+        </w:tc>
+      </w:tr>
+      <w:tr>
+        <w:tc>
+          <w:tcPr>
+            <w:tcW w:w="9016" w:type="dxa"/>
+          </w:tcPr>
+          <w:p>
+            <w:pPr>
+              <w:rPr>
+                <w:rFonts w:ascii="DM Mono" w:hAnsi="DM Mono"/>
+                <w:sz w:val="20"/>
+                <w:szCs w:val="20"/>
+              </w:rPr>
+            </w:pPr>
+            <w:r>
+              <w:rPr>
+                <w:rFonts w:ascii="DM Mono" w:hAnsi="DM Mono"/>
+                <w:sz w:val="20"/>
+                <w:szCs w:val="20"/>
+              </w:rPr>
+              <w:lastRenderedPageBreak/>
+              <w:t>I will use enumeration to list all of the possible states which the player can be in. This would account for the actions the player can take in different conditions, such as if they are stunned or being knocked back.</w:t>
+            </w:r>
+            <w:r>
+              <w:rPr>
+                <w:rFonts w:ascii="DM Mono" w:hAnsi="DM Mono"/>
+                <w:sz w:val="20"/>
+                <w:szCs w:val="20"/>
+              </w:rPr>
+              <w:t xml:space="preserve"> Each state will be set </w:t>
+            </w:r>
+            <w:r>
+              <w:rPr>
+                <w:rFonts w:ascii="DM Mono" w:hAnsi="DM Mono"/>
+                <w:sz w:val="20"/>
+                <w:szCs w:val="20"/>
+              </w:rPr>
+              <w:t>in a usefully accessible location, such that the code for the affected actor can respond accordingly, i.e. temporarily disabling movement actions.</w:t>
             </w:r>
           </w:p>
         </w:tc>
@@ -7712,7 +8503,7 @@
                 <w:sz w:val="32"/>
                 <w:szCs w:val="32"/>
               </w:rPr>
-              <w:t>Enumeration</w:t>
+              <w:t>Data Mining</w:t>
             </w:r>
           </w:p>
         </w:tc>
@@ -7736,7 +8527,31 @@
                 <w:sz w:val="20"/>
                 <w:szCs w:val="20"/>
               </w:rPr>
-              <w:t>…</w:t>
+              <w:t xml:space="preserve">The program will have data mining system inbuilt into its environment. </w:t>
+            </w:r>
+            <w:r>
+              <w:rPr>
+                <w:rFonts w:ascii="DM Mono" w:hAnsi="DM Mono"/>
+                <w:sz w:val="20"/>
+                <w:szCs w:val="20"/>
+              </w:rPr>
+              <w:t xml:space="preserve">My game would use the Greenfoot built-in method `isKeyDown()` to detect input from the user’s keyboard. </w:t>
+            </w:r>
+            <w:r>
+              <w:rPr>
+                <w:rFonts w:ascii="DM Mono" w:hAnsi="DM Mono"/>
+                <w:sz w:val="20"/>
+                <w:szCs w:val="20"/>
+              </w:rPr>
+              <w:t>This data will then be used to follow through with relevant actions and effects. An example could be that by holding down the ‘d’ or right arrow key, the player would move to the right.</w:t>
+            </w:r>
+            <w:r>
+              <w:rPr>
+                <w:rFonts w:ascii="DM Mono" w:hAnsi="DM Mono"/>
+                <w:sz w:val="20"/>
+                <w:szCs w:val="20"/>
+              </w:rPr>
+              <w:t xml:space="preserve"> I need this for my game so that the player can interact with it.</w:t>
             </w:r>
           </w:p>
         </w:tc>
@@ -7762,7 +8577,7 @@
                 <w:sz w:val="32"/>
                 <w:szCs w:val="32"/>
               </w:rPr>
-              <w:t>Data Mining</w:t>
+              <w:t>Decomposition</w:t>
             </w:r>
           </w:p>
         </w:tc>
@@ -7786,23 +8601,20 @@
                 <w:sz w:val="20"/>
                 <w:szCs w:val="20"/>
               </w:rPr>
-              <w:t>…</w:t>
+              <w:t>There will be decomposition in my game, where each problem is broken into smaller and more manageable challenges. By doing so, I will be more efficient at writing code, since I will only have to consider a small region at a time. This also benefits the asynchronous nature of my game, where multiple processes coincide temporally.</w:t>
+            </w:r>
+            <w:r>
+              <w:rPr>
+                <w:rFonts w:ascii="DM Mono" w:hAnsi="DM Mono"/>
+                <w:sz w:val="20"/>
+                <w:szCs w:val="20"/>
+              </w:rPr>
+              <w:t xml:space="preserve"> This idea would be challenged were I not to use decomposition, due to everything being in one large code block.</w:t>
             </w:r>
           </w:p>
         </w:tc>
       </w:tr>
     </w:tbl>
-    <w:p>
-      <w:pPr>
-        <w:rPr>
-          <w:rFonts w:ascii="DM Mono Medium" w:hAnsi="DM Mono Medium"/>
-          <w:b/>
-          <w:bCs/>
-          <w:sz w:val="32"/>
-          <w:szCs w:val="32"/>
-        </w:rPr>
-      </w:pPr>
-    </w:p>
     <w:p>
       <w:pPr>
         <w:rPr>
@@ -8705,7 +9517,6 @@
   <w:style w:type="character" w:default="1" w:styleId="DefaultParagraphFont">
     <w:name w:val="Default Paragraph Font"/>
     <w:uiPriority w:val="1"/>
-    <w:semiHidden/>
     <w:unhideWhenUsed/>
   </w:style>
   <w:style w:type="table" w:default="1" w:styleId="TableNormal">
@@ -9130,6 +9941,18 @@
       </w:tblBorders>
     </w:tblPr>
   </w:style>
+  <w:style w:type="character" w:styleId="FollowedHyperlink">
+    <w:name w:val="FollowedHyperlink"/>
+    <w:basedOn w:val="DefaultParagraphFont"/>
+    <w:uiPriority w:val="99"/>
+    <w:semiHidden/>
+    <w:unhideWhenUsed/>
+    <w:rsid w:val="00B62F98"/>
+    <w:rPr>
+      <w:color w:val="96607D" w:themeColor="followedHyperlink"/>
+      <w:u w:val="single"/>
+    </w:rPr>
+  </w:style>
 </w:styles>
 </file>
 

</xml_diff>

<commit_message>
added "visualisation" method to CM
</commit_message>
<xml_diff>
--- a/analysis/Analysis.docx
+++ b/analysis/Analysis.docx
@@ -33,117 +33,33 @@
         <w:rPr>
           <w:rFonts w:ascii="DM Mono" w:hAnsi="DM Mono"/>
         </w:rPr>
-        <w:t xml:space="preserve">My current idea for this project is for it to provide a simple, retro-themed fighting game for one player. It will involve using different moves, each controlled by appropriate key bindings, to tackle various opponents with equal power. Opponents would </w:t>
+        <w:t>My current idea for this project is for it to provide a simple, retro-themed fighting game for one player. It will involve using different moves, each controlled by appropriate key bindings, to tackle various opponents with equal power. Opponents would be generated based on the player’s options with extra attributes such as reaction time to make it fair. Further scaling of the project would include a difficulty slider or even different rounds fighting enemies of greater and greater strength or speed. This would challenge the user, making the game fun and engaging to play.</w:t>
       </w:r>
-      <w:proofErr w:type="gramStart"/>
+    </w:p>
+    <w:p>
+      <w:pPr>
+        <w:rPr>
+          <w:rFonts w:ascii="DM Mono" w:hAnsi="DM Mono"/>
+        </w:rPr>
+      </w:pPr>
       <w:r>
         <w:rPr>
           <w:rFonts w:ascii="DM Mono" w:hAnsi="DM Mono"/>
         </w:rPr>
-        <w:t>be generated</w:t>
+        <w:t>My current knowledge of the games industry shows that similar games are underrepresented, despite their undisputed popularity amongst all audiences. Current examples include Street Fighter and Mortal Kombat. Other games with desirable features for this product are Gladio Mori, Half Sword and Watermelon Sandbox. Whilst two of these are 3d, I admire their menus, theming and core mechanics. This project has the goal of filling this niche in a scalable manor. This design could remove the problem of boredom from the user as they would have never truly beaten it.</w:t>
       </w:r>
-      <w:proofErr w:type="gramEnd"/>
+    </w:p>
+    <w:p>
+      <w:pPr>
+        <w:rPr>
+          <w:rFonts w:ascii="DM Mono" w:hAnsi="DM Mono"/>
+        </w:rPr>
+      </w:pPr>
       <w:r>
         <w:rPr>
           <w:rFonts w:ascii="DM Mono" w:hAnsi="DM Mono"/>
         </w:rPr>
-        <w:t xml:space="preserve"> based on the player’s options with extra attributes such as reaction time to make it fair. Further scaling of the project would include a difficulty slider or even different rounds fighting enemies of </w:t>
-      </w:r>
-      <w:proofErr w:type="gramStart"/>
-      <w:r>
-        <w:rPr>
-          <w:rFonts w:ascii="DM Mono" w:hAnsi="DM Mono"/>
-        </w:rPr>
-        <w:t>greater and greater</w:t>
-      </w:r>
-      <w:proofErr w:type="gramEnd"/>
-      <w:r>
-        <w:rPr>
-          <w:rFonts w:ascii="DM Mono" w:hAnsi="DM Mono"/>
-        </w:rPr>
-        <w:t xml:space="preserve"> strength or speed. This would challenge the user, </w:t>
-      </w:r>
-      <w:proofErr w:type="gramStart"/>
-      <w:r>
-        <w:rPr>
-          <w:rFonts w:ascii="DM Mono" w:hAnsi="DM Mono"/>
-        </w:rPr>
-        <w:t>making</w:t>
-      </w:r>
-      <w:proofErr w:type="gramEnd"/>
-      <w:r>
-        <w:rPr>
-          <w:rFonts w:ascii="DM Mono" w:hAnsi="DM Mono"/>
-        </w:rPr>
-        <w:t xml:space="preserve"> the game fun and engaging to play.</w:t>
-      </w:r>
-    </w:p>
-    <w:p>
-      <w:pPr>
-        <w:rPr>
-          <w:rFonts w:ascii="DM Mono" w:hAnsi="DM Mono"/>
-        </w:rPr>
-      </w:pPr>
-      <w:r>
-        <w:rPr>
-          <w:rFonts w:ascii="DM Mono" w:hAnsi="DM Mono"/>
-        </w:rPr>
-        <w:t xml:space="preserve">My current knowledge of the games industry shows that similar games are underrepresented, despite their undisputed popularity amongst all audiences. Current examples include Street Fighter and Mortal Kombat. Other games with desirable features for this product are Gladio Mori, Half Sword and Watermelon Sandbox. Whilst two of these are 3d, I admire their menus, </w:t>
-      </w:r>
-      <w:proofErr w:type="gramStart"/>
-      <w:r>
-        <w:rPr>
-          <w:rFonts w:ascii="DM Mono" w:hAnsi="DM Mono"/>
-        </w:rPr>
-        <w:t>theming</w:t>
-      </w:r>
-      <w:proofErr w:type="gramEnd"/>
-      <w:r>
-        <w:rPr>
-          <w:rFonts w:ascii="DM Mono" w:hAnsi="DM Mono"/>
-        </w:rPr>
-        <w:t xml:space="preserve"> and core mechanics. This project has the goal of filling this niche in a scalable manor. This design could remove the problem of boredom from the user as they would have never truly beaten it.</w:t>
-      </w:r>
-    </w:p>
-    <w:p>
-      <w:pPr>
-        <w:rPr>
-          <w:rFonts w:ascii="DM Mono" w:hAnsi="DM Mono"/>
-        </w:rPr>
-      </w:pPr>
-      <w:r>
-        <w:rPr>
-          <w:rFonts w:ascii="DM Mono" w:hAnsi="DM Mono"/>
-        </w:rPr>
-        <w:t xml:space="preserve">The embarkment of this project excites me as I can appreciate the dedication and creativity in the games industry. By completing this </w:t>
-      </w:r>
-      <w:proofErr w:type="gramStart"/>
-      <w:r>
-        <w:rPr>
-          <w:rFonts w:ascii="DM Mono" w:hAnsi="DM Mono"/>
-        </w:rPr>
-        <w:t>relatively small</w:t>
-      </w:r>
-      <w:proofErr w:type="gramEnd"/>
-      <w:r>
-        <w:rPr>
-          <w:rFonts w:ascii="DM Mono" w:hAnsi="DM Mono"/>
-        </w:rPr>
-        <w:t xml:space="preserve"> project, I would be able to use it for developing my skills. An ideal development engine should be incredibly minimal, thus allowing me to use </w:t>
-      </w:r>
-      <w:proofErr w:type="gramStart"/>
-      <w:r>
-        <w:rPr>
-          <w:rFonts w:ascii="DM Mono" w:hAnsi="DM Mono"/>
-        </w:rPr>
-        <w:t>all of</w:t>
-      </w:r>
-      <w:proofErr w:type="gramEnd"/>
-      <w:r>
-        <w:rPr>
-          <w:rFonts w:ascii="DM Mono" w:hAnsi="DM Mono"/>
-        </w:rPr>
-        <w:t xml:space="preserve"> my skills organically, rather than having them built in. Additionally, it ought to be compatible across PC operating systems such as MacOS, Debian and </w:t>
+        <w:t xml:space="preserve">The embarkment of this project excites me as I can appreciate the dedication and creativity in the games industry. By completing this relatively small project, I would be able to use it for developing my skills. An ideal development engine should be incredibly minimal, thus allowing me to use all of my skills organically, rather than having them built in. Additionally, it ought to be compatible across PC operating systems such as MacOS, Debian and </w:t>
       </w:r>
       <w:proofErr w:type="spellStart"/>
       <w:r>
@@ -170,21 +86,7 @@
         <w:rPr>
           <w:rFonts w:ascii="DM Mono" w:hAnsi="DM Mono"/>
         </w:rPr>
-        <w:t xml:space="preserve">For this project to be successful, it should allow a player to fight against a </w:t>
-      </w:r>
-      <w:proofErr w:type="gramStart"/>
-      <w:r>
-        <w:rPr>
-          <w:rFonts w:ascii="DM Mono" w:hAnsi="DM Mono"/>
-        </w:rPr>
-        <w:t>condition based</w:t>
-      </w:r>
-      <w:proofErr w:type="gramEnd"/>
-      <w:r>
-        <w:rPr>
-          <w:rFonts w:ascii="DM Mono" w:hAnsi="DM Mono"/>
-        </w:rPr>
-        <w:t xml:space="preserve"> bot. The player should have to balance various displayed attributes such as stamina and health whilst beating their opponent. Examples of the bot’s conditions may include the proximity of the player, the stamina of the player or the health of the bot. </w:t>
+        <w:t xml:space="preserve">For this project to be successful, it should allow a player to fight against a condition based bot. The player should have to balance various displayed attributes such as stamina and health whilst beating their opponent. Examples of the bot’s conditions may include the proximity of the player, the stamina of the player or the health of the bot. </w:t>
       </w:r>
     </w:p>
     <w:p/>
@@ -361,41 +263,13 @@
                 <w:szCs w:val="18"/>
               </w:rPr>
             </w:pPr>
-            <w:proofErr w:type="gramStart"/>
             <w:r>
               <w:rPr>
                 <w:rFonts w:ascii="DM Mono" w:eastAsia="Aptos" w:hAnsi="DM Mono"/>
                 <w:sz w:val="18"/>
                 <w:szCs w:val="18"/>
               </w:rPr>
-              <w:t>I think the menu of Half Sword</w:t>
-            </w:r>
-            <w:proofErr w:type="gramEnd"/>
-            <w:r>
-              <w:rPr>
-                <w:rFonts w:ascii="DM Mono" w:eastAsia="Aptos" w:hAnsi="DM Mono"/>
-                <w:sz w:val="18"/>
-                <w:szCs w:val="18"/>
-              </w:rPr>
-              <w:t xml:space="preserve"> sets up the theme of the game perfectly before the game </w:t>
-            </w:r>
-            <w:proofErr w:type="gramStart"/>
-            <w:r>
-              <w:rPr>
-                <w:rFonts w:ascii="DM Mono" w:eastAsia="Aptos" w:hAnsi="DM Mono"/>
-                <w:sz w:val="18"/>
-                <w:szCs w:val="18"/>
-              </w:rPr>
-              <w:t>is properly started</w:t>
-            </w:r>
-            <w:proofErr w:type="gramEnd"/>
-            <w:r>
-              <w:rPr>
-                <w:rFonts w:ascii="DM Mono" w:eastAsia="Aptos" w:hAnsi="DM Mono"/>
-                <w:sz w:val="18"/>
-                <w:szCs w:val="18"/>
-              </w:rPr>
-              <w:t>. This is great because it clearly informs the player of the genre and style.</w:t>
+              <w:t>I think the menu of Half Sword sets up the theme of the game perfectly before the game is properly started. This is great because it clearly informs the player of the genre and style.</w:t>
             </w:r>
           </w:p>
         </w:tc>
@@ -461,25 +335,7 @@
                 <w:sz w:val="18"/>
                 <w:szCs w:val="18"/>
               </w:rPr>
-              <w:t xml:space="preserve">The combat in the game is incredibly realistic with conditionally actioning bots. I really like this because it </w:t>
-            </w:r>
-            <w:proofErr w:type="gramStart"/>
-            <w:r>
-              <w:rPr>
-                <w:rFonts w:ascii="DM Mono" w:eastAsia="Aptos" w:hAnsi="DM Mono"/>
-                <w:sz w:val="18"/>
-                <w:szCs w:val="18"/>
-              </w:rPr>
-              <w:t>greatly simplifies</w:t>
-            </w:r>
-            <w:proofErr w:type="gramEnd"/>
-            <w:r>
-              <w:rPr>
-                <w:rFonts w:ascii="DM Mono" w:eastAsia="Aptos" w:hAnsi="DM Mono"/>
-                <w:sz w:val="18"/>
-                <w:szCs w:val="18"/>
-              </w:rPr>
-              <w:t xml:space="preserve"> the concepts and code of the bots. This is good for my minimal IDE where training a full AI may not be possible.</w:t>
+              <w:t>The combat in the game is incredibly realistic with conditionally actioning bots. I really like this because it greatly simplifies the concepts and code of the bots. This is good for my minimal IDE where training a full AI may not be possible.</w:t>
             </w:r>
           </w:p>
         </w:tc>
@@ -629,25 +485,7 @@
                 <w:sz w:val="18"/>
                 <w:szCs w:val="18"/>
               </w:rPr>
-              <w:t xml:space="preserve">I like the clear UI displaying the health of each fighter, this makes it easy to quickly gauge the opponent’s strength mid-fight. Consequently, the game is easier to read, meaning that it could be more accessible to an external audience. This </w:t>
-            </w:r>
-            <w:proofErr w:type="gramStart"/>
-            <w:r>
-              <w:rPr>
-                <w:rFonts w:ascii="DM Mono" w:eastAsia="Aptos" w:hAnsi="DM Mono"/>
-                <w:sz w:val="18"/>
-                <w:szCs w:val="18"/>
-              </w:rPr>
-              <w:t>opens up</w:t>
-            </w:r>
-            <w:proofErr w:type="gramEnd"/>
-            <w:r>
-              <w:rPr>
-                <w:rFonts w:ascii="DM Mono" w:eastAsia="Aptos" w:hAnsi="DM Mono"/>
-                <w:sz w:val="18"/>
-                <w:szCs w:val="18"/>
-              </w:rPr>
-              <w:t xml:space="preserve"> streaming as a viable form of marketing.</w:t>
+              <w:t>I like the clear UI displaying the health of each fighter, this makes it easy to quickly gauge the opponent’s strength mid-fight. Consequently, the game is easier to read, meaning that it could be more accessible to an external audience. This opens up streaming as a viable form of marketing.</w:t>
             </w:r>
           </w:p>
         </w:tc>
@@ -672,23 +510,13 @@
                 <w:szCs w:val="18"/>
               </w:rPr>
             </w:pPr>
-            <w:proofErr w:type="gramStart"/>
             <w:r>
               <w:rPr>
                 <w:rFonts w:ascii="DM Mono" w:eastAsia="Aptos" w:hAnsi="DM Mono"/>
                 <w:sz w:val="18"/>
                 <w:szCs w:val="18"/>
               </w:rPr>
-              <w:t>I’m</w:t>
-            </w:r>
-            <w:proofErr w:type="gramEnd"/>
-            <w:r>
-              <w:rPr>
-                <w:rFonts w:ascii="DM Mono" w:eastAsia="Aptos" w:hAnsi="DM Mono"/>
-                <w:sz w:val="18"/>
-                <w:szCs w:val="18"/>
-              </w:rPr>
-              <w:t xml:space="preserve"> not a fan of the difficult colour scheme, making it difficult to interpret. This hinders the user’s ability to interpret the given information. Furthermore, it might harm the ability for visually challenged people to enjoy any content produced with it.</w:t>
+              <w:t>I’m not a fan of the difficult colour scheme, making it difficult to interpret. This hinders the user’s ability to interpret the given information. Furthermore, it might harm the ability for visually challenged people to enjoy any content produced with it.</w:t>
             </w:r>
           </w:p>
         </w:tc>
@@ -1504,43 +1332,7 @@
                 <w:sz w:val="18"/>
                 <w:szCs w:val="18"/>
               </w:rPr>
-              <w:t xml:space="preserve">I am </w:t>
-            </w:r>
-            <w:proofErr w:type="gramStart"/>
-            <w:r>
-              <w:rPr>
-                <w:rFonts w:ascii="DM Mono" w:eastAsia="Aptos" w:hAnsi="DM Mono"/>
-                <w:sz w:val="18"/>
-                <w:szCs w:val="18"/>
-              </w:rPr>
-              <w:t>a big fan</w:t>
-            </w:r>
-            <w:proofErr w:type="gramEnd"/>
-            <w:r>
-              <w:rPr>
-                <w:rFonts w:ascii="DM Mono" w:eastAsia="Aptos" w:hAnsi="DM Mono"/>
-                <w:sz w:val="18"/>
-                <w:szCs w:val="18"/>
-              </w:rPr>
-              <w:t xml:space="preserve"> of the chevron above the player’s head. This would make the game easier to play by reducing the risk of confusion. Resultantly, consumers </w:t>
-            </w:r>
-            <w:proofErr w:type="gramStart"/>
-            <w:r>
-              <w:rPr>
-                <w:rFonts w:ascii="DM Mono" w:eastAsia="Aptos" w:hAnsi="DM Mono"/>
-                <w:sz w:val="18"/>
-                <w:szCs w:val="18"/>
-              </w:rPr>
-              <w:t>are able to</w:t>
-            </w:r>
-            <w:proofErr w:type="gramEnd"/>
-            <w:r>
-              <w:rPr>
-                <w:rFonts w:ascii="DM Mono" w:eastAsia="Aptos" w:hAnsi="DM Mono"/>
-                <w:sz w:val="18"/>
-                <w:szCs w:val="18"/>
-              </w:rPr>
-              <w:t xml:space="preserve"> pick up the game faster and invest more time in it.</w:t>
+              <w:t>I am a big fan of the chevron above the player’s head. This would make the game easier to play by reducing the risk of confusion. Resultantly, consumers are able to pick up the game faster and invest more time in it.</w:t>
             </w:r>
           </w:p>
         </w:tc>
@@ -1609,25 +1401,7 @@
                 <w:sz w:val="18"/>
                 <w:szCs w:val="18"/>
               </w:rPr>
-              <w:t xml:space="preserve">The cohesion between the ground and background leads to a </w:t>
-            </w:r>
-            <w:proofErr w:type="gramStart"/>
-            <w:r>
-              <w:rPr>
-                <w:rFonts w:ascii="DM Mono" w:eastAsia="Aptos" w:hAnsi="DM Mono"/>
-                <w:sz w:val="18"/>
-                <w:szCs w:val="18"/>
-              </w:rPr>
-              <w:t>seemingly better</w:t>
-            </w:r>
-            <w:proofErr w:type="gramEnd"/>
-            <w:r>
-              <w:rPr>
-                <w:rFonts w:ascii="DM Mono" w:eastAsia="Aptos" w:hAnsi="DM Mono"/>
-                <w:sz w:val="18"/>
-                <w:szCs w:val="18"/>
-              </w:rPr>
-              <w:t xml:space="preserve"> designed product. This has been known to increase user acceptance rates and so I will aim to have the same.</w:t>
+              <w:t>The cohesion between the ground and background leads to a seemingly better designed product. This has been known to increase user acceptance rates and so I will aim to have the same.</w:t>
             </w:r>
           </w:p>
         </w:tc>
@@ -1677,43 +1451,7 @@
                 <w:sz w:val="18"/>
                 <w:szCs w:val="18"/>
               </w:rPr>
-              <w:t xml:space="preserve"> I to implement it, there would not, at current state of planning, be </w:t>
-            </w:r>
-            <w:proofErr w:type="gramStart"/>
-            <w:r>
-              <w:rPr>
-                <w:rFonts w:ascii="DM Mono" w:eastAsia="Aptos" w:hAnsi="DM Mono"/>
-                <w:sz w:val="18"/>
-                <w:szCs w:val="18"/>
-              </w:rPr>
-              <w:t>many</w:t>
-            </w:r>
-            <w:proofErr w:type="gramEnd"/>
-            <w:r>
-              <w:rPr>
-                <w:rFonts w:ascii="DM Mono" w:eastAsia="Aptos" w:hAnsi="DM Mono"/>
-                <w:sz w:val="18"/>
-                <w:szCs w:val="18"/>
-              </w:rPr>
-              <w:t xml:space="preserve"> options of use. </w:t>
-            </w:r>
-            <w:proofErr w:type="gramStart"/>
-            <w:r>
-              <w:rPr>
-                <w:rFonts w:ascii="DM Mono" w:eastAsia="Aptos" w:hAnsi="DM Mono"/>
-                <w:sz w:val="18"/>
-                <w:szCs w:val="18"/>
-              </w:rPr>
-              <w:t>Thus</w:t>
-            </w:r>
-            <w:proofErr w:type="gramEnd"/>
-            <w:r>
-              <w:rPr>
-                <w:rFonts w:ascii="DM Mono" w:eastAsia="Aptos" w:hAnsi="DM Mono"/>
-                <w:sz w:val="18"/>
-                <w:szCs w:val="18"/>
-              </w:rPr>
-              <w:t xml:space="preserve"> I have decided that it is an unnecessary feature which causes conflict with the core mechanics of the game.</w:t>
+              <w:t xml:space="preserve"> I to implement it, there would not, at current state of planning, be many options of use. Thus I have decided that it is an unnecessary feature which causes conflict with the core mechanics of the game.</w:t>
             </w:r>
           </w:p>
         </w:tc>
@@ -2003,61 +1741,7 @@
           <w:sz w:val="20"/>
           <w:szCs w:val="20"/>
         </w:rPr>
-        <w:t xml:space="preserve">My stake holders would </w:t>
-      </w:r>
-      <w:proofErr w:type="gramStart"/>
-      <w:r>
-        <w:rPr>
-          <w:rFonts w:ascii="DM Mono" w:hAnsi="DM Mono"/>
-          <w:sz w:val="20"/>
-          <w:szCs w:val="20"/>
-        </w:rPr>
-        <w:t>likely be</w:t>
-      </w:r>
-      <w:proofErr w:type="gramEnd"/>
-      <w:r>
-        <w:rPr>
-          <w:rFonts w:ascii="DM Mono" w:hAnsi="DM Mono"/>
-          <w:sz w:val="20"/>
-          <w:szCs w:val="20"/>
-        </w:rPr>
-        <w:t xml:space="preserve"> teenagers interested in computer science, between 14 and 19. This is because my research and experience </w:t>
-      </w:r>
-      <w:proofErr w:type="gramStart"/>
-      <w:r>
-        <w:rPr>
-          <w:rFonts w:ascii="DM Mono" w:hAnsi="DM Mono"/>
-          <w:sz w:val="20"/>
-          <w:szCs w:val="20"/>
-        </w:rPr>
-        <w:t>shows</w:t>
-      </w:r>
-      <w:proofErr w:type="gramEnd"/>
-      <w:r>
-        <w:rPr>
-          <w:rFonts w:ascii="DM Mono" w:hAnsi="DM Mono"/>
-          <w:sz w:val="20"/>
-          <w:szCs w:val="20"/>
-        </w:rPr>
-        <w:t xml:space="preserve"> that this demographic is the most likely to be engaged with similar media. Furthermore, this group tend to be socially active in both real life and online. This level of communication can be capitalised on for easier marketing. Subsequently, I will survey this demographic </w:t>
-      </w:r>
-      <w:proofErr w:type="gramStart"/>
-      <w:r>
-        <w:rPr>
-          <w:rFonts w:ascii="DM Mono" w:hAnsi="DM Mono"/>
-          <w:sz w:val="20"/>
-          <w:szCs w:val="20"/>
-        </w:rPr>
-        <w:t>in order to</w:t>
-      </w:r>
-      <w:proofErr w:type="gramEnd"/>
-      <w:r>
-        <w:rPr>
-          <w:rFonts w:ascii="DM Mono" w:hAnsi="DM Mono"/>
-          <w:sz w:val="20"/>
-          <w:szCs w:val="20"/>
-        </w:rPr>
-        <w:t xml:space="preserve"> determine features and implementations which may be successful and desirable in this game.</w:t>
+        <w:t>My stake holders would likely be teenagers interested in computer science, between 14 and 19. This is because my research and experience shows that this demographic is the most likely to be engaged with similar media. Furthermore, this group tend to be socially active in both real life and online. This level of communication can be capitalised on for easier marketing. Subsequently, I will survey this demographic in order to determine features and implementations which may be successful and desirable in this game.</w:t>
       </w:r>
     </w:p>
     <w:p>
@@ -2077,25 +1761,7 @@
           <w:sz w:val="20"/>
           <w:szCs w:val="20"/>
         </w:rPr>
-        <w:t xml:space="preserve">I believe that my player base will be making greatest use of this product in their free time after education hours. As such, I will aim to make each experience succinct </w:t>
-      </w:r>
-      <w:proofErr w:type="gramStart"/>
-      <w:r>
-        <w:rPr>
-          <w:rFonts w:ascii="DM Mono" w:hAnsi="DM Mono"/>
-          <w:sz w:val="20"/>
-          <w:szCs w:val="20"/>
-        </w:rPr>
-        <w:t>in order to</w:t>
-      </w:r>
-      <w:proofErr w:type="gramEnd"/>
-      <w:r>
-        <w:rPr>
-          <w:rFonts w:ascii="DM Mono" w:hAnsi="DM Mono"/>
-          <w:sz w:val="20"/>
-          <w:szCs w:val="20"/>
-        </w:rPr>
-        <w:t xml:space="preserve"> support a user’s requirement of homework. Longer games can feel like a greater commitment to play and so are not as popular during this targeted time window.</w:t>
+        <w:t>I believe that my player base will be making greatest use of this product in their free time after education hours. As such, I will aim to make each experience succinct in order to support a user’s requirement of homework. Longer games can feel like a greater commitment to play and so are not as popular during this targeted time window.</w:t>
       </w:r>
     </w:p>
     <w:p>
@@ -2115,25 +1781,7 @@
           <w:sz w:val="20"/>
           <w:szCs w:val="20"/>
         </w:rPr>
-        <w:t xml:space="preserve">I aim to include my stake holders in this process </w:t>
-      </w:r>
-      <w:proofErr w:type="gramStart"/>
-      <w:r>
-        <w:rPr>
-          <w:rFonts w:ascii="DM Mono" w:hAnsi="DM Mono"/>
-          <w:sz w:val="20"/>
-          <w:szCs w:val="20"/>
-        </w:rPr>
-        <w:t>in order to</w:t>
-      </w:r>
-      <w:proofErr w:type="gramEnd"/>
-      <w:r>
-        <w:rPr>
-          <w:rFonts w:ascii="DM Mono" w:hAnsi="DM Mono"/>
-          <w:sz w:val="20"/>
-          <w:szCs w:val="20"/>
-        </w:rPr>
-        <w:t xml:space="preserve"> maintain a high fidelity to the desired concept and functionality. </w:t>
+        <w:t xml:space="preserve">I aim to include my stake holders in this process in order to maintain a high fidelity to the desired concept and functionality. </w:t>
       </w:r>
     </w:p>
     <w:p>
@@ -2335,29 +1983,7 @@
           <w:sz w:val="20"/>
           <w:szCs w:val="20"/>
         </w:rPr>
-        <w:t xml:space="preserve">On a scale from 1-&gt;10, how </w:t>
-      </w:r>
-      <w:proofErr w:type="gramStart"/>
-      <w:r>
-        <w:rPr>
-          <w:rFonts w:ascii="DM Mono" w:hAnsi="DM Mono"/>
-          <w:b/>
-          <w:bCs/>
-          <w:sz w:val="20"/>
-          <w:szCs w:val="20"/>
-        </w:rPr>
-        <w:t>much</w:t>
-      </w:r>
-      <w:proofErr w:type="gramEnd"/>
-      <w:r>
-        <w:rPr>
-          <w:rFonts w:ascii="DM Mono" w:hAnsi="DM Mono"/>
-          <w:b/>
-          <w:bCs/>
-          <w:sz w:val="20"/>
-          <w:szCs w:val="20"/>
-        </w:rPr>
-        <w:t xml:space="preserve"> would you desire two or more moves?</w:t>
+        <w:t>On a scale from 1-&gt;10, how much would you desire two or more moves?</w:t>
       </w:r>
     </w:p>
     <w:p>
@@ -2426,25 +2052,7 @@
           <w:sz w:val="20"/>
           <w:szCs w:val="20"/>
         </w:rPr>
-        <w:t xml:space="preserve">This shows a high demand for the ability to use multiple different attacks. I am grateful for this result since this feature was one which I envisaged in the game, making it fully engaging. Following this result, I shall make this a priority. I can see how this would </w:t>
-      </w:r>
-      <w:proofErr w:type="gramStart"/>
-      <w:r>
-        <w:rPr>
-          <w:rFonts w:ascii="DM Mono" w:hAnsi="DM Mono"/>
-          <w:sz w:val="20"/>
-          <w:szCs w:val="20"/>
-        </w:rPr>
-        <w:t>largely impact</w:t>
-      </w:r>
-      <w:proofErr w:type="gramEnd"/>
-      <w:r>
-        <w:rPr>
-          <w:rFonts w:ascii="DM Mono" w:hAnsi="DM Mono"/>
-          <w:sz w:val="20"/>
-          <w:szCs w:val="20"/>
-        </w:rPr>
-        <w:t xml:space="preserve"> the game and make it more exciting to play.</w:t>
+        <w:t>This shows a high demand for the ability to use multiple different attacks. I am grateful for this result since this feature was one which I envisaged in the game, making it fully engaging. Following this result, I shall make this a priority. I can see how this would largely impact the game and make it more exciting to play.</w:t>
       </w:r>
     </w:p>
     <w:p>
@@ -2474,29 +2082,7 @@
           <w:sz w:val="20"/>
           <w:szCs w:val="20"/>
         </w:rPr>
-        <w:t xml:space="preserve">On a scale from 1-&gt;10, how </w:t>
-      </w:r>
-      <w:proofErr w:type="gramStart"/>
-      <w:r>
-        <w:rPr>
-          <w:rFonts w:ascii="DM Mono" w:hAnsi="DM Mono"/>
-          <w:b/>
-          <w:bCs/>
-          <w:sz w:val="20"/>
-          <w:szCs w:val="20"/>
-        </w:rPr>
-        <w:t>much</w:t>
-      </w:r>
-      <w:proofErr w:type="gramEnd"/>
-      <w:r>
-        <w:rPr>
-          <w:rFonts w:ascii="DM Mono" w:hAnsi="DM Mono"/>
-          <w:b/>
-          <w:bCs/>
-          <w:sz w:val="20"/>
-          <w:szCs w:val="20"/>
-        </w:rPr>
-        <w:t xml:space="preserve"> would you desire enemies varying in size and strength?</w:t>
+        <w:t>On a scale from 1-&gt;10, how much would you desire enemies varying in size and strength?</w:t>
       </w:r>
     </w:p>
     <w:p>
@@ -2566,25 +2152,7 @@
           <w:sz w:val="20"/>
           <w:szCs w:val="20"/>
         </w:rPr>
-        <w:t xml:space="preserve">As one of the highest rated ideas, this would be a priority for the game. It would make the whole environment feel more alive, with a perceived challenge that could </w:t>
-      </w:r>
-      <w:proofErr w:type="gramStart"/>
-      <w:r>
-        <w:rPr>
-          <w:rFonts w:ascii="DM Mono" w:hAnsi="DM Mono"/>
-          <w:sz w:val="20"/>
-          <w:szCs w:val="20"/>
-        </w:rPr>
-        <w:t>be easily implemented</w:t>
-      </w:r>
-      <w:proofErr w:type="gramEnd"/>
-      <w:r>
-        <w:rPr>
-          <w:rFonts w:ascii="DM Mono" w:hAnsi="DM Mono"/>
-          <w:sz w:val="20"/>
-          <w:szCs w:val="20"/>
-        </w:rPr>
-        <w:t>.</w:t>
+        <w:t>As one of the highest rated ideas, this would be a priority for the game. It would make the whole environment feel more alive, with a perceived challenge that could be easily implemented.</w:t>
       </w:r>
     </w:p>
     <w:p>
@@ -2614,29 +2182,7 @@
           <w:sz w:val="20"/>
           <w:szCs w:val="20"/>
         </w:rPr>
-        <w:t xml:space="preserve">On a scale from 1-&gt;10, how </w:t>
-      </w:r>
-      <w:proofErr w:type="gramStart"/>
-      <w:r>
-        <w:rPr>
-          <w:rFonts w:ascii="DM Mono" w:hAnsi="DM Mono"/>
-          <w:b/>
-          <w:bCs/>
-          <w:sz w:val="20"/>
-          <w:szCs w:val="20"/>
-        </w:rPr>
-        <w:t>much</w:t>
-      </w:r>
-      <w:proofErr w:type="gramEnd"/>
-      <w:r>
-        <w:rPr>
-          <w:rFonts w:ascii="DM Mono" w:hAnsi="DM Mono"/>
-          <w:b/>
-          <w:bCs/>
-          <w:sz w:val="20"/>
-          <w:szCs w:val="20"/>
-        </w:rPr>
-        <w:t xml:space="preserve"> would you desire fighting two or more enemies simultaneously? </w:t>
+        <w:t>On a scale from 1-&gt;10, how much would you desire fighting two or more enemies simultaneously? </w:t>
       </w:r>
     </w:p>
     <w:p>
@@ -2706,25 +2252,7 @@
           <w:sz w:val="20"/>
           <w:szCs w:val="20"/>
         </w:rPr>
-        <w:t xml:space="preserve">This shows a fortunate lack of demand for fighting multiple enemies. I can gauge from this that it is far from </w:t>
-      </w:r>
-      <w:proofErr w:type="gramStart"/>
-      <w:r>
-        <w:rPr>
-          <w:rFonts w:ascii="DM Mono" w:hAnsi="DM Mono"/>
-          <w:sz w:val="20"/>
-          <w:szCs w:val="20"/>
-        </w:rPr>
-        <w:t>an the</w:t>
-      </w:r>
-      <w:proofErr w:type="gramEnd"/>
-      <w:r>
-        <w:rPr>
-          <w:rFonts w:ascii="DM Mono" w:hAnsi="DM Mono"/>
-          <w:sz w:val="20"/>
-          <w:szCs w:val="20"/>
-        </w:rPr>
-        <w:t xml:space="preserve"> essential feature, and consequentially I shall not list it as a requirement for this game.</w:t>
+        <w:t>This shows a fortunate lack of demand for fighting multiple enemies. I can gauge from this that it is far from an the essential feature, and consequentially I shall not list it as a requirement for this game.</w:t>
       </w:r>
     </w:p>
     <w:p>
@@ -2754,29 +2282,7 @@
           <w:sz w:val="20"/>
           <w:szCs w:val="20"/>
         </w:rPr>
-        <w:t xml:space="preserve">On a scale from 1-&gt;10, how </w:t>
-      </w:r>
-      <w:proofErr w:type="gramStart"/>
-      <w:r>
-        <w:rPr>
-          <w:rFonts w:ascii="DM Mono" w:hAnsi="DM Mono"/>
-          <w:b/>
-          <w:bCs/>
-          <w:sz w:val="20"/>
-          <w:szCs w:val="20"/>
-        </w:rPr>
-        <w:t>much</w:t>
-      </w:r>
-      <w:proofErr w:type="gramEnd"/>
-      <w:r>
-        <w:rPr>
-          <w:rFonts w:ascii="DM Mono" w:hAnsi="DM Mono"/>
-          <w:b/>
-          <w:bCs/>
-          <w:sz w:val="20"/>
-          <w:szCs w:val="20"/>
-        </w:rPr>
-        <w:t xml:space="preserve"> would you desire combo moves?</w:t>
+        <w:t>On a scale from 1-&gt;10, how much would you desire combo moves?</w:t>
       </w:r>
     </w:p>
     <w:p>
@@ -2881,29 +2387,7 @@
           <w:sz w:val="20"/>
           <w:szCs w:val="20"/>
         </w:rPr>
-        <w:t xml:space="preserve">On a scale from 1-&gt;10, how </w:t>
-      </w:r>
-      <w:proofErr w:type="gramStart"/>
-      <w:r>
-        <w:rPr>
-          <w:rFonts w:ascii="DM Mono" w:hAnsi="DM Mono"/>
-          <w:b/>
-          <w:bCs/>
-          <w:sz w:val="20"/>
-          <w:szCs w:val="20"/>
-        </w:rPr>
-        <w:t>much</w:t>
-      </w:r>
-      <w:proofErr w:type="gramEnd"/>
-      <w:r>
-        <w:rPr>
-          <w:rFonts w:ascii="DM Mono" w:hAnsi="DM Mono"/>
-          <w:b/>
-          <w:bCs/>
-          <w:sz w:val="20"/>
-          <w:szCs w:val="20"/>
-        </w:rPr>
-        <w:t xml:space="preserve"> would you desire character customisation?</w:t>
+        <w:t>On a scale from 1-&gt;10, how much would you desire character customisation?</w:t>
       </w:r>
     </w:p>
     <w:p>
@@ -3003,29 +2487,7 @@
           <w:sz w:val="20"/>
           <w:szCs w:val="20"/>
         </w:rPr>
-        <w:t xml:space="preserve">On a scale from 1-&gt;10, how </w:t>
-      </w:r>
-      <w:proofErr w:type="gramStart"/>
-      <w:r>
-        <w:rPr>
-          <w:rFonts w:ascii="DM Mono" w:hAnsi="DM Mono"/>
-          <w:b/>
-          <w:bCs/>
-          <w:sz w:val="20"/>
-          <w:szCs w:val="20"/>
-        </w:rPr>
-        <w:t>much</w:t>
-      </w:r>
-      <w:proofErr w:type="gramEnd"/>
-      <w:r>
-        <w:rPr>
-          <w:rFonts w:ascii="DM Mono" w:hAnsi="DM Mono"/>
-          <w:b/>
-          <w:bCs/>
-          <w:sz w:val="20"/>
-          <w:szCs w:val="20"/>
-        </w:rPr>
-        <w:t xml:space="preserve"> would you desire exponential knockback?</w:t>
+        <w:t>On a scale from 1-&gt;10, how much would you desire exponential knockback?</w:t>
       </w:r>
     </w:p>
     <w:p>
@@ -3125,29 +2587,7 @@
           <w:sz w:val="20"/>
           <w:szCs w:val="20"/>
         </w:rPr>
-        <w:t xml:space="preserve">On a scale from 1-&gt;10, how </w:t>
-      </w:r>
-      <w:proofErr w:type="gramStart"/>
-      <w:r>
-        <w:rPr>
-          <w:rFonts w:ascii="DM Mono" w:hAnsi="DM Mono"/>
-          <w:b/>
-          <w:bCs/>
-          <w:sz w:val="20"/>
-          <w:szCs w:val="20"/>
-        </w:rPr>
-        <w:t>much</w:t>
-      </w:r>
-      <w:proofErr w:type="gramEnd"/>
-      <w:r>
-        <w:rPr>
-          <w:rFonts w:ascii="DM Mono" w:hAnsi="DM Mono"/>
-          <w:b/>
-          <w:bCs/>
-          <w:sz w:val="20"/>
-          <w:szCs w:val="20"/>
-        </w:rPr>
-        <w:t xml:space="preserve"> would you desire the use of environmental props? </w:t>
+        <w:t>On a scale from 1-&gt;10, how much would you desire the use of environmental props? </w:t>
       </w:r>
     </w:p>
     <w:p>
@@ -3217,43 +2657,7 @@
           <w:sz w:val="20"/>
           <w:szCs w:val="20"/>
         </w:rPr>
-        <w:t xml:space="preserve">As a </w:t>
-      </w:r>
-      <w:proofErr w:type="gramStart"/>
-      <w:r>
-        <w:rPr>
-          <w:rFonts w:ascii="DM Mono" w:hAnsi="DM Mono"/>
-          <w:sz w:val="20"/>
-          <w:szCs w:val="20"/>
-        </w:rPr>
-        <w:t>relatively highly</w:t>
-      </w:r>
-      <w:proofErr w:type="gramEnd"/>
-      <w:r>
-        <w:rPr>
-          <w:rFonts w:ascii="DM Mono" w:hAnsi="DM Mono"/>
-          <w:sz w:val="20"/>
-          <w:szCs w:val="20"/>
-        </w:rPr>
-        <w:t xml:space="preserve"> requested addition, this would be </w:t>
-      </w:r>
-      <w:proofErr w:type="gramStart"/>
-      <w:r>
-        <w:rPr>
-          <w:rFonts w:ascii="DM Mono" w:hAnsi="DM Mono"/>
-          <w:sz w:val="20"/>
-          <w:szCs w:val="20"/>
-        </w:rPr>
-        <w:t>very nice</w:t>
-      </w:r>
-      <w:proofErr w:type="gramEnd"/>
-      <w:r>
-        <w:rPr>
-          <w:rFonts w:ascii="DM Mono" w:hAnsi="DM Mono"/>
-          <w:sz w:val="20"/>
-          <w:szCs w:val="20"/>
-        </w:rPr>
-        <w:t xml:space="preserve"> to add. It would mesh the background and environment with the player and enemy, creating a worthy cohesion. This would also give the game a unique selling point and further separate it from competition.</w:t>
+        <w:t>As a relatively highly requested addition, this would be very nice to add. It would mesh the background and environment with the player and enemy, creating a worthy cohesion. This would also give the game a unique selling point and further separate it from competition.</w:t>
       </w:r>
     </w:p>
     <w:p>
@@ -3283,29 +2687,7 @@
           <w:sz w:val="20"/>
           <w:szCs w:val="20"/>
         </w:rPr>
-        <w:t xml:space="preserve">On a scale from 1-&gt;10, how </w:t>
-      </w:r>
-      <w:proofErr w:type="gramStart"/>
-      <w:r>
-        <w:rPr>
-          <w:rFonts w:ascii="DM Mono" w:hAnsi="DM Mono"/>
-          <w:b/>
-          <w:bCs/>
-          <w:sz w:val="20"/>
-          <w:szCs w:val="20"/>
-        </w:rPr>
-        <w:t>much</w:t>
-      </w:r>
-      <w:proofErr w:type="gramEnd"/>
-      <w:r>
-        <w:rPr>
-          <w:rFonts w:ascii="DM Mono" w:hAnsi="DM Mono"/>
-          <w:b/>
-          <w:bCs/>
-          <w:sz w:val="20"/>
-          <w:szCs w:val="20"/>
-        </w:rPr>
-        <w:t xml:space="preserve"> would you desire enemies with varying reaction times?</w:t>
+        <w:t>On a scale from 1-&gt;10, how much would you desire enemies with varying reaction times?</w:t>
       </w:r>
     </w:p>
     <w:p>
@@ -3375,25 +2757,7 @@
           <w:sz w:val="20"/>
           <w:szCs w:val="20"/>
         </w:rPr>
-        <w:t xml:space="preserve">As another vehemently requested feature, this would be an interesting addition to the game, making it feel more challenging and having better scaling. This number could </w:t>
-      </w:r>
-      <w:proofErr w:type="gramStart"/>
-      <w:r>
-        <w:rPr>
-          <w:rFonts w:ascii="DM Mono" w:hAnsi="DM Mono"/>
-          <w:sz w:val="20"/>
-          <w:szCs w:val="20"/>
-        </w:rPr>
-        <w:t>be tweaked</w:t>
-      </w:r>
-      <w:proofErr w:type="gramEnd"/>
-      <w:r>
-        <w:rPr>
-          <w:rFonts w:ascii="DM Mono" w:hAnsi="DM Mono"/>
-          <w:sz w:val="20"/>
-          <w:szCs w:val="20"/>
-        </w:rPr>
-        <w:t xml:space="preserve"> also so that the further the player can progress in the game, the harder the enemies become to face. </w:t>
+        <w:t xml:space="preserve">As another vehemently requested feature, this would be an interesting addition to the game, making it feel more challenging and having better scaling. This number could be tweaked also so that the further the player can progress in the game, the harder the enemies become to face. </w:t>
       </w:r>
     </w:p>
     <w:p>
@@ -3704,25 +3068,7 @@
                 <w:sz w:val="16"/>
                 <w:szCs w:val="16"/>
               </w:rPr>
-              <w:t xml:space="preserve">Varying Attacks </w:t>
-            </w:r>
-            <w:proofErr w:type="gramStart"/>
-            <w:r>
-              <w:rPr>
-                <w:rFonts w:ascii="DM Mono" w:eastAsia="Aptos" w:hAnsi="DM Mono"/>
-                <w:sz w:val="16"/>
-                <w:szCs w:val="16"/>
-              </w:rPr>
-              <w:t>With</w:t>
-            </w:r>
-            <w:proofErr w:type="gramEnd"/>
-            <w:r>
-              <w:rPr>
-                <w:rFonts w:ascii="DM Mono" w:eastAsia="Aptos" w:hAnsi="DM Mono"/>
-                <w:sz w:val="16"/>
-                <w:szCs w:val="16"/>
-              </w:rPr>
-              <w:t xml:space="preserve"> Primary Attack Button</w:t>
+              <w:t>Varying Attacks With Primary Attack Button</w:t>
             </w:r>
           </w:p>
         </w:tc>
@@ -3768,71 +3114,35 @@
                 <w:sz w:val="16"/>
                 <w:szCs w:val="16"/>
               </w:rPr>
-              <w:t xml:space="preserve">This would encourage longer engagements which could be challengingly risky. This would add a level of difficulty to engage the player. Finally, it is a </w:t>
-            </w:r>
-            <w:proofErr w:type="gramStart"/>
-            <w:r>
-              <w:rPr>
-                <w:rFonts w:ascii="DM Mono" w:eastAsia="Aptos" w:hAnsi="DM Mono"/>
-                <w:sz w:val="16"/>
-                <w:szCs w:val="16"/>
-              </w:rPr>
-              <w:t>greatly requested</w:t>
-            </w:r>
-            <w:proofErr w:type="gramEnd"/>
-            <w:r>
-              <w:rPr>
-                <w:rFonts w:ascii="DM Mono" w:eastAsia="Aptos" w:hAnsi="DM Mono"/>
-                <w:sz w:val="16"/>
-                <w:szCs w:val="16"/>
-              </w:rPr>
-              <w:t xml:space="preserve"> feature and would please stakeholders with its addition.</w:t>
-            </w:r>
-          </w:p>
-          <w:p>
-            <w:pPr>
-              <w:spacing w:after="0" w:line="240" w:lineRule="auto"/>
-              <w:rPr>
-                <w:rFonts w:ascii="DM Mono" w:eastAsia="Aptos" w:hAnsi="DM Mono"/>
-                <w:sz w:val="16"/>
-                <w:szCs w:val="16"/>
-              </w:rPr>
-            </w:pPr>
-          </w:p>
-          <w:p>
-            <w:pPr>
-              <w:spacing w:after="0" w:line="240" w:lineRule="auto"/>
-              <w:rPr>
-                <w:rFonts w:ascii="DM Mono" w:hAnsi="DM Mono"/>
-                <w:sz w:val="16"/>
-                <w:szCs w:val="16"/>
-              </w:rPr>
-            </w:pPr>
-            <w:r>
-              <w:rPr>
-                <w:rFonts w:ascii="DM Mono" w:hAnsi="DM Mono"/>
-                <w:sz w:val="16"/>
-                <w:szCs w:val="16"/>
-              </w:rPr>
-              <w:t xml:space="preserve">It is also </w:t>
-            </w:r>
-            <w:proofErr w:type="gramStart"/>
-            <w:r>
-              <w:rPr>
-                <w:rFonts w:ascii="DM Mono" w:hAnsi="DM Mono"/>
-                <w:sz w:val="16"/>
-                <w:szCs w:val="16"/>
-              </w:rPr>
-              <w:t>measurable, since</w:t>
-            </w:r>
-            <w:proofErr w:type="gramEnd"/>
-            <w:r>
-              <w:rPr>
-                <w:rFonts w:ascii="DM Mono" w:hAnsi="DM Mono"/>
-                <w:sz w:val="16"/>
-                <w:szCs w:val="16"/>
-              </w:rPr>
-              <w:t xml:space="preserve"> it is </w:t>
+              <w:t>This would encourage longer engagements which could be challengingly risky. This would add a level of difficulty to engage the player. Finally, it is a greatly requested feature and would please stakeholders with its addition.</w:t>
+            </w:r>
+          </w:p>
+          <w:p>
+            <w:pPr>
+              <w:spacing w:after="0" w:line="240" w:lineRule="auto"/>
+              <w:rPr>
+                <w:rFonts w:ascii="DM Mono" w:eastAsia="Aptos" w:hAnsi="DM Mono"/>
+                <w:sz w:val="16"/>
+                <w:szCs w:val="16"/>
+              </w:rPr>
+            </w:pPr>
+          </w:p>
+          <w:p>
+            <w:pPr>
+              <w:spacing w:after="0" w:line="240" w:lineRule="auto"/>
+              <w:rPr>
+                <w:rFonts w:ascii="DM Mono" w:hAnsi="DM Mono"/>
+                <w:sz w:val="16"/>
+                <w:szCs w:val="16"/>
+              </w:rPr>
+            </w:pPr>
+            <w:r>
+              <w:rPr>
+                <w:rFonts w:ascii="DM Mono" w:hAnsi="DM Mono"/>
+                <w:sz w:val="16"/>
+                <w:szCs w:val="16"/>
+              </w:rPr>
+              <w:t xml:space="preserve">It is also measurable, since it is </w:t>
             </w:r>
             <w:r>
               <w:rPr>
@@ -3841,25 +3151,7 @@
                 <w:szCs w:val="16"/>
               </w:rPr>
               <w:lastRenderedPageBreak/>
-              <w:t xml:space="preserve">binary in whether it is or </w:t>
-            </w:r>
-            <w:proofErr w:type="gramStart"/>
-            <w:r>
-              <w:rPr>
-                <w:rFonts w:ascii="DM Mono" w:hAnsi="DM Mono"/>
-                <w:sz w:val="16"/>
-                <w:szCs w:val="16"/>
-              </w:rPr>
-              <w:t>isn’t</w:t>
-            </w:r>
-            <w:proofErr w:type="gramEnd"/>
-            <w:r>
-              <w:rPr>
-                <w:rFonts w:ascii="DM Mono" w:hAnsi="DM Mono"/>
-                <w:sz w:val="16"/>
-                <w:szCs w:val="16"/>
-              </w:rPr>
-              <w:t xml:space="preserve"> implemented.</w:t>
+              <w:t>binary in whether it is or isn’t implemented.</w:t>
             </w:r>
           </w:p>
         </w:tc>
@@ -4004,36 +3296,8 @@
                 <w:sz w:val="16"/>
                 <w:szCs w:val="16"/>
               </w:rPr>
-              <w:t xml:space="preserve">Upon entering multiple inputs sequentially, a different attack </w:t>
-            </w:r>
-            <w:proofErr w:type="gramStart"/>
-            <w:r>
-              <w:rPr>
-                <w:rFonts w:ascii="DM Mono" w:eastAsia="Aptos" w:hAnsi="DM Mono"/>
-                <w:sz w:val="16"/>
-                <w:szCs w:val="16"/>
-              </w:rPr>
-              <w:t>is shown</w:t>
-            </w:r>
-            <w:proofErr w:type="gramEnd"/>
-            <w:r>
-              <w:rPr>
-                <w:rFonts w:ascii="DM Mono" w:eastAsia="Aptos" w:hAnsi="DM Mono"/>
-                <w:sz w:val="16"/>
-                <w:szCs w:val="16"/>
-              </w:rPr>
-              <w:t xml:space="preserve"> with different attributes for knockback, damage, </w:t>
-            </w:r>
-            <w:proofErr w:type="gramStart"/>
-            <w:r>
-              <w:rPr>
-                <w:rFonts w:ascii="DM Mono" w:eastAsia="Aptos" w:hAnsi="DM Mono"/>
-                <w:sz w:val="16"/>
-                <w:szCs w:val="16"/>
-              </w:rPr>
-              <w:t>etc.</w:t>
-            </w:r>
-            <w:proofErr w:type="gramEnd"/>
+              <w:t>Upon entering multiple inputs sequentially, a different attack is shown with different attributes for knockback, damage, etc.</w:t>
+            </w:r>
           </w:p>
         </w:tc>
         <w:tc>
@@ -4450,43 +3714,7 @@
                 <w:sz w:val="16"/>
                 <w:szCs w:val="16"/>
               </w:rPr>
-              <w:t xml:space="preserve">It is also </w:t>
-            </w:r>
-            <w:proofErr w:type="gramStart"/>
-            <w:r>
-              <w:rPr>
-                <w:rFonts w:ascii="DM Mono" w:hAnsi="DM Mono"/>
-                <w:sz w:val="16"/>
-                <w:szCs w:val="16"/>
-              </w:rPr>
-              <w:t>measurable, since</w:t>
-            </w:r>
-            <w:proofErr w:type="gramEnd"/>
-            <w:r>
-              <w:rPr>
-                <w:rFonts w:ascii="DM Mono" w:hAnsi="DM Mono"/>
-                <w:sz w:val="16"/>
-                <w:szCs w:val="16"/>
-              </w:rPr>
-              <w:t xml:space="preserve"> it is binary in whether it is or </w:t>
-            </w:r>
-            <w:proofErr w:type="gramStart"/>
-            <w:r>
-              <w:rPr>
-                <w:rFonts w:ascii="DM Mono" w:hAnsi="DM Mono"/>
-                <w:sz w:val="16"/>
-                <w:szCs w:val="16"/>
-              </w:rPr>
-              <w:t>isn’t</w:t>
-            </w:r>
-            <w:proofErr w:type="gramEnd"/>
-            <w:r>
-              <w:rPr>
-                <w:rFonts w:ascii="DM Mono" w:hAnsi="DM Mono"/>
-                <w:sz w:val="16"/>
-                <w:szCs w:val="16"/>
-              </w:rPr>
-              <w:t xml:space="preserve"> implemented.</w:t>
+              <w:t>It is also measurable, since it is binary in whether it is or isn’t implemented.</w:t>
             </w:r>
           </w:p>
         </w:tc>
@@ -4653,89 +3881,35 @@
                 <w:sz w:val="16"/>
                 <w:szCs w:val="16"/>
               </w:rPr>
-              <w:t xml:space="preserve">This shows variance between the enemies and gives the illusion of a larger game. The random value of the strength could </w:t>
-            </w:r>
-            <w:proofErr w:type="gramStart"/>
-            <w:r>
-              <w:rPr>
-                <w:rFonts w:ascii="DM Mono" w:eastAsia="Aptos" w:hAnsi="DM Mono"/>
-                <w:sz w:val="16"/>
-                <w:szCs w:val="16"/>
-              </w:rPr>
-              <w:t>be increased</w:t>
-            </w:r>
-            <w:proofErr w:type="gramEnd"/>
-            <w:r>
-              <w:rPr>
-                <w:rFonts w:ascii="DM Mono" w:eastAsia="Aptos" w:hAnsi="DM Mono"/>
-                <w:sz w:val="16"/>
-                <w:szCs w:val="16"/>
-              </w:rPr>
-              <w:t xml:space="preserve"> with difficulty, making it more challenging as appropriate.</w:t>
-            </w:r>
-          </w:p>
-          <w:p>
-            <w:pPr>
-              <w:spacing w:after="0" w:line="240" w:lineRule="auto"/>
-              <w:rPr>
-                <w:rFonts w:ascii="DM Mono" w:eastAsia="Aptos" w:hAnsi="DM Mono"/>
-                <w:sz w:val="16"/>
-                <w:szCs w:val="16"/>
-              </w:rPr>
-            </w:pPr>
-          </w:p>
-          <w:p>
-            <w:pPr>
-              <w:spacing w:after="0" w:line="240" w:lineRule="auto"/>
-              <w:rPr>
-                <w:rFonts w:ascii="DM Mono" w:hAnsi="DM Mono"/>
-                <w:sz w:val="16"/>
-                <w:szCs w:val="16"/>
-              </w:rPr>
-            </w:pPr>
-            <w:r>
-              <w:rPr>
-                <w:rFonts w:ascii="DM Mono" w:hAnsi="DM Mono"/>
-                <w:sz w:val="16"/>
-                <w:szCs w:val="16"/>
-              </w:rPr>
-              <w:t xml:space="preserve">It is also </w:t>
-            </w:r>
-            <w:proofErr w:type="gramStart"/>
-            <w:r>
-              <w:rPr>
-                <w:rFonts w:ascii="DM Mono" w:hAnsi="DM Mono"/>
-                <w:sz w:val="16"/>
-                <w:szCs w:val="16"/>
-              </w:rPr>
-              <w:t>measurable, since</w:t>
-            </w:r>
-            <w:proofErr w:type="gramEnd"/>
-            <w:r>
-              <w:rPr>
-                <w:rFonts w:ascii="DM Mono" w:hAnsi="DM Mono"/>
-                <w:sz w:val="16"/>
-                <w:szCs w:val="16"/>
-              </w:rPr>
-              <w:t xml:space="preserve"> it is binary in whether it is or </w:t>
-            </w:r>
-            <w:proofErr w:type="gramStart"/>
-            <w:r>
-              <w:rPr>
-                <w:rFonts w:ascii="DM Mono" w:hAnsi="DM Mono"/>
-                <w:sz w:val="16"/>
-                <w:szCs w:val="16"/>
-              </w:rPr>
-              <w:t>isn’t</w:t>
-            </w:r>
-            <w:proofErr w:type="gramEnd"/>
-            <w:r>
-              <w:rPr>
-                <w:rFonts w:ascii="DM Mono" w:hAnsi="DM Mono"/>
-                <w:sz w:val="16"/>
-                <w:szCs w:val="16"/>
-              </w:rPr>
-              <w:t xml:space="preserve"> implemented.</w:t>
+              <w:t>This shows variance between the enemies and gives the illusion of a larger game. The random value of the strength could be increased with difficulty, making it more challenging as appropriate.</w:t>
+            </w:r>
+          </w:p>
+          <w:p>
+            <w:pPr>
+              <w:spacing w:after="0" w:line="240" w:lineRule="auto"/>
+              <w:rPr>
+                <w:rFonts w:ascii="DM Mono" w:eastAsia="Aptos" w:hAnsi="DM Mono"/>
+                <w:sz w:val="16"/>
+                <w:szCs w:val="16"/>
+              </w:rPr>
+            </w:pPr>
+          </w:p>
+          <w:p>
+            <w:pPr>
+              <w:spacing w:after="0" w:line="240" w:lineRule="auto"/>
+              <w:rPr>
+                <w:rFonts w:ascii="DM Mono" w:hAnsi="DM Mono"/>
+                <w:sz w:val="16"/>
+                <w:szCs w:val="16"/>
+              </w:rPr>
+            </w:pPr>
+            <w:r>
+              <w:rPr>
+                <w:rFonts w:ascii="DM Mono" w:hAnsi="DM Mono"/>
+                <w:sz w:val="16"/>
+                <w:szCs w:val="16"/>
+              </w:rPr>
+              <w:t>It is also measurable, since it is binary in whether it is or isn’t implemented.</w:t>
             </w:r>
           </w:p>
         </w:tc>
@@ -4817,43 +3991,7 @@
                 <w:sz w:val="16"/>
                 <w:szCs w:val="16"/>
               </w:rPr>
-              <w:t xml:space="preserve">This addition to the game had a vehement popularity from my stakeholders. Furthermore, I am sure that its implementation would coincide pleasantly with other </w:t>
-            </w:r>
-            <w:proofErr w:type="gramStart"/>
-            <w:r>
-              <w:rPr>
-                <w:rFonts w:ascii="DM Mono" w:eastAsia="Aptos" w:hAnsi="DM Mono"/>
-                <w:sz w:val="16"/>
-                <w:szCs w:val="16"/>
-              </w:rPr>
-              <w:t>possible features</w:t>
-            </w:r>
-            <w:proofErr w:type="gramEnd"/>
-            <w:r>
-              <w:rPr>
-                <w:rFonts w:ascii="DM Mono" w:eastAsia="Aptos" w:hAnsi="DM Mono"/>
-                <w:sz w:val="16"/>
-                <w:szCs w:val="16"/>
-              </w:rPr>
-              <w:t xml:space="preserve">. </w:t>
-            </w:r>
-            <w:proofErr w:type="gramStart"/>
-            <w:r>
-              <w:rPr>
-                <w:rFonts w:ascii="DM Mono" w:eastAsia="Aptos" w:hAnsi="DM Mono"/>
-                <w:sz w:val="16"/>
-                <w:szCs w:val="16"/>
-              </w:rPr>
-              <w:t>Hence</w:t>
-            </w:r>
-            <w:proofErr w:type="gramEnd"/>
-            <w:r>
-              <w:rPr>
-                <w:rFonts w:ascii="DM Mono" w:eastAsia="Aptos" w:hAnsi="DM Mono"/>
-                <w:sz w:val="16"/>
-                <w:szCs w:val="16"/>
-              </w:rPr>
-              <w:t xml:space="preserve"> I shall list this as a required feature.</w:t>
+              <w:t>This addition to the game had a vehement popularity from my stakeholders. Furthermore, I am sure that its implementation would coincide pleasantly with other possible features. Hence I shall list this as a required feature.</w:t>
             </w:r>
           </w:p>
         </w:tc>
@@ -4973,43 +4111,7 @@
                 <w:sz w:val="16"/>
                 <w:szCs w:val="16"/>
               </w:rPr>
-              <w:t xml:space="preserve">It is also </w:t>
-            </w:r>
-            <w:proofErr w:type="gramStart"/>
-            <w:r>
-              <w:rPr>
-                <w:rFonts w:ascii="DM Mono" w:hAnsi="DM Mono"/>
-                <w:sz w:val="16"/>
-                <w:szCs w:val="16"/>
-              </w:rPr>
-              <w:t>measurable, since</w:t>
-            </w:r>
-            <w:proofErr w:type="gramEnd"/>
-            <w:r>
-              <w:rPr>
-                <w:rFonts w:ascii="DM Mono" w:hAnsi="DM Mono"/>
-                <w:sz w:val="16"/>
-                <w:szCs w:val="16"/>
-              </w:rPr>
-              <w:t xml:space="preserve"> it is binary in whether it is or </w:t>
-            </w:r>
-            <w:proofErr w:type="gramStart"/>
-            <w:r>
-              <w:rPr>
-                <w:rFonts w:ascii="DM Mono" w:hAnsi="DM Mono"/>
-                <w:sz w:val="16"/>
-                <w:szCs w:val="16"/>
-              </w:rPr>
-              <w:t>isn’t</w:t>
-            </w:r>
-            <w:proofErr w:type="gramEnd"/>
-            <w:r>
-              <w:rPr>
-                <w:rFonts w:ascii="DM Mono" w:hAnsi="DM Mono"/>
-                <w:sz w:val="16"/>
-                <w:szCs w:val="16"/>
-              </w:rPr>
-              <w:t xml:space="preserve"> implemented.</w:t>
+              <w:t>It is also measurable, since it is binary in whether it is or isn’t implemented.</w:t>
             </w:r>
           </w:p>
         </w:tc>
@@ -5192,89 +4294,35 @@
                 <w:sz w:val="16"/>
                 <w:szCs w:val="16"/>
               </w:rPr>
-              <w:t xml:space="preserve">As the most rudimentary element of any fighting game, this would make it indelibly simple for any </w:t>
-            </w:r>
-            <w:proofErr w:type="gramStart"/>
-            <w:r>
-              <w:rPr>
-                <w:rFonts w:ascii="DM Mono" w:eastAsia="Aptos" w:hAnsi="DM Mono"/>
-                <w:sz w:val="16"/>
-                <w:szCs w:val="16"/>
-              </w:rPr>
-              <w:t>new players</w:t>
-            </w:r>
-            <w:proofErr w:type="gramEnd"/>
-            <w:r>
-              <w:rPr>
-                <w:rFonts w:ascii="DM Mono" w:eastAsia="Aptos" w:hAnsi="DM Mono"/>
-                <w:sz w:val="16"/>
-                <w:szCs w:val="16"/>
-              </w:rPr>
-              <w:t>, whilst also allowing better skilled people to play.</w:t>
-            </w:r>
-          </w:p>
-          <w:p>
-            <w:pPr>
-              <w:spacing w:after="0" w:line="240" w:lineRule="auto"/>
-              <w:rPr>
-                <w:rFonts w:ascii="DM Mono" w:eastAsia="Aptos" w:hAnsi="DM Mono"/>
-                <w:sz w:val="16"/>
-                <w:szCs w:val="16"/>
-              </w:rPr>
-            </w:pPr>
-          </w:p>
-          <w:p>
-            <w:pPr>
-              <w:spacing w:after="0" w:line="240" w:lineRule="auto"/>
-              <w:rPr>
-                <w:rFonts w:ascii="DM Mono" w:hAnsi="DM Mono"/>
-                <w:sz w:val="16"/>
-                <w:szCs w:val="16"/>
-              </w:rPr>
-            </w:pPr>
-            <w:r>
-              <w:rPr>
-                <w:rFonts w:ascii="DM Mono" w:hAnsi="DM Mono"/>
-                <w:sz w:val="16"/>
-                <w:szCs w:val="16"/>
-              </w:rPr>
-              <w:t xml:space="preserve">It is also </w:t>
-            </w:r>
-            <w:proofErr w:type="gramStart"/>
-            <w:r>
-              <w:rPr>
-                <w:rFonts w:ascii="DM Mono" w:hAnsi="DM Mono"/>
-                <w:sz w:val="16"/>
-                <w:szCs w:val="16"/>
-              </w:rPr>
-              <w:t>measurable, since</w:t>
-            </w:r>
-            <w:proofErr w:type="gramEnd"/>
-            <w:r>
-              <w:rPr>
-                <w:rFonts w:ascii="DM Mono" w:hAnsi="DM Mono"/>
-                <w:sz w:val="16"/>
-                <w:szCs w:val="16"/>
-              </w:rPr>
-              <w:t xml:space="preserve"> it is binary in whether it is or </w:t>
-            </w:r>
-            <w:proofErr w:type="gramStart"/>
-            <w:r>
-              <w:rPr>
-                <w:rFonts w:ascii="DM Mono" w:hAnsi="DM Mono"/>
-                <w:sz w:val="16"/>
-                <w:szCs w:val="16"/>
-              </w:rPr>
-              <w:t>isn’t</w:t>
-            </w:r>
-            <w:proofErr w:type="gramEnd"/>
-            <w:r>
-              <w:rPr>
-                <w:rFonts w:ascii="DM Mono" w:hAnsi="DM Mono"/>
-                <w:sz w:val="16"/>
-                <w:szCs w:val="16"/>
-              </w:rPr>
-              <w:t xml:space="preserve"> implemented.</w:t>
+              <w:t>As the most rudimentary element of any fighting game, this would make it indelibly simple for any new players, whilst also allowing better skilled people to play.</w:t>
+            </w:r>
+          </w:p>
+          <w:p>
+            <w:pPr>
+              <w:spacing w:after="0" w:line="240" w:lineRule="auto"/>
+              <w:rPr>
+                <w:rFonts w:ascii="DM Mono" w:eastAsia="Aptos" w:hAnsi="DM Mono"/>
+                <w:sz w:val="16"/>
+                <w:szCs w:val="16"/>
+              </w:rPr>
+            </w:pPr>
+          </w:p>
+          <w:p>
+            <w:pPr>
+              <w:spacing w:after="0" w:line="240" w:lineRule="auto"/>
+              <w:rPr>
+                <w:rFonts w:ascii="DM Mono" w:hAnsi="DM Mono"/>
+                <w:sz w:val="16"/>
+                <w:szCs w:val="16"/>
+              </w:rPr>
+            </w:pPr>
+            <w:r>
+              <w:rPr>
+                <w:rFonts w:ascii="DM Mono" w:hAnsi="DM Mono"/>
+                <w:sz w:val="16"/>
+                <w:szCs w:val="16"/>
+              </w:rPr>
+              <w:t>It is also measurable, since it is binary in whether it is or isn’t implemented.</w:t>
             </w:r>
           </w:p>
         </w:tc>
@@ -5488,43 +4536,7 @@
                 <w:sz w:val="16"/>
                 <w:szCs w:val="16"/>
               </w:rPr>
-              <w:t xml:space="preserve">It is also </w:t>
-            </w:r>
-            <w:proofErr w:type="gramStart"/>
-            <w:r>
-              <w:rPr>
-                <w:rFonts w:ascii="DM Mono" w:hAnsi="DM Mono"/>
-                <w:sz w:val="16"/>
-                <w:szCs w:val="16"/>
-              </w:rPr>
-              <w:t>measurable, since</w:t>
-            </w:r>
-            <w:proofErr w:type="gramEnd"/>
-            <w:r>
-              <w:rPr>
-                <w:rFonts w:ascii="DM Mono" w:hAnsi="DM Mono"/>
-                <w:sz w:val="16"/>
-                <w:szCs w:val="16"/>
-              </w:rPr>
-              <w:t xml:space="preserve"> it is binary in whether it is or </w:t>
-            </w:r>
-            <w:proofErr w:type="gramStart"/>
-            <w:r>
-              <w:rPr>
-                <w:rFonts w:ascii="DM Mono" w:hAnsi="DM Mono"/>
-                <w:sz w:val="16"/>
-                <w:szCs w:val="16"/>
-              </w:rPr>
-              <w:t>isn’t</w:t>
-            </w:r>
-            <w:proofErr w:type="gramEnd"/>
-            <w:r>
-              <w:rPr>
-                <w:rFonts w:ascii="DM Mono" w:hAnsi="DM Mono"/>
-                <w:sz w:val="16"/>
-                <w:szCs w:val="16"/>
-              </w:rPr>
-              <w:t xml:space="preserve"> implemented.</w:t>
+              <w:t>It is also measurable, since it is binary in whether it is or isn’t implemented.</w:t>
             </w:r>
           </w:p>
         </w:tc>
@@ -5676,25 +4688,7 @@
                 <w:sz w:val="16"/>
                 <w:szCs w:val="16"/>
               </w:rPr>
-              <w:t xml:space="preserve">An incredibly </w:t>
-            </w:r>
-            <w:proofErr w:type="gramStart"/>
-            <w:r>
-              <w:rPr>
-                <w:rFonts w:ascii="DM Mono" w:eastAsia="Aptos" w:hAnsi="DM Mono"/>
-                <w:sz w:val="16"/>
-                <w:szCs w:val="16"/>
-              </w:rPr>
-              <w:t>short range</w:t>
-            </w:r>
-            <w:proofErr w:type="gramEnd"/>
-            <w:r>
-              <w:rPr>
-                <w:rFonts w:ascii="DM Mono" w:eastAsia="Aptos" w:hAnsi="DM Mono"/>
-                <w:sz w:val="16"/>
-                <w:szCs w:val="16"/>
-              </w:rPr>
-              <w:t xml:space="preserve"> attack with the highest damage.</w:t>
+              <w:t>An incredibly short range attack with the highest damage.</w:t>
             </w:r>
           </w:p>
         </w:tc>
@@ -5745,43 +4739,7 @@
                 <w:sz w:val="16"/>
                 <w:szCs w:val="16"/>
               </w:rPr>
-              <w:t xml:space="preserve">It is also </w:t>
-            </w:r>
-            <w:proofErr w:type="gramStart"/>
-            <w:r>
-              <w:rPr>
-                <w:rFonts w:ascii="DM Mono" w:hAnsi="DM Mono"/>
-                <w:sz w:val="16"/>
-                <w:szCs w:val="16"/>
-              </w:rPr>
-              <w:t>measurable, since</w:t>
-            </w:r>
-            <w:proofErr w:type="gramEnd"/>
-            <w:r>
-              <w:rPr>
-                <w:rFonts w:ascii="DM Mono" w:hAnsi="DM Mono"/>
-                <w:sz w:val="16"/>
-                <w:szCs w:val="16"/>
-              </w:rPr>
-              <w:t xml:space="preserve"> it is binary in whether it is or </w:t>
-            </w:r>
-            <w:proofErr w:type="gramStart"/>
-            <w:r>
-              <w:rPr>
-                <w:rFonts w:ascii="DM Mono" w:hAnsi="DM Mono"/>
-                <w:sz w:val="16"/>
-                <w:szCs w:val="16"/>
-              </w:rPr>
-              <w:t>isn’t</w:t>
-            </w:r>
-            <w:proofErr w:type="gramEnd"/>
-            <w:r>
-              <w:rPr>
-                <w:rFonts w:ascii="DM Mono" w:hAnsi="DM Mono"/>
-                <w:sz w:val="16"/>
-                <w:szCs w:val="16"/>
-              </w:rPr>
-              <w:t xml:space="preserve"> implemented.</w:t>
+              <w:t>It is also measurable, since it is binary in whether it is or isn’t implemented.</w:t>
             </w:r>
           </w:p>
         </w:tc>
@@ -5964,25 +4922,7 @@
                 <w:sz w:val="16"/>
                 <w:szCs w:val="16"/>
               </w:rPr>
-              <w:t xml:space="preserve">In </w:t>
-            </w:r>
-            <w:proofErr w:type="gramStart"/>
-            <w:r>
-              <w:rPr>
-                <w:rFonts w:ascii="DM Mono" w:eastAsia="Aptos" w:hAnsi="DM Mono"/>
-                <w:sz w:val="16"/>
-                <w:szCs w:val="16"/>
-              </w:rPr>
-              <w:t>all of</w:t>
-            </w:r>
-            <w:proofErr w:type="gramEnd"/>
-            <w:r>
-              <w:rPr>
-                <w:rFonts w:ascii="DM Mono" w:eastAsia="Aptos" w:hAnsi="DM Mono"/>
-                <w:sz w:val="16"/>
-                <w:szCs w:val="16"/>
-              </w:rPr>
-              <w:t xml:space="preserve"> the games which I investigated for this project, this item was prevalent. The reason being that it is an essential indicator of the leading fighter and the proximity to a loss. My use of this would see the traditional red block fill, making use of the user’s precognition of its meaning. I feel free to do this due to my target audience </w:t>
+              <w:t xml:space="preserve">In all of the games which I investigated for this project, this item was prevalent. The reason being that it is an essential indicator of the leading fighter and the proximity to a loss. My use of this would see the traditional red block fill, making use of the user’s precognition of its meaning. I feel free to do this due to my target audience </w:t>
             </w:r>
             <w:r>
               <w:rPr>
@@ -6019,43 +4959,7 @@
                 <w:sz w:val="16"/>
                 <w:szCs w:val="16"/>
               </w:rPr>
-              <w:t xml:space="preserve">It is also </w:t>
-            </w:r>
-            <w:proofErr w:type="gramStart"/>
-            <w:r>
-              <w:rPr>
-                <w:rFonts w:ascii="DM Mono" w:hAnsi="DM Mono"/>
-                <w:sz w:val="16"/>
-                <w:szCs w:val="16"/>
-              </w:rPr>
-              <w:t>measurable, since</w:t>
-            </w:r>
-            <w:proofErr w:type="gramEnd"/>
-            <w:r>
-              <w:rPr>
-                <w:rFonts w:ascii="DM Mono" w:hAnsi="DM Mono"/>
-                <w:sz w:val="16"/>
-                <w:szCs w:val="16"/>
-              </w:rPr>
-              <w:t xml:space="preserve"> it is binary in whether it is or </w:t>
-            </w:r>
-            <w:proofErr w:type="gramStart"/>
-            <w:r>
-              <w:rPr>
-                <w:rFonts w:ascii="DM Mono" w:hAnsi="DM Mono"/>
-                <w:sz w:val="16"/>
-                <w:szCs w:val="16"/>
-              </w:rPr>
-              <w:t>isn’t</w:t>
-            </w:r>
-            <w:proofErr w:type="gramEnd"/>
-            <w:r>
-              <w:rPr>
-                <w:rFonts w:ascii="DM Mono" w:hAnsi="DM Mono"/>
-                <w:sz w:val="16"/>
-                <w:szCs w:val="16"/>
-              </w:rPr>
-              <w:t xml:space="preserve"> implemented.</w:t>
+              <w:t>It is also measurable, since it is binary in whether it is or isn’t implemented.</w:t>
             </w:r>
           </w:p>
         </w:tc>
@@ -6200,25 +5104,7 @@
                 <w:sz w:val="16"/>
                 <w:szCs w:val="16"/>
               </w:rPr>
-              <w:t xml:space="preserve">A simple element </w:t>
-            </w:r>
-            <w:proofErr w:type="gramStart"/>
-            <w:r>
-              <w:rPr>
-                <w:rFonts w:ascii="DM Mono" w:eastAsia="Aptos" w:hAnsi="DM Mono"/>
-                <w:sz w:val="16"/>
-                <w:szCs w:val="16"/>
-              </w:rPr>
-              <w:t>similar to</w:t>
-            </w:r>
-            <w:proofErr w:type="gramEnd"/>
-            <w:r>
-              <w:rPr>
-                <w:rFonts w:ascii="DM Mono" w:eastAsia="Aptos" w:hAnsi="DM Mono"/>
-                <w:sz w:val="16"/>
-                <w:szCs w:val="16"/>
-              </w:rPr>
-              <w:t xml:space="preserve"> the health bar, used to show the current level of stamina possessed by the relevant fighter. Positioned below the health bar.</w:t>
+              <w:t>A simple element similar to the health bar, used to show the current level of stamina possessed by the relevant fighter. Positioned below the health bar.</w:t>
             </w:r>
           </w:p>
         </w:tc>
@@ -6241,107 +5127,35 @@
                 <w:sz w:val="16"/>
                 <w:szCs w:val="16"/>
               </w:rPr>
-              <w:t xml:space="preserve">This element would act incredibly like the above. This would show the stamina attribute of the fighter as an orange block fill. As so, it would decrease after the player or enemy made a move, thus showing both the player’s capability to advance, or the enemies weakness. By including this as a displayed element, it improves the ease of use for the player. This would differ slightly to the health bar </w:t>
-            </w:r>
-            <w:proofErr w:type="gramStart"/>
-            <w:r>
-              <w:rPr>
-                <w:rFonts w:ascii="DM Mono" w:eastAsia="Aptos" w:hAnsi="DM Mono"/>
-                <w:sz w:val="16"/>
-                <w:szCs w:val="16"/>
-              </w:rPr>
-              <w:t>in light of</w:t>
-            </w:r>
-            <w:proofErr w:type="gramEnd"/>
-            <w:r>
-              <w:rPr>
-                <w:rFonts w:ascii="DM Mono" w:eastAsia="Aptos" w:hAnsi="DM Mono"/>
-                <w:sz w:val="16"/>
-                <w:szCs w:val="16"/>
-              </w:rPr>
-              <w:t xml:space="preserve"> the nature of stamina to </w:t>
-            </w:r>
-            <w:proofErr w:type="gramStart"/>
-            <w:r>
-              <w:rPr>
-                <w:rFonts w:ascii="DM Mono" w:eastAsia="Aptos" w:hAnsi="DM Mono"/>
-                <w:sz w:val="16"/>
-                <w:szCs w:val="16"/>
-              </w:rPr>
-              <w:t>be recovered</w:t>
-            </w:r>
-            <w:proofErr w:type="gramEnd"/>
-            <w:r>
-              <w:rPr>
-                <w:rFonts w:ascii="DM Mono" w:eastAsia="Aptos" w:hAnsi="DM Mono"/>
-                <w:sz w:val="16"/>
-                <w:szCs w:val="16"/>
-              </w:rPr>
-              <w:t xml:space="preserve">, both in similar media and real life. Hence, mine shall use a formula to determine the rate at which the bar should </w:t>
-            </w:r>
-            <w:proofErr w:type="gramStart"/>
-            <w:r>
-              <w:rPr>
-                <w:rFonts w:ascii="DM Mono" w:eastAsia="Aptos" w:hAnsi="DM Mono"/>
-                <w:sz w:val="16"/>
-                <w:szCs w:val="16"/>
-              </w:rPr>
-              <w:t>be filled</w:t>
-            </w:r>
-            <w:proofErr w:type="gramEnd"/>
-            <w:r>
-              <w:rPr>
-                <w:rFonts w:ascii="DM Mono" w:eastAsia="Aptos" w:hAnsi="DM Mono"/>
-                <w:sz w:val="16"/>
-                <w:szCs w:val="16"/>
-              </w:rPr>
-              <w:t xml:space="preserve"> over a given period. The result would be a smoother looking increase in stamina as opposed to a direct spike.</w:t>
-            </w:r>
-          </w:p>
-          <w:p>
-            <w:pPr>
-              <w:spacing w:after="0" w:line="240" w:lineRule="auto"/>
-              <w:rPr>
-                <w:rFonts w:ascii="DM Mono" w:eastAsia="Aptos" w:hAnsi="DM Mono"/>
-                <w:sz w:val="16"/>
-                <w:szCs w:val="16"/>
-              </w:rPr>
-            </w:pPr>
-          </w:p>
-          <w:p>
-            <w:pPr>
-              <w:spacing w:after="0" w:line="240" w:lineRule="auto"/>
-              <w:rPr>
-                <w:rFonts w:ascii="DM Mono" w:hAnsi="DM Mono"/>
-                <w:sz w:val="16"/>
-                <w:szCs w:val="16"/>
-              </w:rPr>
-            </w:pPr>
-            <w:r>
-              <w:rPr>
-                <w:rFonts w:ascii="DM Mono" w:hAnsi="DM Mono"/>
-                <w:sz w:val="16"/>
-                <w:szCs w:val="16"/>
-              </w:rPr>
-              <w:t xml:space="preserve">It is also </w:t>
-            </w:r>
-            <w:proofErr w:type="gramStart"/>
-            <w:r>
-              <w:rPr>
-                <w:rFonts w:ascii="DM Mono" w:hAnsi="DM Mono"/>
-                <w:sz w:val="16"/>
-                <w:szCs w:val="16"/>
-              </w:rPr>
-              <w:t>measurable, since</w:t>
-            </w:r>
-            <w:proofErr w:type="gramEnd"/>
-            <w:r>
-              <w:rPr>
-                <w:rFonts w:ascii="DM Mono" w:hAnsi="DM Mono"/>
-                <w:sz w:val="16"/>
-                <w:szCs w:val="16"/>
-              </w:rPr>
-              <w:t xml:space="preserve"> it is </w:t>
+              <w:t>This element would act incredibly like the above. This would show the stamina attribute of the fighter as an orange block fill. As so, it would decrease after the player or enemy made a move, thus showing both the player’s capability to advance, or the enemies weakness. By including this as a displayed element, it improves the ease of use for the player. This would differ slightly to the health bar in light of the nature of stamina to be recovered, both in similar media and real life. Hence, mine shall use a formula to determine the rate at which the bar should be filled over a given period. The result would be a smoother looking increase in stamina as opposed to a direct spike.</w:t>
+            </w:r>
+          </w:p>
+          <w:p>
+            <w:pPr>
+              <w:spacing w:after="0" w:line="240" w:lineRule="auto"/>
+              <w:rPr>
+                <w:rFonts w:ascii="DM Mono" w:eastAsia="Aptos" w:hAnsi="DM Mono"/>
+                <w:sz w:val="16"/>
+                <w:szCs w:val="16"/>
+              </w:rPr>
+            </w:pPr>
+          </w:p>
+          <w:p>
+            <w:pPr>
+              <w:spacing w:after="0" w:line="240" w:lineRule="auto"/>
+              <w:rPr>
+                <w:rFonts w:ascii="DM Mono" w:hAnsi="DM Mono"/>
+                <w:sz w:val="16"/>
+                <w:szCs w:val="16"/>
+              </w:rPr>
+            </w:pPr>
+            <w:r>
+              <w:rPr>
+                <w:rFonts w:ascii="DM Mono" w:hAnsi="DM Mono"/>
+                <w:sz w:val="16"/>
+                <w:szCs w:val="16"/>
+              </w:rPr>
+              <w:t xml:space="preserve">It is also measurable, since it is </w:t>
             </w:r>
             <w:r>
               <w:rPr>
@@ -6350,25 +5164,7 @@
                 <w:szCs w:val="16"/>
               </w:rPr>
               <w:lastRenderedPageBreak/>
-              <w:t xml:space="preserve">binary in whether it is or </w:t>
-            </w:r>
-            <w:proofErr w:type="gramStart"/>
-            <w:r>
-              <w:rPr>
-                <w:rFonts w:ascii="DM Mono" w:hAnsi="DM Mono"/>
-                <w:sz w:val="16"/>
-                <w:szCs w:val="16"/>
-              </w:rPr>
-              <w:t>isn’t</w:t>
-            </w:r>
-            <w:proofErr w:type="gramEnd"/>
-            <w:r>
-              <w:rPr>
-                <w:rFonts w:ascii="DM Mono" w:hAnsi="DM Mono"/>
-                <w:sz w:val="16"/>
-                <w:szCs w:val="16"/>
-              </w:rPr>
-              <w:t xml:space="preserve"> implemented.</w:t>
+              <w:t>binary in whether it is or isn’t implemented.</w:t>
             </w:r>
           </w:p>
         </w:tc>
@@ -6543,89 +5339,35 @@
                 <w:sz w:val="16"/>
                 <w:szCs w:val="16"/>
               </w:rPr>
-              <w:t xml:space="preserve">This is another item discovered from my research. The concept allows the player to visualise the time before they can strike again. This downtime also opens them up to </w:t>
-            </w:r>
-            <w:proofErr w:type="gramStart"/>
-            <w:r>
-              <w:rPr>
-                <w:rFonts w:ascii="DM Mono" w:hAnsi="DM Mono"/>
-                <w:sz w:val="16"/>
-                <w:szCs w:val="16"/>
-              </w:rPr>
-              <w:t>being hit</w:t>
-            </w:r>
-            <w:proofErr w:type="gramEnd"/>
-            <w:r>
-              <w:rPr>
-                <w:rFonts w:ascii="DM Mono" w:hAnsi="DM Mono"/>
-                <w:sz w:val="16"/>
-                <w:szCs w:val="16"/>
-              </w:rPr>
-              <w:t xml:space="preserve"> and thus adds a layer of challenge. Furthermore, it forces them to plan attacks with caution.</w:t>
-            </w:r>
-          </w:p>
-          <w:p>
-            <w:pPr>
-              <w:spacing w:after="0" w:line="240" w:lineRule="auto"/>
-              <w:rPr>
-                <w:rFonts w:ascii="DM Mono" w:hAnsi="DM Mono"/>
-                <w:sz w:val="16"/>
-                <w:szCs w:val="16"/>
-              </w:rPr>
-            </w:pPr>
-          </w:p>
-          <w:p>
-            <w:pPr>
-              <w:spacing w:after="0" w:line="240" w:lineRule="auto"/>
-              <w:rPr>
-                <w:rFonts w:ascii="DM Mono" w:hAnsi="DM Mono"/>
-                <w:sz w:val="16"/>
-                <w:szCs w:val="16"/>
-              </w:rPr>
-            </w:pPr>
-            <w:r>
-              <w:rPr>
-                <w:rFonts w:ascii="DM Mono" w:hAnsi="DM Mono"/>
-                <w:sz w:val="16"/>
-                <w:szCs w:val="16"/>
-              </w:rPr>
-              <w:t xml:space="preserve">It is also </w:t>
-            </w:r>
-            <w:proofErr w:type="gramStart"/>
-            <w:r>
-              <w:rPr>
-                <w:rFonts w:ascii="DM Mono" w:hAnsi="DM Mono"/>
-                <w:sz w:val="16"/>
-                <w:szCs w:val="16"/>
-              </w:rPr>
-              <w:t>measurable, since</w:t>
-            </w:r>
-            <w:proofErr w:type="gramEnd"/>
-            <w:r>
-              <w:rPr>
-                <w:rFonts w:ascii="DM Mono" w:hAnsi="DM Mono"/>
-                <w:sz w:val="16"/>
-                <w:szCs w:val="16"/>
-              </w:rPr>
-              <w:t xml:space="preserve"> it is binary in whether it is or </w:t>
-            </w:r>
-            <w:proofErr w:type="gramStart"/>
-            <w:r>
-              <w:rPr>
-                <w:rFonts w:ascii="DM Mono" w:hAnsi="DM Mono"/>
-                <w:sz w:val="16"/>
-                <w:szCs w:val="16"/>
-              </w:rPr>
-              <w:t>isn’t</w:t>
-            </w:r>
-            <w:proofErr w:type="gramEnd"/>
-            <w:r>
-              <w:rPr>
-                <w:rFonts w:ascii="DM Mono" w:hAnsi="DM Mono"/>
-                <w:sz w:val="16"/>
-                <w:szCs w:val="16"/>
-              </w:rPr>
-              <w:t xml:space="preserve"> implemented.</w:t>
+              <w:t>This is another item discovered from my research. The concept allows the player to visualise the time before they can strike again. This downtime also opens them up to being hit and thus adds a layer of challenge. Furthermore, it forces them to plan attacks with caution.</w:t>
+            </w:r>
+          </w:p>
+          <w:p>
+            <w:pPr>
+              <w:spacing w:after="0" w:line="240" w:lineRule="auto"/>
+              <w:rPr>
+                <w:rFonts w:ascii="DM Mono" w:hAnsi="DM Mono"/>
+                <w:sz w:val="16"/>
+                <w:szCs w:val="16"/>
+              </w:rPr>
+            </w:pPr>
+          </w:p>
+          <w:p>
+            <w:pPr>
+              <w:spacing w:after="0" w:line="240" w:lineRule="auto"/>
+              <w:rPr>
+                <w:rFonts w:ascii="DM Mono" w:hAnsi="DM Mono"/>
+                <w:sz w:val="16"/>
+                <w:szCs w:val="16"/>
+              </w:rPr>
+            </w:pPr>
+            <w:r>
+              <w:rPr>
+                <w:rFonts w:ascii="DM Mono" w:hAnsi="DM Mono"/>
+                <w:sz w:val="16"/>
+                <w:szCs w:val="16"/>
+              </w:rPr>
+              <w:t>It is also measurable, since it is binary in whether it is or isn’t implemented.</w:t>
             </w:r>
           </w:p>
         </w:tc>
@@ -6785,25 +5527,7 @@
                 <w:sz w:val="16"/>
                 <w:szCs w:val="16"/>
               </w:rPr>
-              <w:t xml:space="preserve">A simple menu item which starts the game on </w:t>
-            </w:r>
-            <w:proofErr w:type="gramStart"/>
-            <w:r>
-              <w:rPr>
-                <w:rFonts w:ascii="DM Mono" w:eastAsia="Aptos" w:hAnsi="DM Mono"/>
-                <w:sz w:val="16"/>
-                <w:szCs w:val="16"/>
-              </w:rPr>
-              <w:t>being clicked</w:t>
-            </w:r>
-            <w:proofErr w:type="gramEnd"/>
-            <w:r>
-              <w:rPr>
-                <w:rFonts w:ascii="DM Mono" w:eastAsia="Aptos" w:hAnsi="DM Mono"/>
-                <w:sz w:val="16"/>
-                <w:szCs w:val="16"/>
-              </w:rPr>
-              <w:t>.</w:t>
+              <w:t>A simple menu item which starts the game on being clicked.</w:t>
             </w:r>
           </w:p>
         </w:tc>
@@ -6826,89 +5550,35 @@
                 <w:sz w:val="16"/>
                 <w:szCs w:val="16"/>
               </w:rPr>
-              <w:t xml:space="preserve">In all three games which I analysed for my market research, a start button was consistent. This feature is useful because it allows the player to instantiate a new game </w:t>
-            </w:r>
-            <w:proofErr w:type="gramStart"/>
-            <w:r>
-              <w:rPr>
-                <w:rFonts w:ascii="DM Mono" w:eastAsia="Aptos" w:hAnsi="DM Mono"/>
-                <w:sz w:val="16"/>
-                <w:szCs w:val="16"/>
-              </w:rPr>
-              <w:t>if and when</w:t>
-            </w:r>
-            <w:proofErr w:type="gramEnd"/>
-            <w:r>
-              <w:rPr>
-                <w:rFonts w:ascii="DM Mono" w:eastAsia="Aptos" w:hAnsi="DM Mono"/>
-                <w:sz w:val="16"/>
-                <w:szCs w:val="16"/>
-              </w:rPr>
-              <w:t xml:space="preserve"> they desire. Furthermore, this permits a period of which a student playing this game can wait before playing again, for example if they are printing out an essay they might load the game when they plan to start printing, but only actually begin it once the document has started to print. </w:t>
-            </w:r>
-          </w:p>
-          <w:p>
-            <w:pPr>
-              <w:spacing w:after="0" w:line="240" w:lineRule="auto"/>
-              <w:rPr>
-                <w:rFonts w:ascii="DM Mono" w:eastAsia="Aptos" w:hAnsi="DM Mono"/>
-                <w:sz w:val="16"/>
-                <w:szCs w:val="16"/>
-              </w:rPr>
-            </w:pPr>
-          </w:p>
-          <w:p>
-            <w:pPr>
-              <w:spacing w:after="0" w:line="240" w:lineRule="auto"/>
-              <w:rPr>
-                <w:rFonts w:ascii="DM Mono" w:hAnsi="DM Mono"/>
-                <w:sz w:val="16"/>
-                <w:szCs w:val="16"/>
-              </w:rPr>
-            </w:pPr>
-            <w:r>
-              <w:rPr>
-                <w:rFonts w:ascii="DM Mono" w:hAnsi="DM Mono"/>
-                <w:sz w:val="16"/>
-                <w:szCs w:val="16"/>
-              </w:rPr>
-              <w:t xml:space="preserve">It is also </w:t>
-            </w:r>
-            <w:proofErr w:type="gramStart"/>
-            <w:r>
-              <w:rPr>
-                <w:rFonts w:ascii="DM Mono" w:hAnsi="DM Mono"/>
-                <w:sz w:val="16"/>
-                <w:szCs w:val="16"/>
-              </w:rPr>
-              <w:t>measurable, since</w:t>
-            </w:r>
-            <w:proofErr w:type="gramEnd"/>
-            <w:r>
-              <w:rPr>
-                <w:rFonts w:ascii="DM Mono" w:hAnsi="DM Mono"/>
-                <w:sz w:val="16"/>
-                <w:szCs w:val="16"/>
-              </w:rPr>
-              <w:t xml:space="preserve"> it is binary in whether it is or </w:t>
-            </w:r>
-            <w:proofErr w:type="gramStart"/>
-            <w:r>
-              <w:rPr>
-                <w:rFonts w:ascii="DM Mono" w:hAnsi="DM Mono"/>
-                <w:sz w:val="16"/>
-                <w:szCs w:val="16"/>
-              </w:rPr>
-              <w:t>isn’t</w:t>
-            </w:r>
-            <w:proofErr w:type="gramEnd"/>
-            <w:r>
-              <w:rPr>
-                <w:rFonts w:ascii="DM Mono" w:hAnsi="DM Mono"/>
-                <w:sz w:val="16"/>
-                <w:szCs w:val="16"/>
-              </w:rPr>
-              <w:t xml:space="preserve"> implemented.</w:t>
+              <w:t xml:space="preserve">In all three games which I analysed for my market research, a start button was consistent. This feature is useful because it allows the player to instantiate a new game if and when they desire. Furthermore, this permits a period of which a student playing this game can wait before playing again, for example if they are printing out an essay they might load the game when they plan to start printing, but only actually begin it once the document has started to print. </w:t>
+            </w:r>
+          </w:p>
+          <w:p>
+            <w:pPr>
+              <w:spacing w:after="0" w:line="240" w:lineRule="auto"/>
+              <w:rPr>
+                <w:rFonts w:ascii="DM Mono" w:eastAsia="Aptos" w:hAnsi="DM Mono"/>
+                <w:sz w:val="16"/>
+                <w:szCs w:val="16"/>
+              </w:rPr>
+            </w:pPr>
+          </w:p>
+          <w:p>
+            <w:pPr>
+              <w:spacing w:after="0" w:line="240" w:lineRule="auto"/>
+              <w:rPr>
+                <w:rFonts w:ascii="DM Mono" w:hAnsi="DM Mono"/>
+                <w:sz w:val="16"/>
+                <w:szCs w:val="16"/>
+              </w:rPr>
+            </w:pPr>
+            <w:r>
+              <w:rPr>
+                <w:rFonts w:ascii="DM Mono" w:hAnsi="DM Mono"/>
+                <w:sz w:val="16"/>
+                <w:szCs w:val="16"/>
+              </w:rPr>
+              <w:t>It is also measurable, since it is binary in whether it is or isn’t implemented.</w:t>
             </w:r>
           </w:p>
         </w:tc>
@@ -7076,89 +5746,35 @@
                 <w:sz w:val="16"/>
                 <w:szCs w:val="16"/>
               </w:rPr>
-              <w:t xml:space="preserve">Whilst my survey has not accounted for this idea, </w:t>
-            </w:r>
-            <w:proofErr w:type="gramStart"/>
-            <w:r>
-              <w:rPr>
-                <w:rFonts w:ascii="DM Mono" w:eastAsia="Aptos" w:hAnsi="DM Mono"/>
-                <w:sz w:val="16"/>
-                <w:szCs w:val="16"/>
-              </w:rPr>
-              <w:t>I find that nearly all similar games</w:t>
-            </w:r>
-            <w:proofErr w:type="gramEnd"/>
-            <w:r>
-              <w:rPr>
-                <w:rFonts w:ascii="DM Mono" w:eastAsia="Aptos" w:hAnsi="DM Mono"/>
-                <w:sz w:val="16"/>
-                <w:szCs w:val="16"/>
-              </w:rPr>
-              <w:t xml:space="preserve"> have this feature. Additionally, it would veritably support other favoured features such as enemies with variable reaction times. Hence, I have decided to take agency on this matter and make this a necessary feature in my game. This would be helpful for students playing the game because it would allow them to control the level of focus required to enjoy the game. Often after a long day, students can struggle to engage with prolonged and intense brain function.</w:t>
-            </w:r>
-          </w:p>
-          <w:p>
-            <w:pPr>
-              <w:spacing w:after="0" w:line="240" w:lineRule="auto"/>
-              <w:rPr>
-                <w:rFonts w:ascii="DM Mono" w:eastAsia="Aptos" w:hAnsi="DM Mono"/>
-                <w:sz w:val="16"/>
-                <w:szCs w:val="16"/>
-              </w:rPr>
-            </w:pPr>
-          </w:p>
-          <w:p>
-            <w:pPr>
-              <w:spacing w:after="0" w:line="240" w:lineRule="auto"/>
-              <w:rPr>
-                <w:rFonts w:ascii="DM Mono" w:hAnsi="DM Mono"/>
-                <w:sz w:val="16"/>
-                <w:szCs w:val="16"/>
-              </w:rPr>
-            </w:pPr>
-            <w:r>
-              <w:rPr>
-                <w:rFonts w:ascii="DM Mono" w:hAnsi="DM Mono"/>
-                <w:sz w:val="16"/>
-                <w:szCs w:val="16"/>
-              </w:rPr>
-              <w:t xml:space="preserve">It is also </w:t>
-            </w:r>
-            <w:proofErr w:type="gramStart"/>
-            <w:r>
-              <w:rPr>
-                <w:rFonts w:ascii="DM Mono" w:hAnsi="DM Mono"/>
-                <w:sz w:val="16"/>
-                <w:szCs w:val="16"/>
-              </w:rPr>
-              <w:t>measurable, since</w:t>
-            </w:r>
-            <w:proofErr w:type="gramEnd"/>
-            <w:r>
-              <w:rPr>
-                <w:rFonts w:ascii="DM Mono" w:hAnsi="DM Mono"/>
-                <w:sz w:val="16"/>
-                <w:szCs w:val="16"/>
-              </w:rPr>
-              <w:t xml:space="preserve"> it is binary in whether it is or </w:t>
-            </w:r>
-            <w:proofErr w:type="gramStart"/>
-            <w:r>
-              <w:rPr>
-                <w:rFonts w:ascii="DM Mono" w:hAnsi="DM Mono"/>
-                <w:sz w:val="16"/>
-                <w:szCs w:val="16"/>
-              </w:rPr>
-              <w:t>isn’t</w:t>
-            </w:r>
-            <w:proofErr w:type="gramEnd"/>
-            <w:r>
-              <w:rPr>
-                <w:rFonts w:ascii="DM Mono" w:hAnsi="DM Mono"/>
-                <w:sz w:val="16"/>
-                <w:szCs w:val="16"/>
-              </w:rPr>
-              <w:t xml:space="preserve"> implemented.</w:t>
+              <w:t>Whilst my survey has not accounted for this idea, I find that nearly all similar games have this feature. Additionally, it would veritably support other favoured features such as enemies with variable reaction times. Hence, I have decided to take agency on this matter and make this a necessary feature in my game. This would be helpful for students playing the game because it would allow them to control the level of focus required to enjoy the game. Often after a long day, students can struggle to engage with prolonged and intense brain function.</w:t>
+            </w:r>
+          </w:p>
+          <w:p>
+            <w:pPr>
+              <w:spacing w:after="0" w:line="240" w:lineRule="auto"/>
+              <w:rPr>
+                <w:rFonts w:ascii="DM Mono" w:eastAsia="Aptos" w:hAnsi="DM Mono"/>
+                <w:sz w:val="16"/>
+                <w:szCs w:val="16"/>
+              </w:rPr>
+            </w:pPr>
+          </w:p>
+          <w:p>
+            <w:pPr>
+              <w:spacing w:after="0" w:line="240" w:lineRule="auto"/>
+              <w:rPr>
+                <w:rFonts w:ascii="DM Mono" w:hAnsi="DM Mono"/>
+                <w:sz w:val="16"/>
+                <w:szCs w:val="16"/>
+              </w:rPr>
+            </w:pPr>
+            <w:r>
+              <w:rPr>
+                <w:rFonts w:ascii="DM Mono" w:hAnsi="DM Mono"/>
+                <w:sz w:val="16"/>
+                <w:szCs w:val="16"/>
+              </w:rPr>
+              <w:t>It is also measurable, since it is binary in whether it is or isn’t implemented.</w:t>
             </w:r>
           </w:p>
         </w:tc>
@@ -7240,25 +5856,7 @@
                 <w:sz w:val="16"/>
                 <w:szCs w:val="16"/>
               </w:rPr>
-              <w:t xml:space="preserve">A menu screen would be crucial for a typical functionality of the game. Due to the </w:t>
-            </w:r>
-            <w:proofErr w:type="gramStart"/>
-            <w:r>
-              <w:rPr>
-                <w:rFonts w:ascii="DM Mono" w:eastAsia="Aptos" w:hAnsi="DM Mono"/>
-                <w:sz w:val="16"/>
-                <w:szCs w:val="16"/>
-              </w:rPr>
-              <w:t>fast paced</w:t>
-            </w:r>
-            <w:proofErr w:type="gramEnd"/>
-            <w:r>
-              <w:rPr>
-                <w:rFonts w:ascii="DM Mono" w:eastAsia="Aptos" w:hAnsi="DM Mono"/>
-                <w:sz w:val="16"/>
-                <w:szCs w:val="16"/>
-              </w:rPr>
-              <w:t xml:space="preserve"> nature of the game, a menu to break it up would feel helpful. It </w:t>
+              <w:t xml:space="preserve">A menu screen would be crucial for a typical functionality of the game. Due to the fast paced nature of the game, a menu to break it up would feel helpful. It </w:t>
             </w:r>
             <w:r>
               <w:rPr>
@@ -7505,25 +6103,7 @@
                 <w:sz w:val="16"/>
                 <w:szCs w:val="16"/>
               </w:rPr>
-              <w:t xml:space="preserve">This would enable the player to move their character from left to right with certain inputs. The game would </w:t>
-            </w:r>
-            <w:proofErr w:type="gramStart"/>
-            <w:r>
-              <w:rPr>
-                <w:rFonts w:ascii="DM Mono" w:eastAsia="Aptos" w:hAnsi="DM Mono"/>
-                <w:sz w:val="16"/>
-                <w:szCs w:val="16"/>
-              </w:rPr>
-              <w:t>likely use</w:t>
-            </w:r>
-            <w:proofErr w:type="gramEnd"/>
-            <w:r>
-              <w:rPr>
-                <w:rFonts w:ascii="DM Mono" w:eastAsia="Aptos" w:hAnsi="DM Mono"/>
-                <w:sz w:val="16"/>
-                <w:szCs w:val="16"/>
-              </w:rPr>
-              <w:t xml:space="preserve"> WASD format, as is conventional in this category.</w:t>
+              <w:t>This would enable the player to move their character from left to right with certain inputs. The game would likely use WASD format, as is conventional in this category.</w:t>
             </w:r>
           </w:p>
         </w:tc>
@@ -7546,89 +6126,35 @@
                 <w:sz w:val="16"/>
                 <w:szCs w:val="16"/>
               </w:rPr>
-              <w:t xml:space="preserve">My game would require the ability for the player to move around. This forms the basis for </w:t>
-            </w:r>
-            <w:proofErr w:type="gramStart"/>
-            <w:r>
-              <w:rPr>
-                <w:rFonts w:ascii="DM Mono" w:eastAsia="Aptos" w:hAnsi="DM Mono"/>
-                <w:sz w:val="16"/>
-                <w:szCs w:val="16"/>
-              </w:rPr>
-              <w:t>almost all</w:t>
-            </w:r>
-            <w:proofErr w:type="gramEnd"/>
-            <w:r>
-              <w:rPr>
-                <w:rFonts w:ascii="DM Mono" w:eastAsia="Aptos" w:hAnsi="DM Mono"/>
-                <w:sz w:val="16"/>
-                <w:szCs w:val="16"/>
-              </w:rPr>
-              <w:t xml:space="preserve"> similar games, including all of which I researched prior. I did not include this idea in my survey, due to it being typical.</w:t>
-            </w:r>
-          </w:p>
-          <w:p>
-            <w:pPr>
-              <w:spacing w:after="0" w:line="240" w:lineRule="auto"/>
-              <w:rPr>
-                <w:rFonts w:ascii="DM Mono" w:eastAsia="Aptos" w:hAnsi="DM Mono"/>
-                <w:sz w:val="16"/>
-                <w:szCs w:val="16"/>
-              </w:rPr>
-            </w:pPr>
-          </w:p>
-          <w:p>
-            <w:pPr>
-              <w:spacing w:after="0" w:line="240" w:lineRule="auto"/>
-              <w:rPr>
-                <w:rFonts w:ascii="DM Mono" w:hAnsi="DM Mono"/>
-                <w:sz w:val="16"/>
-                <w:szCs w:val="16"/>
-              </w:rPr>
-            </w:pPr>
-            <w:r>
-              <w:rPr>
-                <w:rFonts w:ascii="DM Mono" w:hAnsi="DM Mono"/>
-                <w:sz w:val="16"/>
-                <w:szCs w:val="16"/>
-              </w:rPr>
-              <w:t xml:space="preserve">It is also </w:t>
-            </w:r>
-            <w:proofErr w:type="gramStart"/>
-            <w:r>
-              <w:rPr>
-                <w:rFonts w:ascii="DM Mono" w:hAnsi="DM Mono"/>
-                <w:sz w:val="16"/>
-                <w:szCs w:val="16"/>
-              </w:rPr>
-              <w:t>measurable, since</w:t>
-            </w:r>
-            <w:proofErr w:type="gramEnd"/>
-            <w:r>
-              <w:rPr>
-                <w:rFonts w:ascii="DM Mono" w:hAnsi="DM Mono"/>
-                <w:sz w:val="16"/>
-                <w:szCs w:val="16"/>
-              </w:rPr>
-              <w:t xml:space="preserve"> it is binary in whether it is or </w:t>
-            </w:r>
-            <w:proofErr w:type="gramStart"/>
-            <w:r>
-              <w:rPr>
-                <w:rFonts w:ascii="DM Mono" w:hAnsi="DM Mono"/>
-                <w:sz w:val="16"/>
-                <w:szCs w:val="16"/>
-              </w:rPr>
-              <w:t>isn’t</w:t>
-            </w:r>
-            <w:proofErr w:type="gramEnd"/>
-            <w:r>
-              <w:rPr>
-                <w:rFonts w:ascii="DM Mono" w:hAnsi="DM Mono"/>
-                <w:sz w:val="16"/>
-                <w:szCs w:val="16"/>
-              </w:rPr>
-              <w:t xml:space="preserve"> implemented.</w:t>
+              <w:t>My game would require the ability for the player to move around. This forms the basis for almost all similar games, including all of which I researched prior. I did not include this idea in my survey, due to it being typical.</w:t>
+            </w:r>
+          </w:p>
+          <w:p>
+            <w:pPr>
+              <w:spacing w:after="0" w:line="240" w:lineRule="auto"/>
+              <w:rPr>
+                <w:rFonts w:ascii="DM Mono" w:eastAsia="Aptos" w:hAnsi="DM Mono"/>
+                <w:sz w:val="16"/>
+                <w:szCs w:val="16"/>
+              </w:rPr>
+            </w:pPr>
+          </w:p>
+          <w:p>
+            <w:pPr>
+              <w:spacing w:after="0" w:line="240" w:lineRule="auto"/>
+              <w:rPr>
+                <w:rFonts w:ascii="DM Mono" w:hAnsi="DM Mono"/>
+                <w:sz w:val="16"/>
+                <w:szCs w:val="16"/>
+              </w:rPr>
+            </w:pPr>
+            <w:r>
+              <w:rPr>
+                <w:rFonts w:ascii="DM Mono" w:hAnsi="DM Mono"/>
+                <w:sz w:val="16"/>
+                <w:szCs w:val="16"/>
+              </w:rPr>
+              <w:t>It is also measurable, since it is binary in whether it is or isn’t implemented.</w:t>
             </w:r>
           </w:p>
         </w:tc>
@@ -8209,43 +6735,7 @@
                 <w:sz w:val="20"/>
                 <w:szCs w:val="20"/>
               </w:rPr>
-              <w:t xml:space="preserve">It is also </w:t>
-            </w:r>
-            <w:proofErr w:type="gramStart"/>
-            <w:r>
-              <w:rPr>
-                <w:rFonts w:ascii="DM Mono" w:eastAsia="Aptos" w:hAnsi="DM Mono"/>
-                <w:sz w:val="20"/>
-                <w:szCs w:val="20"/>
-              </w:rPr>
-              <w:t>measurable, since</w:t>
-            </w:r>
-            <w:proofErr w:type="gramEnd"/>
-            <w:r>
-              <w:rPr>
-                <w:rFonts w:ascii="DM Mono" w:eastAsia="Aptos" w:hAnsi="DM Mono"/>
-                <w:sz w:val="20"/>
-                <w:szCs w:val="20"/>
-              </w:rPr>
-              <w:t xml:space="preserve"> it is binary in whether it is or </w:t>
-            </w:r>
-            <w:proofErr w:type="gramStart"/>
-            <w:r>
-              <w:rPr>
-                <w:rFonts w:ascii="DM Mono" w:eastAsia="Aptos" w:hAnsi="DM Mono"/>
-                <w:sz w:val="20"/>
-                <w:szCs w:val="20"/>
-              </w:rPr>
-              <w:t>isn’t</w:t>
-            </w:r>
-            <w:proofErr w:type="gramEnd"/>
-            <w:r>
-              <w:rPr>
-                <w:rFonts w:ascii="DM Mono" w:eastAsia="Aptos" w:hAnsi="DM Mono"/>
-                <w:sz w:val="20"/>
-                <w:szCs w:val="20"/>
-              </w:rPr>
-              <w:t xml:space="preserve"> implemented.</w:t>
+              <w:t>It is also measurable, since it is binary in whether it is or isn’t implemented.</w:t>
             </w:r>
           </w:p>
         </w:tc>
@@ -8326,25 +6816,7 @@
                 <w:szCs w:val="20"/>
               </w:rPr>
               <w:lastRenderedPageBreak/>
-              <w:t xml:space="preserve">This is </w:t>
-            </w:r>
-            <w:proofErr w:type="gramStart"/>
-            <w:r>
-              <w:rPr>
-                <w:rFonts w:ascii="DM Mono" w:eastAsia="Aptos" w:hAnsi="DM Mono"/>
-                <w:sz w:val="20"/>
-                <w:szCs w:val="20"/>
-              </w:rPr>
-              <w:t>relatively achievable</w:t>
-            </w:r>
-            <w:proofErr w:type="gramEnd"/>
-            <w:r>
-              <w:rPr>
-                <w:rFonts w:ascii="DM Mono" w:eastAsia="Aptos" w:hAnsi="DM Mono"/>
-                <w:sz w:val="20"/>
-                <w:szCs w:val="20"/>
-              </w:rPr>
-              <w:t xml:space="preserve"> and capable of </w:t>
+              <w:t xml:space="preserve">This is relatively achievable and capable of </w:t>
             </w:r>
             <w:r>
               <w:rPr>
@@ -8377,25 +6849,7 @@
                 <w:szCs w:val="20"/>
               </w:rPr>
               <w:lastRenderedPageBreak/>
-              <w:t xml:space="preserve">It is also </w:t>
-            </w:r>
-            <w:proofErr w:type="gramStart"/>
-            <w:r>
-              <w:rPr>
-                <w:rFonts w:ascii="DM Mono" w:eastAsia="Aptos" w:hAnsi="DM Mono"/>
-                <w:sz w:val="20"/>
-                <w:szCs w:val="20"/>
-              </w:rPr>
-              <w:t>measurable, since</w:t>
-            </w:r>
-            <w:proofErr w:type="gramEnd"/>
-            <w:r>
-              <w:rPr>
-                <w:rFonts w:ascii="DM Mono" w:eastAsia="Aptos" w:hAnsi="DM Mono"/>
-                <w:sz w:val="20"/>
-                <w:szCs w:val="20"/>
-              </w:rPr>
-              <w:t xml:space="preserve"> it is binary in whether </w:t>
+              <w:t xml:space="preserve">It is also measurable, since it is binary in whether </w:t>
             </w:r>
             <w:r>
               <w:rPr>
@@ -8404,25 +6858,7 @@
                 <w:szCs w:val="20"/>
               </w:rPr>
               <w:lastRenderedPageBreak/>
-              <w:t xml:space="preserve">it is or </w:t>
-            </w:r>
-            <w:proofErr w:type="gramStart"/>
-            <w:r>
-              <w:rPr>
-                <w:rFonts w:ascii="DM Mono" w:eastAsia="Aptos" w:hAnsi="DM Mono"/>
-                <w:sz w:val="20"/>
-                <w:szCs w:val="20"/>
-              </w:rPr>
-              <w:t>isn’t</w:t>
-            </w:r>
-            <w:proofErr w:type="gramEnd"/>
-            <w:r>
-              <w:rPr>
-                <w:rFonts w:ascii="DM Mono" w:eastAsia="Aptos" w:hAnsi="DM Mono"/>
-                <w:sz w:val="20"/>
-                <w:szCs w:val="20"/>
-              </w:rPr>
-              <w:t xml:space="preserve"> implemented.</w:t>
+              <w:t>it is or isn’t implemented.</w:t>
             </w:r>
           </w:p>
         </w:tc>
@@ -8471,25 +6907,7 @@
                 <w:sz w:val="20"/>
                 <w:szCs w:val="20"/>
               </w:rPr>
-              <w:t xml:space="preserve">The ability for the fighter to punch or </w:t>
-            </w:r>
-            <w:proofErr w:type="gramStart"/>
-            <w:r>
-              <w:rPr>
-                <w:rFonts w:ascii="DM Mono" w:eastAsia="Aptos" w:hAnsi="DM Mono"/>
-                <w:sz w:val="20"/>
-                <w:szCs w:val="20"/>
-              </w:rPr>
-              <w:t>be punched</w:t>
-            </w:r>
-            <w:proofErr w:type="gramEnd"/>
-            <w:r>
-              <w:rPr>
-                <w:rFonts w:ascii="DM Mono" w:eastAsia="Aptos" w:hAnsi="DM Mono"/>
-                <w:sz w:val="20"/>
-                <w:szCs w:val="20"/>
-              </w:rPr>
-              <w:t xml:space="preserve"> by the enemy.</w:t>
+              <w:t>The ability for the fighter to punch or be punched by the enemy.</w:t>
             </w:r>
           </w:p>
         </w:tc>
@@ -8512,25 +6930,7 @@
                 <w:sz w:val="20"/>
                 <w:szCs w:val="20"/>
               </w:rPr>
-              <w:t xml:space="preserve">This is an incredibly basic mechanic, involved in </w:t>
-            </w:r>
-            <w:proofErr w:type="gramStart"/>
-            <w:r>
-              <w:rPr>
-                <w:rFonts w:ascii="DM Mono" w:eastAsia="Aptos" w:hAnsi="DM Mono"/>
-                <w:sz w:val="20"/>
-                <w:szCs w:val="20"/>
-              </w:rPr>
-              <w:t>almost all</w:t>
-            </w:r>
-            <w:proofErr w:type="gramEnd"/>
-            <w:r>
-              <w:rPr>
-                <w:rFonts w:ascii="DM Mono" w:eastAsia="Aptos" w:hAnsi="DM Mono"/>
-                <w:sz w:val="20"/>
-                <w:szCs w:val="20"/>
-              </w:rPr>
-              <w:t xml:space="preserve"> market competitors. It would allow the very basis of a fighting game.</w:t>
+              <w:t>This is an incredibly basic mechanic, involved in almost all market competitors. It would allow the very basis of a fighting game.</w:t>
             </w:r>
           </w:p>
         </w:tc>
@@ -8553,43 +6953,7 @@
                 <w:sz w:val="20"/>
                 <w:szCs w:val="20"/>
               </w:rPr>
-              <w:t xml:space="preserve">It is also </w:t>
-            </w:r>
-            <w:proofErr w:type="gramStart"/>
-            <w:r>
-              <w:rPr>
-                <w:rFonts w:ascii="DM Mono" w:eastAsia="Aptos" w:hAnsi="DM Mono"/>
-                <w:sz w:val="20"/>
-                <w:szCs w:val="20"/>
-              </w:rPr>
-              <w:t>measurable, since</w:t>
-            </w:r>
-            <w:proofErr w:type="gramEnd"/>
-            <w:r>
-              <w:rPr>
-                <w:rFonts w:ascii="DM Mono" w:eastAsia="Aptos" w:hAnsi="DM Mono"/>
-                <w:sz w:val="20"/>
-                <w:szCs w:val="20"/>
-              </w:rPr>
-              <w:t xml:space="preserve"> it is binary in whether it is or </w:t>
-            </w:r>
-            <w:proofErr w:type="gramStart"/>
-            <w:r>
-              <w:rPr>
-                <w:rFonts w:ascii="DM Mono" w:eastAsia="Aptos" w:hAnsi="DM Mono"/>
-                <w:sz w:val="20"/>
-                <w:szCs w:val="20"/>
-              </w:rPr>
-              <w:t>isn’t</w:t>
-            </w:r>
-            <w:proofErr w:type="gramEnd"/>
-            <w:r>
-              <w:rPr>
-                <w:rFonts w:ascii="DM Mono" w:eastAsia="Aptos" w:hAnsi="DM Mono"/>
-                <w:sz w:val="20"/>
-                <w:szCs w:val="20"/>
-              </w:rPr>
-              <w:t xml:space="preserve"> implemented.</w:t>
+              <w:t>It is also measurable, since it is binary in whether it is or isn’t implemented.</w:t>
             </w:r>
           </w:p>
         </w:tc>
@@ -8660,43 +7024,7 @@
                 <w:sz w:val="20"/>
                 <w:szCs w:val="20"/>
               </w:rPr>
-              <w:t xml:space="preserve">This would add a variance to the fighting, with certain moves </w:t>
-            </w:r>
-            <w:proofErr w:type="gramStart"/>
-            <w:r>
-              <w:rPr>
-                <w:rFonts w:ascii="DM Mono" w:eastAsia="Aptos" w:hAnsi="DM Mono"/>
-                <w:sz w:val="20"/>
-                <w:szCs w:val="20"/>
-              </w:rPr>
-              <w:t>being best applied</w:t>
-            </w:r>
-            <w:proofErr w:type="gramEnd"/>
-            <w:r>
-              <w:rPr>
-                <w:rFonts w:ascii="DM Mono" w:eastAsia="Aptos" w:hAnsi="DM Mono"/>
-                <w:sz w:val="20"/>
-                <w:szCs w:val="20"/>
-              </w:rPr>
-              <w:t xml:space="preserve"> under differing circumstances. Furthermore, its implementation would </w:t>
-            </w:r>
-            <w:proofErr w:type="gramStart"/>
-            <w:r>
-              <w:rPr>
-                <w:rFonts w:ascii="DM Mono" w:eastAsia="Aptos" w:hAnsi="DM Mono"/>
-                <w:sz w:val="20"/>
-                <w:szCs w:val="20"/>
-              </w:rPr>
-              <w:t>be held</w:t>
-            </w:r>
-            <w:proofErr w:type="gramEnd"/>
-            <w:r>
-              <w:rPr>
-                <w:rFonts w:ascii="DM Mono" w:eastAsia="Aptos" w:hAnsi="DM Mono"/>
-                <w:sz w:val="20"/>
-                <w:szCs w:val="20"/>
-              </w:rPr>
-              <w:t xml:space="preserve"> back only by a changing of the attributes of it.</w:t>
+              <w:t>This would add a variance to the fighting, with certain moves being best applied under differing circumstances. Furthermore, its implementation would be held back only by a changing of the attributes of it.</w:t>
             </w:r>
           </w:p>
         </w:tc>
@@ -8719,43 +7047,7 @@
                 <w:sz w:val="20"/>
                 <w:szCs w:val="20"/>
               </w:rPr>
-              <w:t xml:space="preserve">It is also </w:t>
-            </w:r>
-            <w:proofErr w:type="gramStart"/>
-            <w:r>
-              <w:rPr>
-                <w:rFonts w:ascii="DM Mono" w:eastAsia="Aptos" w:hAnsi="DM Mono"/>
-                <w:sz w:val="20"/>
-                <w:szCs w:val="20"/>
-              </w:rPr>
-              <w:t>measurable, since</w:t>
-            </w:r>
-            <w:proofErr w:type="gramEnd"/>
-            <w:r>
-              <w:rPr>
-                <w:rFonts w:ascii="DM Mono" w:eastAsia="Aptos" w:hAnsi="DM Mono"/>
-                <w:sz w:val="20"/>
-                <w:szCs w:val="20"/>
-              </w:rPr>
-              <w:t xml:space="preserve"> it is binary in whether it is or </w:t>
-            </w:r>
-            <w:proofErr w:type="gramStart"/>
-            <w:r>
-              <w:rPr>
-                <w:rFonts w:ascii="DM Mono" w:eastAsia="Aptos" w:hAnsi="DM Mono"/>
-                <w:sz w:val="20"/>
-                <w:szCs w:val="20"/>
-              </w:rPr>
-              <w:t>isn’t</w:t>
-            </w:r>
-            <w:proofErr w:type="gramEnd"/>
-            <w:r>
-              <w:rPr>
-                <w:rFonts w:ascii="DM Mono" w:eastAsia="Aptos" w:hAnsi="DM Mono"/>
-                <w:sz w:val="20"/>
-                <w:szCs w:val="20"/>
-              </w:rPr>
-              <w:t xml:space="preserve"> implemented.</w:t>
+              <w:t>It is also measurable, since it is binary in whether it is or isn’t implemented.</w:t>
             </w:r>
           </w:p>
           <w:p>
@@ -8859,43 +7151,7 @@
                 <w:sz w:val="20"/>
                 <w:szCs w:val="20"/>
               </w:rPr>
-              <w:t xml:space="preserve">It is also </w:t>
-            </w:r>
-            <w:proofErr w:type="gramStart"/>
-            <w:r>
-              <w:rPr>
-                <w:rFonts w:ascii="DM Mono" w:eastAsia="Aptos" w:hAnsi="DM Mono"/>
-                <w:sz w:val="20"/>
-                <w:szCs w:val="20"/>
-              </w:rPr>
-              <w:t>measurable, since</w:t>
-            </w:r>
-            <w:proofErr w:type="gramEnd"/>
-            <w:r>
-              <w:rPr>
-                <w:rFonts w:ascii="DM Mono" w:eastAsia="Aptos" w:hAnsi="DM Mono"/>
-                <w:sz w:val="20"/>
-                <w:szCs w:val="20"/>
-              </w:rPr>
-              <w:t xml:space="preserve"> it is binary in whether it is or </w:t>
-            </w:r>
-            <w:proofErr w:type="gramStart"/>
-            <w:r>
-              <w:rPr>
-                <w:rFonts w:ascii="DM Mono" w:eastAsia="Aptos" w:hAnsi="DM Mono"/>
-                <w:sz w:val="20"/>
-                <w:szCs w:val="20"/>
-              </w:rPr>
-              <w:t>isn’t</w:t>
-            </w:r>
-            <w:proofErr w:type="gramEnd"/>
-            <w:r>
-              <w:rPr>
-                <w:rFonts w:ascii="DM Mono" w:eastAsia="Aptos" w:hAnsi="DM Mono"/>
-                <w:sz w:val="20"/>
-                <w:szCs w:val="20"/>
-              </w:rPr>
-              <w:t xml:space="preserve"> implemented.</w:t>
+              <w:t>It is also measurable, since it is binary in whether it is or isn’t implemented.</w:t>
             </w:r>
           </w:p>
         </w:tc>
@@ -8943,25 +7199,7 @@
                 <w:sz w:val="20"/>
                 <w:szCs w:val="20"/>
               </w:rPr>
-              <w:t xml:space="preserve">A simple menu screen item being a start button, with the power to start the game upon </w:t>
-            </w:r>
-            <w:proofErr w:type="gramStart"/>
-            <w:r>
-              <w:rPr>
-                <w:rFonts w:ascii="DM Mono" w:eastAsia="Aptos" w:hAnsi="DM Mono"/>
-                <w:sz w:val="20"/>
-                <w:szCs w:val="20"/>
-              </w:rPr>
-              <w:t>being clicked</w:t>
-            </w:r>
-            <w:proofErr w:type="gramEnd"/>
-            <w:r>
-              <w:rPr>
-                <w:rFonts w:ascii="DM Mono" w:eastAsia="Aptos" w:hAnsi="DM Mono"/>
-                <w:sz w:val="20"/>
-                <w:szCs w:val="20"/>
-              </w:rPr>
-              <w:t>.</w:t>
+              <w:t>A simple menu screen item being a start button, with the power to start the game upon being clicked.</w:t>
             </w:r>
           </w:p>
         </w:tc>
@@ -8984,43 +7222,7 @@
                 <w:sz w:val="20"/>
                 <w:szCs w:val="20"/>
               </w:rPr>
-              <w:t xml:space="preserve">This allows the user </w:t>
-            </w:r>
-            <w:proofErr w:type="gramStart"/>
-            <w:r>
-              <w:rPr>
-                <w:rFonts w:ascii="DM Mono" w:eastAsia="Aptos" w:hAnsi="DM Mono"/>
-                <w:sz w:val="20"/>
-                <w:szCs w:val="20"/>
-              </w:rPr>
-              <w:t>to  take</w:t>
-            </w:r>
-            <w:proofErr w:type="gramEnd"/>
-            <w:r>
-              <w:rPr>
-                <w:rFonts w:ascii="DM Mono" w:eastAsia="Aptos" w:hAnsi="DM Mono"/>
-                <w:sz w:val="20"/>
-                <w:szCs w:val="20"/>
-              </w:rPr>
-              <w:t xml:space="preserve"> agency over the starting of the game. The alternative would force the user to focus immediately after launching the game, where the fight would start as soon as it opens. This would be incredibly difficult and hence shall </w:t>
-            </w:r>
-            <w:proofErr w:type="gramStart"/>
-            <w:r>
-              <w:rPr>
-                <w:rFonts w:ascii="DM Mono" w:eastAsia="Aptos" w:hAnsi="DM Mono"/>
-                <w:sz w:val="20"/>
-                <w:szCs w:val="20"/>
-              </w:rPr>
-              <w:t>be thwarted</w:t>
-            </w:r>
-            <w:proofErr w:type="gramEnd"/>
-            <w:r>
-              <w:rPr>
-                <w:rFonts w:ascii="DM Mono" w:eastAsia="Aptos" w:hAnsi="DM Mono"/>
-                <w:sz w:val="20"/>
-                <w:szCs w:val="20"/>
-              </w:rPr>
-              <w:t>.</w:t>
+              <w:t>This allows the user to  take agency over the starting of the game. The alternative would force the user to focus immediately after launching the game, where the fight would start as soon as it opens. This would be incredibly difficult and hence shall be thwarted.</w:t>
             </w:r>
           </w:p>
         </w:tc>
@@ -9043,43 +7245,7 @@
                 <w:sz w:val="20"/>
                 <w:szCs w:val="20"/>
               </w:rPr>
-              <w:t xml:space="preserve">It is also </w:t>
-            </w:r>
-            <w:proofErr w:type="gramStart"/>
-            <w:r>
-              <w:rPr>
-                <w:rFonts w:ascii="DM Mono" w:eastAsia="Aptos" w:hAnsi="DM Mono"/>
-                <w:sz w:val="20"/>
-                <w:szCs w:val="20"/>
-              </w:rPr>
-              <w:t>measurable, since</w:t>
-            </w:r>
-            <w:proofErr w:type="gramEnd"/>
-            <w:r>
-              <w:rPr>
-                <w:rFonts w:ascii="DM Mono" w:eastAsia="Aptos" w:hAnsi="DM Mono"/>
-                <w:sz w:val="20"/>
-                <w:szCs w:val="20"/>
-              </w:rPr>
-              <w:t xml:space="preserve"> it is binary in whether it is or </w:t>
-            </w:r>
-            <w:proofErr w:type="gramStart"/>
-            <w:r>
-              <w:rPr>
-                <w:rFonts w:ascii="DM Mono" w:eastAsia="Aptos" w:hAnsi="DM Mono"/>
-                <w:sz w:val="20"/>
-                <w:szCs w:val="20"/>
-              </w:rPr>
-              <w:t>isn’t</w:t>
-            </w:r>
-            <w:proofErr w:type="gramEnd"/>
-            <w:r>
-              <w:rPr>
-                <w:rFonts w:ascii="DM Mono" w:eastAsia="Aptos" w:hAnsi="DM Mono"/>
-                <w:sz w:val="20"/>
-                <w:szCs w:val="20"/>
-              </w:rPr>
-              <w:t xml:space="preserve"> implemented.</w:t>
+              <w:t>It is also measurable, since it is binary in whether it is or isn’t implemented.</w:t>
             </w:r>
           </w:p>
         </w:tc>
@@ -9173,43 +7339,7 @@
                 <w:sz w:val="20"/>
                 <w:szCs w:val="20"/>
               </w:rPr>
-              <w:t xml:space="preserve">It is also </w:t>
-            </w:r>
-            <w:proofErr w:type="gramStart"/>
-            <w:r>
-              <w:rPr>
-                <w:rFonts w:ascii="DM Mono" w:eastAsia="Aptos" w:hAnsi="DM Mono"/>
-                <w:sz w:val="20"/>
-                <w:szCs w:val="20"/>
-              </w:rPr>
-              <w:t>measurable, since</w:t>
-            </w:r>
-            <w:proofErr w:type="gramEnd"/>
-            <w:r>
-              <w:rPr>
-                <w:rFonts w:ascii="DM Mono" w:eastAsia="Aptos" w:hAnsi="DM Mono"/>
-                <w:sz w:val="20"/>
-                <w:szCs w:val="20"/>
-              </w:rPr>
-              <w:t xml:space="preserve"> it is binary in whether it is or </w:t>
-            </w:r>
-            <w:proofErr w:type="gramStart"/>
-            <w:r>
-              <w:rPr>
-                <w:rFonts w:ascii="DM Mono" w:eastAsia="Aptos" w:hAnsi="DM Mono"/>
-                <w:sz w:val="20"/>
-                <w:szCs w:val="20"/>
-              </w:rPr>
-              <w:t>isn’t</w:t>
-            </w:r>
-            <w:proofErr w:type="gramEnd"/>
-            <w:r>
-              <w:rPr>
-                <w:rFonts w:ascii="DM Mono" w:eastAsia="Aptos" w:hAnsi="DM Mono"/>
-                <w:sz w:val="20"/>
-                <w:szCs w:val="20"/>
-              </w:rPr>
-              <w:t xml:space="preserve"> implemented.</w:t>
+              <w:t>It is also measurable, since it is binary in whether it is or isn’t implemented.</w:t>
             </w:r>
           </w:p>
         </w:tc>
@@ -9303,43 +7433,7 @@
                 <w:sz w:val="20"/>
                 <w:szCs w:val="20"/>
               </w:rPr>
-              <w:t xml:space="preserve">It is also </w:t>
-            </w:r>
-            <w:proofErr w:type="gramStart"/>
-            <w:r>
-              <w:rPr>
-                <w:rFonts w:ascii="DM Mono" w:eastAsia="Aptos" w:hAnsi="DM Mono"/>
-                <w:sz w:val="20"/>
-                <w:szCs w:val="20"/>
-              </w:rPr>
-              <w:t>measurable, since</w:t>
-            </w:r>
-            <w:proofErr w:type="gramEnd"/>
-            <w:r>
-              <w:rPr>
-                <w:rFonts w:ascii="DM Mono" w:eastAsia="Aptos" w:hAnsi="DM Mono"/>
-                <w:sz w:val="20"/>
-                <w:szCs w:val="20"/>
-              </w:rPr>
-              <w:t xml:space="preserve"> it is binary in whether it is or </w:t>
-            </w:r>
-            <w:proofErr w:type="gramStart"/>
-            <w:r>
-              <w:rPr>
-                <w:rFonts w:ascii="DM Mono" w:eastAsia="Aptos" w:hAnsi="DM Mono"/>
-                <w:sz w:val="20"/>
-                <w:szCs w:val="20"/>
-              </w:rPr>
-              <w:t>isn’t</w:t>
-            </w:r>
-            <w:proofErr w:type="gramEnd"/>
-            <w:r>
-              <w:rPr>
-                <w:rFonts w:ascii="DM Mono" w:eastAsia="Aptos" w:hAnsi="DM Mono"/>
-                <w:sz w:val="20"/>
-                <w:szCs w:val="20"/>
-              </w:rPr>
-              <w:t xml:space="preserve"> implemented.</w:t>
+              <w:t>It is also measurable, since it is binary in whether it is or isn’t implemented.</w:t>
             </w:r>
           </w:p>
         </w:tc>
@@ -9487,25 +7581,7 @@
                 <w:sz w:val="20"/>
                 <w:szCs w:val="20"/>
               </w:rPr>
-              <w:t xml:space="preserve">The animation of characters performing moves such as punches or </w:t>
-            </w:r>
-            <w:proofErr w:type="gramStart"/>
-            <w:r>
-              <w:rPr>
-                <w:rFonts w:ascii="DM Mono" w:eastAsia="Aptos" w:hAnsi="DM Mono"/>
-                <w:sz w:val="20"/>
-                <w:szCs w:val="20"/>
-              </w:rPr>
-              <w:t>being hit</w:t>
-            </w:r>
-            <w:proofErr w:type="gramEnd"/>
-            <w:r>
-              <w:rPr>
-                <w:rFonts w:ascii="DM Mono" w:eastAsia="Aptos" w:hAnsi="DM Mono"/>
-                <w:sz w:val="20"/>
-                <w:szCs w:val="20"/>
-              </w:rPr>
-              <w:t>.</w:t>
+              <w:t>The animation of characters performing moves such as punches or being hit.</w:t>
             </w:r>
           </w:p>
         </w:tc>
@@ -9528,25 +7604,7 @@
                 <w:sz w:val="20"/>
                 <w:szCs w:val="20"/>
               </w:rPr>
-              <w:t xml:space="preserve">This could be quite difficult as both are situationally dependant. Furthermore, most IDEs ideal for this project such as Greenfoot, have no </w:t>
-            </w:r>
-            <w:proofErr w:type="gramStart"/>
-            <w:r>
-              <w:rPr>
-                <w:rFonts w:ascii="DM Mono" w:eastAsia="Aptos" w:hAnsi="DM Mono"/>
-                <w:sz w:val="20"/>
-                <w:szCs w:val="20"/>
-              </w:rPr>
-              <w:t>built in</w:t>
-            </w:r>
-            <w:proofErr w:type="gramEnd"/>
-            <w:r>
-              <w:rPr>
-                <w:rFonts w:ascii="DM Mono" w:eastAsia="Aptos" w:hAnsi="DM Mono"/>
-                <w:sz w:val="20"/>
-                <w:szCs w:val="20"/>
-              </w:rPr>
-              <w:t xml:space="preserve"> animation feature. </w:t>
+              <w:t xml:space="preserve">This could be quite difficult as both are situationally dependant. Furthermore, most IDEs ideal for this project such as Greenfoot, have no built in animation feature. </w:t>
             </w:r>
           </w:p>
         </w:tc>
@@ -9569,43 +7627,7 @@
                 <w:sz w:val="20"/>
                 <w:szCs w:val="20"/>
               </w:rPr>
-              <w:t xml:space="preserve">I could </w:t>
-            </w:r>
-            <w:proofErr w:type="gramStart"/>
-            <w:r>
-              <w:rPr>
-                <w:rFonts w:ascii="DM Mono" w:eastAsia="Aptos" w:hAnsi="DM Mono"/>
-                <w:sz w:val="20"/>
-                <w:szCs w:val="20"/>
-              </w:rPr>
-              <w:t>possible</w:t>
-            </w:r>
-            <w:proofErr w:type="gramEnd"/>
-            <w:r>
-              <w:rPr>
-                <w:rFonts w:ascii="DM Mono" w:eastAsia="Aptos" w:hAnsi="DM Mono"/>
-                <w:sz w:val="20"/>
-                <w:szCs w:val="20"/>
-              </w:rPr>
-              <w:t xml:space="preserve"> work around this by changing the character sprites in rapid succession, but this could still prove difficult. Even by doing this, it would still be </w:t>
-            </w:r>
-            <w:proofErr w:type="gramStart"/>
-            <w:r>
-              <w:rPr>
-                <w:rFonts w:ascii="DM Mono" w:eastAsia="Aptos" w:hAnsi="DM Mono"/>
-                <w:sz w:val="20"/>
-                <w:szCs w:val="20"/>
-              </w:rPr>
-              <w:t>very difficult</w:t>
-            </w:r>
-            <w:proofErr w:type="gramEnd"/>
-            <w:r>
-              <w:rPr>
-                <w:rFonts w:ascii="DM Mono" w:eastAsia="Aptos" w:hAnsi="DM Mono"/>
-                <w:sz w:val="20"/>
-                <w:szCs w:val="20"/>
-              </w:rPr>
-              <w:t xml:space="preserve"> to have appropriate reactions.</w:t>
+              <w:t>I could possible work around this by changing the character sprites in rapid succession, but this could still prove difficult. Even by doing this, it would still be very difficult to have appropriate reactions.</w:t>
             </w:r>
           </w:p>
         </w:tc>
@@ -9659,25 +7681,7 @@
                 <w:sz w:val="20"/>
                 <w:szCs w:val="20"/>
               </w:rPr>
-              <w:t xml:space="preserve">This is again down to the issue of animation. In addition, I would like the bar to increment </w:t>
-            </w:r>
-            <w:proofErr w:type="gramStart"/>
-            <w:r>
-              <w:rPr>
-                <w:rFonts w:ascii="DM Mono" w:eastAsia="Aptos" w:hAnsi="DM Mono"/>
-                <w:sz w:val="20"/>
-                <w:szCs w:val="20"/>
-              </w:rPr>
-              <w:t>exponentially, yet</w:t>
-            </w:r>
-            <w:proofErr w:type="gramEnd"/>
-            <w:r>
-              <w:rPr>
-                <w:rFonts w:ascii="DM Mono" w:eastAsia="Aptos" w:hAnsi="DM Mono"/>
-                <w:sz w:val="20"/>
-                <w:szCs w:val="20"/>
-              </w:rPr>
-              <w:t xml:space="preserve"> stop if it depletes further.</w:t>
+              <w:t>This is again down to the issue of animation. In addition, I would like the bar to increment exponentially, yet stop if it depletes further.</w:t>
             </w:r>
           </w:p>
         </w:tc>
@@ -9721,79 +7725,25 @@
                 <w:sz w:val="20"/>
                 <w:szCs w:val="20"/>
               </w:rPr>
-              <w:t>`increase=(amount+</w:t>
-            </w:r>
-            <w:proofErr w:type="gramStart"/>
-            <w:r>
-              <w:rPr>
-                <w:rFonts w:ascii="DM Mono" w:hAnsi="DM Mono"/>
-                <w:sz w:val="20"/>
-                <w:szCs w:val="20"/>
-              </w:rPr>
-              <w:t>1)^</w:t>
-            </w:r>
-            <w:proofErr w:type="gramEnd"/>
-            <w:r>
-              <w:rPr>
-                <w:rFonts w:ascii="DM Mono" w:hAnsi="DM Mono"/>
-                <w:sz w:val="20"/>
-                <w:szCs w:val="20"/>
-              </w:rPr>
-              <w:t>2`</w:t>
-            </w:r>
-          </w:p>
-          <w:p>
-            <w:pPr>
-              <w:spacing w:after="0" w:line="240" w:lineRule="auto"/>
-              <w:rPr>
-                <w:rFonts w:ascii="DM Mono" w:hAnsi="DM Mono"/>
-                <w:sz w:val="20"/>
-                <w:szCs w:val="20"/>
-              </w:rPr>
-            </w:pPr>
-            <w:r>
-              <w:rPr>
-                <w:rFonts w:ascii="DM Mono" w:hAnsi="DM Mono"/>
-                <w:sz w:val="20"/>
-                <w:szCs w:val="20"/>
-              </w:rPr>
-              <w:t xml:space="preserve">where amount starts as </w:t>
-            </w:r>
-            <w:proofErr w:type="gramStart"/>
-            <w:r>
-              <w:rPr>
-                <w:rFonts w:ascii="DM Mono" w:hAnsi="DM Mono"/>
-                <w:sz w:val="20"/>
-                <w:szCs w:val="20"/>
-              </w:rPr>
-              <w:t>0</w:t>
-            </w:r>
-            <w:proofErr w:type="gramEnd"/>
-            <w:r>
-              <w:rPr>
-                <w:rFonts w:ascii="DM Mono" w:hAnsi="DM Mono"/>
-                <w:sz w:val="20"/>
-                <w:szCs w:val="20"/>
-              </w:rPr>
-              <w:t xml:space="preserve"> and the above </w:t>
-            </w:r>
-            <w:proofErr w:type="gramStart"/>
-            <w:r>
-              <w:rPr>
-                <w:rFonts w:ascii="DM Mono" w:hAnsi="DM Mono"/>
-                <w:sz w:val="20"/>
-                <w:szCs w:val="20"/>
-              </w:rPr>
-              <w:t>is called</w:t>
-            </w:r>
-            <w:proofErr w:type="gramEnd"/>
-            <w:r>
-              <w:rPr>
-                <w:rFonts w:ascii="DM Mono" w:hAnsi="DM Mono"/>
-                <w:sz w:val="20"/>
-                <w:szCs w:val="20"/>
-              </w:rPr>
-              <w:t xml:space="preserve"> after a recovery time.</w:t>
+              <w:t>`increase=(amount+1)^2`</w:t>
+            </w:r>
+          </w:p>
+          <w:p>
+            <w:pPr>
+              <w:spacing w:after="0" w:line="240" w:lineRule="auto"/>
+              <w:rPr>
+                <w:rFonts w:ascii="DM Mono" w:hAnsi="DM Mono"/>
+                <w:sz w:val="20"/>
+                <w:szCs w:val="20"/>
+              </w:rPr>
+            </w:pPr>
+            <w:r>
+              <w:rPr>
+                <w:rFonts w:ascii="DM Mono" w:hAnsi="DM Mono"/>
+                <w:sz w:val="20"/>
+                <w:szCs w:val="20"/>
+              </w:rPr>
+              <w:t>where amount starts as 0 and the above is called after a recovery time.</w:t>
             </w:r>
           </w:p>
         </w:tc>
@@ -9821,25 +7771,7 @@
                 <w:sz w:val="20"/>
                 <w:szCs w:val="20"/>
               </w:rPr>
-              <w:t xml:space="preserve">Initiating the game only upon the start button </w:t>
-            </w:r>
-            <w:proofErr w:type="gramStart"/>
-            <w:r>
-              <w:rPr>
-                <w:rFonts w:ascii="DM Mono" w:hAnsi="DM Mono"/>
-                <w:sz w:val="20"/>
-                <w:szCs w:val="20"/>
-              </w:rPr>
-              <w:t>being pressed</w:t>
-            </w:r>
-            <w:proofErr w:type="gramEnd"/>
-            <w:r>
-              <w:rPr>
-                <w:rFonts w:ascii="DM Mono" w:hAnsi="DM Mono"/>
-                <w:sz w:val="20"/>
-                <w:szCs w:val="20"/>
-              </w:rPr>
-              <w:t xml:space="preserve"> in older IDEs such as Greenfoot.</w:t>
+              <w:t>Initiating the game only upon the start button being pressed in older IDEs such as Greenfoot.</w:t>
             </w:r>
           </w:p>
         </w:tc>
@@ -9865,25 +7797,7 @@
                 <w:sz w:val="20"/>
                 <w:szCs w:val="20"/>
               </w:rPr>
-              <w:t xml:space="preserve">I think that this could be an issue due to the nature of how my enemy would work. I would use a stop function, but this would inhibit any input </w:t>
-            </w:r>
-            <w:proofErr w:type="gramStart"/>
-            <w:r>
-              <w:rPr>
-                <w:rFonts w:ascii="DM Mono" w:hAnsi="DM Mono"/>
-                <w:sz w:val="20"/>
-                <w:szCs w:val="20"/>
-              </w:rPr>
-              <w:t>being detected</w:t>
-            </w:r>
-            <w:proofErr w:type="gramEnd"/>
-            <w:r>
-              <w:rPr>
-                <w:rFonts w:ascii="DM Mono" w:hAnsi="DM Mono"/>
-                <w:sz w:val="20"/>
-                <w:szCs w:val="20"/>
-              </w:rPr>
-              <w:t xml:space="preserve"> and thus render the game unplayable.</w:t>
+              <w:t>I think that this could be an issue due to the nature of how my enemy would work. I would use a stop function, but this would inhibit any input being detected and thus render the game unplayable.</w:t>
             </w:r>
           </w:p>
         </w:tc>
@@ -9909,25 +7823,7 @@
                 <w:sz w:val="20"/>
                 <w:szCs w:val="20"/>
               </w:rPr>
-              <w:t xml:space="preserve">I could either have two different scenes or blocks of code, or if I were to use Greenfoot, have two separate worlds. This would allow a flexibility that I </w:t>
-            </w:r>
-            <w:proofErr w:type="gramStart"/>
-            <w:r>
-              <w:rPr>
-                <w:rFonts w:ascii="DM Mono" w:hAnsi="DM Mono"/>
-                <w:sz w:val="20"/>
-                <w:szCs w:val="20"/>
-              </w:rPr>
-              <w:t>would otherwise not have,</w:t>
-            </w:r>
-            <w:proofErr w:type="gramEnd"/>
-            <w:r>
-              <w:rPr>
-                <w:rFonts w:ascii="DM Mono" w:hAnsi="DM Mono"/>
-                <w:sz w:val="20"/>
-                <w:szCs w:val="20"/>
-              </w:rPr>
-              <w:t xml:space="preserve"> at the cost of not having the same background without interfering.</w:t>
+              <w:t>I could either have two different scenes or blocks of code, or if I were to use Greenfoot, have two separate worlds. This would allow a flexibility that I would otherwise not have, at the cost of not having the same background without interfering.</w:t>
             </w:r>
           </w:p>
         </w:tc>
@@ -9975,23 +7871,13 @@
                 <w:szCs w:val="20"/>
               </w:rPr>
             </w:pPr>
-            <w:proofErr w:type="gramStart"/>
-            <w:r>
-              <w:rPr>
-                <w:rFonts w:ascii="DM Mono" w:hAnsi="DM Mono"/>
-                <w:sz w:val="20"/>
-                <w:szCs w:val="20"/>
-              </w:rPr>
-              <w:t>Similar to</w:t>
-            </w:r>
-            <w:proofErr w:type="gramEnd"/>
-            <w:r>
-              <w:rPr>
-                <w:rFonts w:ascii="DM Mono" w:hAnsi="DM Mono"/>
-                <w:sz w:val="20"/>
-                <w:szCs w:val="20"/>
-              </w:rPr>
-              <w:t xml:space="preserve"> the above, it could be difficult to pause the game and take necessary inputs to affect the state of the game.</w:t>
+            <w:r>
+              <w:rPr>
+                <w:rFonts w:ascii="DM Mono" w:hAnsi="DM Mono"/>
+                <w:sz w:val="20"/>
+                <w:szCs w:val="20"/>
+              </w:rPr>
+              <w:t>Similar to the above, it could be difficult to pause the game and take necessary inputs to affect the state of the game.</w:t>
             </w:r>
           </w:p>
         </w:tc>
@@ -10076,25 +7962,7 @@
           <w:sz w:val="20"/>
           <w:szCs w:val="20"/>
         </w:rPr>
-        <w:t xml:space="preserve"> version 3.9.0. For the distribution targeted at major Linux based operating systems, a specific CPU </w:t>
-      </w:r>
-      <w:proofErr w:type="gramStart"/>
-      <w:r>
-        <w:rPr>
-          <w:rFonts w:ascii="DM Mono" w:hAnsi="DM Mono"/>
-          <w:sz w:val="20"/>
-          <w:szCs w:val="20"/>
-        </w:rPr>
-        <w:t>is not required</w:t>
-      </w:r>
-      <w:proofErr w:type="gramEnd"/>
-      <w:r>
-        <w:rPr>
-          <w:rFonts w:ascii="DM Mono" w:hAnsi="DM Mono"/>
-          <w:sz w:val="20"/>
-          <w:szCs w:val="20"/>
-        </w:rPr>
-        <w:t>.</w:t>
+        <w:t xml:space="preserve"> version 3.9.0. For the distribution targeted at major Linux based operating systems, a specific CPU is not required.</w:t>
       </w:r>
       <w:r>
         <w:rPr>
@@ -10143,25 +8011,7 @@
           <w:sz w:val="20"/>
           <w:szCs w:val="20"/>
         </w:rPr>
-        <w:t xml:space="preserve">The screen of this device is not of </w:t>
-      </w:r>
-      <w:proofErr w:type="gramStart"/>
-      <w:r>
-        <w:rPr>
-          <w:rFonts w:ascii="DM Mono" w:hAnsi="DM Mono"/>
-          <w:sz w:val="20"/>
-          <w:szCs w:val="20"/>
-        </w:rPr>
-        <w:t>great importance</w:t>
-      </w:r>
-      <w:proofErr w:type="gramEnd"/>
-      <w:r>
-        <w:rPr>
-          <w:rFonts w:ascii="DM Mono" w:hAnsi="DM Mono"/>
-          <w:sz w:val="20"/>
-          <w:szCs w:val="20"/>
-        </w:rPr>
-        <w:t>, due to its pixelated graphics</w:t>
+        <w:t>The screen of this device is not of great importance, due to its pixelated graphics</w:t>
       </w:r>
       <w:r>
         <w:rPr>
@@ -10242,25 +8092,7 @@
           <w:sz w:val="20"/>
           <w:szCs w:val="20"/>
         </w:rPr>
-        <w:t xml:space="preserve"> Installing Greenfoot itself is free and works graphically with </w:t>
-      </w:r>
-      <w:proofErr w:type="gramStart"/>
-      <w:r>
-        <w:rPr>
-          <w:rFonts w:ascii="DM Mono" w:hAnsi="DM Mono"/>
-          <w:sz w:val="20"/>
-          <w:szCs w:val="20"/>
-        </w:rPr>
-        <w:t>almost all</w:t>
-      </w:r>
-      <w:proofErr w:type="gramEnd"/>
-      <w:r>
-        <w:rPr>
-          <w:rFonts w:ascii="DM Mono" w:hAnsi="DM Mono"/>
-          <w:sz w:val="20"/>
-          <w:szCs w:val="20"/>
-        </w:rPr>
-        <w:t xml:space="preserve"> desktop environments such as KDE Plasma or Gnome. On more advanced environments such as Hyprland, external tools and </w:t>
+        <w:t xml:space="preserve"> Installing Greenfoot itself is free and works graphically with almost all desktop environments such as KDE Plasma or Gnome. On more advanced environments such as Hyprland, external tools and </w:t>
       </w:r>
       <w:r>
         <w:rPr>
@@ -10276,25 +8108,7 @@
           <w:sz w:val="20"/>
           <w:szCs w:val="20"/>
         </w:rPr>
-        <w:t xml:space="preserve"> may need to </w:t>
-      </w:r>
-      <w:proofErr w:type="gramStart"/>
-      <w:r>
-        <w:rPr>
-          <w:rFonts w:ascii="DM Mono" w:hAnsi="DM Mono"/>
-          <w:sz w:val="20"/>
-          <w:szCs w:val="20"/>
-        </w:rPr>
-        <w:t>be installed</w:t>
-      </w:r>
-      <w:proofErr w:type="gramEnd"/>
-      <w:r>
-        <w:rPr>
-          <w:rFonts w:ascii="DM Mono" w:hAnsi="DM Mono"/>
-          <w:sz w:val="20"/>
-          <w:szCs w:val="20"/>
-        </w:rPr>
-        <w:t xml:space="preserve"> for a smoother experience.</w:t>
+        <w:t xml:space="preserve"> may need to be installed for a smoother experience.</w:t>
       </w:r>
     </w:p>
     <w:p>
@@ -10451,43 +8265,7 @@
           <w:sz w:val="20"/>
           <w:szCs w:val="20"/>
         </w:rPr>
-        <w:t xml:space="preserve">This task is computable because it factors in multiple different processes and conditions simultaneously. This would be almost impossible for a human to do. Furthermore, by </w:t>
-      </w:r>
-      <w:proofErr w:type="gramStart"/>
-      <w:r>
-        <w:rPr>
-          <w:rFonts w:ascii="DM Mono" w:hAnsi="DM Mono"/>
-          <w:sz w:val="20"/>
-          <w:szCs w:val="20"/>
-        </w:rPr>
-        <w:t>being run</w:t>
-      </w:r>
-      <w:proofErr w:type="gramEnd"/>
-      <w:r>
-        <w:rPr>
-          <w:rFonts w:ascii="DM Mono" w:hAnsi="DM Mono"/>
-          <w:sz w:val="20"/>
-          <w:szCs w:val="20"/>
-        </w:rPr>
-        <w:t xml:space="preserve"> on a computer, the output could </w:t>
-      </w:r>
-      <w:proofErr w:type="gramStart"/>
-      <w:r>
-        <w:rPr>
-          <w:rFonts w:ascii="DM Mono" w:hAnsi="DM Mono"/>
-          <w:sz w:val="20"/>
-          <w:szCs w:val="20"/>
-        </w:rPr>
-        <w:t>be projected</w:t>
-      </w:r>
-      <w:proofErr w:type="gramEnd"/>
-      <w:r>
-        <w:rPr>
-          <w:rFonts w:ascii="DM Mono" w:hAnsi="DM Mono"/>
-          <w:sz w:val="20"/>
-          <w:szCs w:val="20"/>
-        </w:rPr>
-        <w:t xml:space="preserve"> to a screen in real time, allowing a better visualisation of the current state of the game.</w:t>
+        <w:t>This task is computable because it factors in multiple different processes and conditions simultaneously. This would be almost impossible for a human to do. Furthermore, by being run on a computer, the output could be projected to a screen in real time, allowing a better visualisation of the current state of the game.</w:t>
       </w:r>
     </w:p>
     <w:p>
@@ -10563,25 +8341,7 @@
                 <w:sz w:val="20"/>
                 <w:szCs w:val="20"/>
               </w:rPr>
-              <w:t xml:space="preserve"> boxes to account for necessary collision areas, such as a player’s body or attack. Resultantly, it will be easier to calculate collisions and if the player </w:t>
-            </w:r>
-            <w:proofErr w:type="gramStart"/>
-            <w:r>
-              <w:rPr>
-                <w:rFonts w:ascii="DM Mono" w:hAnsi="DM Mono"/>
-                <w:sz w:val="20"/>
-                <w:szCs w:val="20"/>
-              </w:rPr>
-              <w:t>is hit</w:t>
-            </w:r>
-            <w:proofErr w:type="gramEnd"/>
-            <w:r>
-              <w:rPr>
-                <w:rFonts w:ascii="DM Mono" w:hAnsi="DM Mono"/>
-                <w:sz w:val="20"/>
-                <w:szCs w:val="20"/>
-              </w:rPr>
-              <w:t>.</w:t>
+              <w:t xml:space="preserve"> boxes to account for necessary collision areas, such as a player’s body or attack. Resultantly, it will be easier to calculate collisions and if the player is hit.</w:t>
             </w:r>
             <w:r>
               <w:rPr>
@@ -10676,25 +8436,7 @@
                 <w:szCs w:val="20"/>
               </w:rPr>
               <w:lastRenderedPageBreak/>
-              <w:t xml:space="preserve">My game will use concurrency to facilitate both the player and enemy moving at the same time. This </w:t>
-            </w:r>
-            <w:proofErr w:type="gramStart"/>
-            <w:r>
-              <w:rPr>
-                <w:rFonts w:ascii="DM Mono" w:hAnsi="DM Mono"/>
-                <w:sz w:val="20"/>
-                <w:szCs w:val="20"/>
-              </w:rPr>
-              <w:t>is needed</w:t>
-            </w:r>
-            <w:proofErr w:type="gramEnd"/>
-            <w:r>
-              <w:rPr>
-                <w:rFonts w:ascii="DM Mono" w:hAnsi="DM Mono"/>
-                <w:sz w:val="20"/>
-                <w:szCs w:val="20"/>
-              </w:rPr>
-              <w:t xml:space="preserve"> so that the player can play the game with a responsive feel to it.</w:t>
+              <w:t>My game will use concurrency to facilitate both the player and enemy moving at the same time. This is needed so that the player can play the game with a responsive feel to it.</w:t>
             </w:r>
             <w:r>
               <w:rPr>
@@ -10760,61 +8502,7 @@
                 <w:sz w:val="20"/>
                 <w:szCs w:val="20"/>
               </w:rPr>
-              <w:t xml:space="preserve">I will use enumeration to list </w:t>
-            </w:r>
-            <w:proofErr w:type="gramStart"/>
-            <w:r>
-              <w:rPr>
-                <w:rFonts w:ascii="DM Mono" w:hAnsi="DM Mono"/>
-                <w:sz w:val="20"/>
-                <w:szCs w:val="20"/>
-              </w:rPr>
-              <w:t>all of</w:t>
-            </w:r>
-            <w:proofErr w:type="gramEnd"/>
-            <w:r>
-              <w:rPr>
-                <w:rFonts w:ascii="DM Mono" w:hAnsi="DM Mono"/>
-                <w:sz w:val="20"/>
-                <w:szCs w:val="20"/>
-              </w:rPr>
-              <w:t xml:space="preserve"> the possible states which the player can be in. This would account for the actions the player can take in different conditions, such as if they </w:t>
-            </w:r>
-            <w:proofErr w:type="gramStart"/>
-            <w:r>
-              <w:rPr>
-                <w:rFonts w:ascii="DM Mono" w:hAnsi="DM Mono"/>
-                <w:sz w:val="20"/>
-                <w:szCs w:val="20"/>
-              </w:rPr>
-              <w:t>are stunned</w:t>
-            </w:r>
-            <w:proofErr w:type="gramEnd"/>
-            <w:r>
-              <w:rPr>
-                <w:rFonts w:ascii="DM Mono" w:hAnsi="DM Mono"/>
-                <w:sz w:val="20"/>
-                <w:szCs w:val="20"/>
-              </w:rPr>
-              <w:t xml:space="preserve"> or </w:t>
-            </w:r>
-            <w:proofErr w:type="gramStart"/>
-            <w:r>
-              <w:rPr>
-                <w:rFonts w:ascii="DM Mono" w:hAnsi="DM Mono"/>
-                <w:sz w:val="20"/>
-                <w:szCs w:val="20"/>
-              </w:rPr>
-              <w:t>being knocked</w:t>
-            </w:r>
-            <w:proofErr w:type="gramEnd"/>
-            <w:r>
-              <w:rPr>
-                <w:rFonts w:ascii="DM Mono" w:hAnsi="DM Mono"/>
-                <w:sz w:val="20"/>
-                <w:szCs w:val="20"/>
-              </w:rPr>
-              <w:t xml:space="preserve"> back.</w:t>
+              <w:t>I will use enumeration to list all of the possible states which the player can be in. This would account for the actions the player can take in different conditions, such as if they are stunned or being knocked back.</w:t>
             </w:r>
             <w:r>
               <w:rPr>
@@ -10888,51 +8576,15 @@
                 <w:sz w:val="20"/>
                 <w:szCs w:val="20"/>
               </w:rPr>
-              <w:t>My game would use the Greenfoot built-in method `</w:t>
-            </w:r>
-            <w:proofErr w:type="gramStart"/>
-            <w:r>
-              <w:rPr>
-                <w:rFonts w:ascii="DM Mono" w:hAnsi="DM Mono"/>
-                <w:sz w:val="20"/>
-                <w:szCs w:val="20"/>
-              </w:rPr>
-              <w:t>isKeyDown(</w:t>
-            </w:r>
-            <w:proofErr w:type="gramEnd"/>
-            <w:r>
-              <w:rPr>
-                <w:rFonts w:ascii="DM Mono" w:hAnsi="DM Mono"/>
-                <w:sz w:val="20"/>
-                <w:szCs w:val="20"/>
-              </w:rPr>
-              <w:t xml:space="preserve">)` to detect input from the user’s keyboard. </w:t>
-            </w:r>
-            <w:r>
-              <w:rPr>
-                <w:rFonts w:ascii="DM Mono" w:hAnsi="DM Mono"/>
-                <w:sz w:val="20"/>
-                <w:szCs w:val="20"/>
-              </w:rPr>
-              <w:t xml:space="preserve">This data will then </w:t>
-            </w:r>
-            <w:proofErr w:type="gramStart"/>
-            <w:r>
-              <w:rPr>
-                <w:rFonts w:ascii="DM Mono" w:hAnsi="DM Mono"/>
-                <w:sz w:val="20"/>
-                <w:szCs w:val="20"/>
-              </w:rPr>
-              <w:t>be used</w:t>
-            </w:r>
-            <w:proofErr w:type="gramEnd"/>
-            <w:r>
-              <w:rPr>
-                <w:rFonts w:ascii="DM Mono" w:hAnsi="DM Mono"/>
-                <w:sz w:val="20"/>
-                <w:szCs w:val="20"/>
-              </w:rPr>
-              <w:t xml:space="preserve"> to follow through with relevant actions and effects. An example could be that by holding down the ‘d’ or right arrow key, the player would move to the right.</w:t>
+              <w:t xml:space="preserve">My game would use the Greenfoot built-in method `isKeyDown()` to detect input from the user’s keyboard. </w:t>
+            </w:r>
+            <w:r>
+              <w:rPr>
+                <w:rFonts w:ascii="DM Mono" w:hAnsi="DM Mono"/>
+                <w:sz w:val="20"/>
+                <w:szCs w:val="20"/>
+              </w:rPr>
+              <w:t>This data will then be used to follow through with relevant actions and effects. An example could be that by holding down the ‘d’ or right arrow key, the player would move to the right.</w:t>
             </w:r>
             <w:r>
               <w:rPr>
@@ -10990,51 +8642,73 @@
                 <w:sz w:val="20"/>
                 <w:szCs w:val="20"/>
               </w:rPr>
-              <w:t xml:space="preserve">There will be decomposition in my game, where each problem </w:t>
-            </w:r>
-            <w:proofErr w:type="gramStart"/>
-            <w:r>
-              <w:rPr>
-                <w:rFonts w:ascii="DM Mono" w:hAnsi="DM Mono"/>
-                <w:sz w:val="20"/>
-                <w:szCs w:val="20"/>
-              </w:rPr>
-              <w:t>is broken</w:t>
-            </w:r>
-            <w:proofErr w:type="gramEnd"/>
-            <w:r>
-              <w:rPr>
-                <w:rFonts w:ascii="DM Mono" w:hAnsi="DM Mono"/>
-                <w:sz w:val="20"/>
-                <w:szCs w:val="20"/>
-              </w:rPr>
-              <w:t xml:space="preserve"> into smaller and more manageable challenges. By doing so, I will be more efficient at writing code, since I will only have to consider a small region at a time. This also benefits the asynchronous nature of my game, where multiple processes coincide temporally.</w:t>
-            </w:r>
-            <w:r>
-              <w:rPr>
-                <w:rFonts w:ascii="DM Mono" w:hAnsi="DM Mono"/>
-                <w:sz w:val="20"/>
-                <w:szCs w:val="20"/>
-              </w:rPr>
-              <w:t xml:space="preserve"> This idea would </w:t>
-            </w:r>
-            <w:proofErr w:type="gramStart"/>
-            <w:r>
-              <w:rPr>
-                <w:rFonts w:ascii="DM Mono" w:hAnsi="DM Mono"/>
-                <w:sz w:val="20"/>
-                <w:szCs w:val="20"/>
-              </w:rPr>
-              <w:t>be challenged</w:t>
-            </w:r>
-            <w:proofErr w:type="gramEnd"/>
-            <w:r>
-              <w:rPr>
-                <w:rFonts w:ascii="DM Mono" w:hAnsi="DM Mono"/>
-                <w:sz w:val="20"/>
-                <w:szCs w:val="20"/>
-              </w:rPr>
-              <w:t xml:space="preserve"> were I not to use decomposition, due to everything being in one large code block.</w:t>
+              <w:t>There will be decomposition in my game, where each problem is broken into smaller and more manageable challenges. By doing so, I will be more efficient at writing code, since I will only have to consider a small region at a time. This also benefits the asynchronous nature of my game, where multiple processes coincide temporally.</w:t>
+            </w:r>
+            <w:r>
+              <w:rPr>
+                <w:rFonts w:ascii="DM Mono" w:hAnsi="DM Mono"/>
+                <w:sz w:val="20"/>
+                <w:szCs w:val="20"/>
+              </w:rPr>
+              <w:t xml:space="preserve"> This idea would be challenged were I not to use decomposition, due to everything being in one large code block.</w:t>
+            </w:r>
+          </w:p>
+        </w:tc>
+      </w:tr>
+      <w:tr>
+        <w:tc>
+          <w:tcPr>
+            <w:tcW w:w="9016" w:type="dxa"/>
+          </w:tcPr>
+          <w:p>
+            <w:pPr>
+              <w:rPr>
+                <w:rFonts w:ascii="DM Mono" w:hAnsi="DM Mono"/>
+                <w:sz w:val="20"/>
+                <w:szCs w:val="20"/>
+              </w:rPr>
+            </w:pPr>
+            <w:r>
+              <w:rPr>
+                <w:rFonts w:ascii="DM Mono Medium" w:hAnsi="DM Mono Medium"/>
+                <w:b/>
+                <w:bCs/>
+                <w:sz w:val="32"/>
+                <w:szCs w:val="32"/>
+              </w:rPr>
+              <w:t>Visualisation</w:t>
+            </w:r>
+          </w:p>
+        </w:tc>
+      </w:tr>
+      <w:tr>
+        <w:tc>
+          <w:tcPr>
+            <w:tcW w:w="9016" w:type="dxa"/>
+          </w:tcPr>
+          <w:p>
+            <w:pPr>
+              <w:rPr>
+                <w:rFonts w:ascii="DM Mono" w:hAnsi="DM Mono"/>
+                <w:sz w:val="20"/>
+                <w:szCs w:val="20"/>
+              </w:rPr>
+            </w:pPr>
+            <w:r>
+              <w:rPr>
+                <w:rFonts w:ascii="DM Mono" w:hAnsi="DM Mono"/>
+                <w:sz w:val="20"/>
+                <w:szCs w:val="20"/>
+              </w:rPr>
+              <w:t xml:space="preserve">My game will use visualisation for displaying data such as health, stamina and player location </w:t>
+            </w:r>
+            <w:r>
+              <w:rPr>
+                <w:rFonts w:ascii="DM Mono" w:hAnsi="DM Mono"/>
+                <w:sz w:val="20"/>
+                <w:szCs w:val="20"/>
+              </w:rPr>
+              <w:t xml:space="preserve">relative to their enemy. These will be divided up into either the HUD class, or World class. By doing this, I will better be able to write appropriate code for each. Furthermore, it will allow the player to better engage with the game. </w:t>
             </w:r>
           </w:p>
         </w:tc>

</xml_diff>